<commit_message>
added ivoice no, dates
</commit_message>
<xml_diff>
--- a/app/templates/docx/award_decision_template.docx
+++ b/app/templates/docx/award_decision_template.docx
@@ -1366,6 +1366,7 @@
         </w:rPr>
         <w:t>.</w:t>
       </w:r>
+      <w:proofErr w:type="spellStart"/>
       <w:r>
         <w:rPr>
           <w:sz w:val="24"/>
@@ -1374,6 +1375,7 @@
         </w:rPr>
         <w:t>aay</w:t>
       </w:r>
+      <w:proofErr w:type="spellEnd"/>
       <w:r>
         <w:rPr>
           <w:sz w:val="24"/>
@@ -1414,6 +1416,7 @@
         </w:rPr>
         <w:t>.</w:t>
       </w:r>
+      <w:proofErr w:type="spellStart"/>
       <w:r>
         <w:rPr>
           <w:sz w:val="24"/>
@@ -1422,6 +1425,7 @@
         </w:rPr>
         <w:t>adam</w:t>
       </w:r>
+      <w:proofErr w:type="spellEnd"/>
       <w:r>
         <w:rPr>
           <w:sz w:val="24"/>
@@ -1430,6 +1434,7 @@
         </w:rPr>
         <w:t>_</w:t>
       </w:r>
+      <w:proofErr w:type="spellStart"/>
       <w:r>
         <w:rPr>
           <w:sz w:val="24"/>
@@ -1438,6 +1443,7 @@
         </w:rPr>
         <w:t>aay</w:t>
       </w:r>
+      <w:proofErr w:type="spellEnd"/>
       <w:r>
         <w:rPr>
           <w:sz w:val="24"/>
@@ -1590,6 +1596,7 @@
         </w:rPr>
         <w:t>.</w:t>
       </w:r>
+      <w:proofErr w:type="spellStart"/>
       <w:r>
         <w:rPr>
           <w:sz w:val="24"/>
@@ -1598,6 +1605,7 @@
         </w:rPr>
         <w:t>afm</w:t>
       </w:r>
+      <w:proofErr w:type="spellEnd"/>
       <w:r>
         <w:rPr>
           <w:sz w:val="24"/>
@@ -1669,12 +1677,21 @@
           <w:lang w:val="el-GR"/>
         </w:rPr>
         <w:tab/>
+      </w:r>
+      <w:r>
+        <w:rPr>
+          <w:sz w:val="24"/>
+          <w:szCs w:val="24"/>
+          <w:highlight w:val="yellow"/>
+          <w:lang w:val="el-GR"/>
+        </w:rPr>
         <w:t xml:space="preserve">Την δέσμευση πίστωση με </w:t>
       </w:r>
       <w:r>
         <w:rPr>
           <w:sz w:val="24"/>
           <w:szCs w:val="24"/>
+          <w:highlight w:val="yellow"/>
           <w:lang w:val="el-GR"/>
         </w:rPr>
         <w:t>{{</w:t>
@@ -1683,6 +1700,7 @@
         <w:rPr>
           <w:sz w:val="24"/>
           <w:szCs w:val="24"/>
+          <w:highlight w:val="yellow"/>
           <w:lang w:val="en-US"/>
         </w:rPr>
         <w:t>procurement</w:t>
@@ -1691,6 +1709,7 @@
         <w:rPr>
           <w:sz w:val="24"/>
           <w:szCs w:val="24"/>
+          <w:highlight w:val="yellow"/>
           <w:lang w:val="el-GR"/>
         </w:rPr>
         <w:t>.identity_prosklisis}}</w:t>
@@ -1699,6 +1718,7 @@
         <w:rPr>
           <w:sz w:val="24"/>
           <w:szCs w:val="24"/>
+          <w:highlight w:val="yellow"/>
           <w:lang w:val="el-GR"/>
         </w:rPr>
         <w:t xml:space="preserve"> και ΑΔΑΜ: </w:t>
@@ -1707,6 +1727,7 @@
         <w:rPr>
           <w:sz w:val="24"/>
           <w:szCs w:val="24"/>
+          <w:highlight w:val="yellow"/>
           <w:lang w:val="el-GR"/>
         </w:rPr>
         <w:t xml:space="preserve">{{ </w:t>
@@ -1715,6 +1736,7 @@
         <w:rPr>
           <w:sz w:val="24"/>
           <w:szCs w:val="24"/>
+          <w:highlight w:val="yellow"/>
           <w:lang w:val="en-US"/>
         </w:rPr>
         <w:t>procurement</w:t>
@@ -1723,6 +1745,7 @@
         <w:rPr>
           <w:sz w:val="24"/>
           <w:szCs w:val="24"/>
+          <w:highlight w:val="yellow"/>
           <w:lang w:val="el-GR"/>
         </w:rPr>
         <w:t>.adam_prosklisis}}</w:t>
@@ -1731,6 +1754,7 @@
         <w:rPr>
           <w:sz w:val="24"/>
           <w:szCs w:val="24"/>
+          <w:highlight w:val="yellow"/>
           <w:lang w:val="el-GR"/>
         </w:rPr>
         <w:t>.</w:t>
@@ -4407,6 +4431,7 @@
         </w:rPr>
         <w:t>{{</w:t>
       </w:r>
+      <w:proofErr w:type="spellStart"/>
       <w:r>
         <w:rPr>
           <w:sz w:val="24"/>
@@ -4415,6 +4440,7 @@
         </w:rPr>
         <w:t>armodiothtas</w:t>
       </w:r>
+      <w:proofErr w:type="spellEnd"/>
       <w:r>
         <w:rPr>
           <w:sz w:val="24"/>
@@ -5036,7 +5062,25 @@
                 <w:szCs w:val="24"/>
                 <w:lang w:val="en-US"/>
               </w:rPr>
-              <w:t>{{service.commander}}</w:t>
+              <w:t>{{</w:t>
+            </w:r>
+            <w:proofErr w:type="spellStart"/>
+            <w:r>
+              <w:rPr>
+                <w:sz w:val="24"/>
+                <w:szCs w:val="24"/>
+                <w:lang w:val="en-US"/>
+              </w:rPr>
+              <w:t>service.commander</w:t>
+            </w:r>
+            <w:proofErr w:type="spellEnd"/>
+            <w:r>
+              <w:rPr>
+                <w:sz w:val="24"/>
+                <w:szCs w:val="24"/>
+                <w:lang w:val="en-US"/>
+              </w:rPr>
+              <w:t>}}</w:t>
             </w:r>
           </w:p>
         </w:tc>

</xml_diff>

<commit_message>
fixed procurements inbox, pending-expenses, all bugs
</commit_message>
<xml_diff>
--- a/app/templates/docx/award_decision_template.docx
+++ b/app/templates/docx/award_decision_template.docx
@@ -265,6 +265,274 @@
         </w:rPr>
         <w:t>{{SERVICE_UNIT_NAME}}</w:t>
       </w:r>
+    </w:p>
+    <w:p>
+      <w:pPr>
+        <w:tabs>
+          <w:tab w:val="left" w:pos="426"/>
+          <w:tab w:val="left" w:pos="851"/>
+          <w:tab w:val="left" w:pos="1276"/>
+          <w:tab w:val="left" w:pos="1701"/>
+          <w:tab w:val="left" w:pos="2127"/>
+          <w:tab w:val="left" w:pos="2552"/>
+          <w:tab w:val="left" w:pos="2977"/>
+          <w:tab w:val="left" w:pos="3402"/>
+          <w:tab w:val="left" w:pos="3828"/>
+          <w:tab w:val="left" w:pos="4253"/>
+          <w:tab w:val="left" w:pos="4678"/>
+          <w:tab w:val="left" w:pos="5103"/>
+          <w:tab w:val="left" w:pos="5529"/>
+          <w:tab w:val="left" w:pos="5954"/>
+          <w:tab w:val="left" w:pos="6379"/>
+          <w:tab w:val="left" w:pos="6804"/>
+          <w:tab w:val="left" w:pos="7230"/>
+          <w:tab w:val="left" w:pos="7655"/>
+          <w:tab w:val="left" w:pos="8080"/>
+          <w:tab w:val="left" w:pos="8505"/>
+        </w:tabs>
+        <w:rPr>
+          <w:sz w:val="24"/>
+          <w:szCs w:val="24"/>
+          <w:lang w:val="el-GR"/>
+        </w:rPr>
+      </w:pPr>
+      <w:r>
+        <w:rPr>
+          <w:sz w:val="24"/>
+          <w:szCs w:val="24"/>
+          <w:lang w:val="el-GR"/>
+        </w:rPr>
+        <w:tab/>
+      </w:r>
+      <w:r>
+        <w:rPr>
+          <w:sz w:val="24"/>
+          <w:szCs w:val="24"/>
+          <w:lang w:val="el-GR"/>
+        </w:rPr>
+        <w:tab/>
+      </w:r>
+      <w:r>
+        <w:rPr>
+          <w:sz w:val="24"/>
+          <w:szCs w:val="24"/>
+          <w:lang w:val="el-GR"/>
+        </w:rPr>
+        <w:tab/>
+      </w:r>
+      <w:r>
+        <w:rPr>
+          <w:sz w:val="24"/>
+          <w:szCs w:val="24"/>
+          <w:lang w:val="el-GR"/>
+        </w:rPr>
+        <w:tab/>
+      </w:r>
+      <w:r>
+        <w:rPr>
+          <w:sz w:val="24"/>
+          <w:szCs w:val="24"/>
+          <w:lang w:val="el-GR"/>
+        </w:rPr>
+        <w:tab/>
+      </w:r>
+      <w:r>
+        <w:rPr>
+          <w:sz w:val="24"/>
+          <w:szCs w:val="24"/>
+          <w:lang w:val="el-GR"/>
+        </w:rPr>
+        <w:tab/>
+      </w:r>
+      <w:r>
+        <w:rPr>
+          <w:sz w:val="24"/>
+          <w:szCs w:val="24"/>
+          <w:lang w:val="el-GR"/>
+        </w:rPr>
+        <w:tab/>
+      </w:r>
+      <w:r>
+        <w:rPr>
+          <w:sz w:val="24"/>
+          <w:szCs w:val="24"/>
+          <w:lang w:val="el-GR"/>
+        </w:rPr>
+        <w:tab/>
+      </w:r>
+      <w:r>
+        <w:rPr>
+          <w:sz w:val="24"/>
+          <w:szCs w:val="24"/>
+          <w:lang w:val="el-GR"/>
+        </w:rPr>
+        <w:tab/>
+      </w:r>
+      <w:r>
+        <w:rPr>
+          <w:sz w:val="24"/>
+          <w:szCs w:val="24"/>
+          <w:lang w:val="el-GR"/>
+        </w:rPr>
+        <w:tab/>
+      </w:r>
+      <w:r>
+        <w:rPr>
+          <w:sz w:val="24"/>
+          <w:szCs w:val="24"/>
+          <w:lang w:val="el-GR"/>
+        </w:rPr>
+        <w:tab/>
+      </w:r>
+      <w:r>
+        <w:rPr>
+          <w:sz w:val="24"/>
+          <w:szCs w:val="24"/>
+          <w:lang w:val="el-GR"/>
+        </w:rPr>
+        <w:tab/>
+      </w:r>
+      <w:r>
+        <w:rPr>
+          <w:sz w:val="24"/>
+          <w:szCs w:val="24"/>
+        </w:rPr>
+        <w:t>{{HANDLER_DIRECTORY}}</w:t>
+      </w:r>
+    </w:p>
+    <w:p>
+      <w:pPr>
+        <w:tabs>
+          <w:tab w:val="left" w:pos="426"/>
+          <w:tab w:val="left" w:pos="851"/>
+          <w:tab w:val="left" w:pos="1276"/>
+          <w:tab w:val="left" w:pos="1701"/>
+          <w:tab w:val="left" w:pos="2127"/>
+          <w:tab w:val="left" w:pos="2552"/>
+          <w:tab w:val="left" w:pos="2977"/>
+          <w:tab w:val="left" w:pos="3402"/>
+          <w:tab w:val="left" w:pos="3828"/>
+          <w:tab w:val="left" w:pos="4253"/>
+          <w:tab w:val="left" w:pos="4678"/>
+          <w:tab w:val="left" w:pos="5103"/>
+          <w:tab w:val="left" w:pos="5529"/>
+          <w:tab w:val="left" w:pos="5954"/>
+          <w:tab w:val="left" w:pos="6379"/>
+          <w:tab w:val="left" w:pos="6804"/>
+          <w:tab w:val="left" w:pos="7230"/>
+          <w:tab w:val="left" w:pos="7655"/>
+          <w:tab w:val="left" w:pos="8080"/>
+          <w:tab w:val="left" w:pos="8505"/>
+        </w:tabs>
+        <w:rPr>
+          <w:sz w:val="24"/>
+          <w:szCs w:val="24"/>
+          <w:lang w:val="el-GR"/>
+        </w:rPr>
+      </w:pPr>
+      <w:r>
+        <w:rPr>
+          <w:sz w:val="24"/>
+          <w:szCs w:val="24"/>
+          <w:lang w:val="el-GR"/>
+        </w:rPr>
+        <w:tab/>
+      </w:r>
+      <w:r>
+        <w:rPr>
+          <w:sz w:val="24"/>
+          <w:szCs w:val="24"/>
+          <w:lang w:val="el-GR"/>
+        </w:rPr>
+        <w:tab/>
+      </w:r>
+      <w:r>
+        <w:rPr>
+          <w:sz w:val="24"/>
+          <w:szCs w:val="24"/>
+          <w:lang w:val="el-GR"/>
+        </w:rPr>
+        <w:tab/>
+      </w:r>
+      <w:r>
+        <w:rPr>
+          <w:sz w:val="24"/>
+          <w:szCs w:val="24"/>
+          <w:lang w:val="el-GR"/>
+        </w:rPr>
+        <w:tab/>
+      </w:r>
+      <w:r>
+        <w:rPr>
+          <w:sz w:val="24"/>
+          <w:szCs w:val="24"/>
+          <w:lang w:val="el-GR"/>
+        </w:rPr>
+        <w:tab/>
+      </w:r>
+      <w:r>
+        <w:rPr>
+          <w:sz w:val="24"/>
+          <w:szCs w:val="24"/>
+          <w:lang w:val="el-GR"/>
+        </w:rPr>
+        <w:tab/>
+      </w:r>
+      <w:r>
+        <w:rPr>
+          <w:sz w:val="24"/>
+          <w:szCs w:val="24"/>
+          <w:lang w:val="el-GR"/>
+        </w:rPr>
+        <w:tab/>
+      </w:r>
+      <w:r>
+        <w:rPr>
+          <w:sz w:val="24"/>
+          <w:szCs w:val="24"/>
+          <w:lang w:val="el-GR"/>
+        </w:rPr>
+        <w:tab/>
+      </w:r>
+      <w:r>
+        <w:rPr>
+          <w:sz w:val="24"/>
+          <w:szCs w:val="24"/>
+          <w:lang w:val="el-GR"/>
+        </w:rPr>
+        <w:tab/>
+      </w:r>
+      <w:r>
+        <w:rPr>
+          <w:sz w:val="24"/>
+          <w:szCs w:val="24"/>
+          <w:lang w:val="el-GR"/>
+        </w:rPr>
+        <w:tab/>
+      </w:r>
+      <w:r>
+        <w:rPr>
+          <w:sz w:val="24"/>
+          <w:szCs w:val="24"/>
+          <w:lang w:val="el-GR"/>
+        </w:rPr>
+        <w:tab/>
+      </w:r>
+      <w:r>
+        <w:rPr>
+          <w:sz w:val="24"/>
+          <w:szCs w:val="24"/>
+          <w:lang w:val="el-GR"/>
+        </w:rPr>
+        <w:tab/>
+      </w:r>
+      <w:r>
+        <w:rPr>
+          <w:sz w:val="24"/>
+          <w:szCs w:val="24"/>
+        </w:rPr>
+        <w:t>{{HANDLER_DEPARTMENT}}</w:t>
+      </w:r>
       <w:r>
         <w:rPr>
           <w:sz w:val="24"/>
@@ -1366,7 +1634,6 @@
         </w:rPr>
         <w:t>.</w:t>
       </w:r>
-      <w:proofErr w:type="spellStart"/>
       <w:r>
         <w:rPr>
           <w:sz w:val="24"/>
@@ -1375,7 +1642,6 @@
         </w:rPr>
         <w:t>aay</w:t>
       </w:r>
-      <w:proofErr w:type="spellEnd"/>
       <w:r>
         <w:rPr>
           <w:sz w:val="24"/>
@@ -1416,7 +1682,6 @@
         </w:rPr>
         <w:t>.</w:t>
       </w:r>
-      <w:proofErr w:type="spellStart"/>
       <w:r>
         <w:rPr>
           <w:sz w:val="24"/>
@@ -1425,7 +1690,6 @@
         </w:rPr>
         <w:t>adam</w:t>
       </w:r>
-      <w:proofErr w:type="spellEnd"/>
       <w:r>
         <w:rPr>
           <w:sz w:val="24"/>
@@ -1434,7 +1698,6 @@
         </w:rPr>
         <w:t>_</w:t>
       </w:r>
-      <w:proofErr w:type="spellStart"/>
       <w:r>
         <w:rPr>
           <w:sz w:val="24"/>
@@ -1443,7 +1706,6 @@
         </w:rPr>
         <w:t>aay</w:t>
       </w:r>
-      <w:proofErr w:type="spellEnd"/>
       <w:r>
         <w:rPr>
           <w:sz w:val="24"/>
@@ -1596,7 +1858,6 @@
         </w:rPr>
         <w:t>.</w:t>
       </w:r>
-      <w:proofErr w:type="spellStart"/>
       <w:r>
         <w:rPr>
           <w:sz w:val="24"/>
@@ -1605,7 +1866,6 @@
         </w:rPr>
         <w:t>afm</w:t>
       </w:r>
-      <w:proofErr w:type="spellEnd"/>
       <w:r>
         <w:rPr>
           <w:sz w:val="24"/>
@@ -1919,6 +2179,14 @@
         <w:rPr>
           <w:sz w:val="24"/>
           <w:szCs w:val="24"/>
+          <w:lang w:val="el-GR"/>
+        </w:rPr>
+        <w:t>(</w:t>
+      </w:r>
+      <w:r>
+        <w:rPr>
+          <w:sz w:val="24"/>
+          <w:szCs w:val="24"/>
         </w:rPr>
         <w:t>{{ML_TOTAL}}</w:t>
       </w:r>
@@ -1988,6 +2256,7 @@
           <w:szCs w:val="24"/>
           <w:lang w:val="el-GR"/>
         </w:rPr>
+        <w:lastRenderedPageBreak/>
         <w:tab/>
       </w:r>
       <w:r>
@@ -2037,7 +2306,6 @@
           <w:szCs w:val="24"/>
           <w:lang w:val="el-GR"/>
         </w:rPr>
-        <w:lastRenderedPageBreak/>
         <w:tab/>
       </w:r>
       <w:r>
@@ -4431,7 +4699,6 @@
         </w:rPr>
         <w:t>{{</w:t>
       </w:r>
-      <w:proofErr w:type="spellStart"/>
       <w:r>
         <w:rPr>
           <w:sz w:val="24"/>
@@ -4440,7 +4707,6 @@
         </w:rPr>
         <w:t>armodiothtas</w:t>
       </w:r>
-      <w:proofErr w:type="spellEnd"/>
       <w:r>
         <w:rPr>
           <w:sz w:val="24"/>
@@ -5062,25 +5328,7 @@
                 <w:szCs w:val="24"/>
                 <w:lang w:val="en-US"/>
               </w:rPr>
-              <w:t>{{</w:t>
-            </w:r>
-            <w:proofErr w:type="spellStart"/>
-            <w:r>
-              <w:rPr>
-                <w:sz w:val="24"/>
-                <w:szCs w:val="24"/>
-                <w:lang w:val="en-US"/>
-              </w:rPr>
-              <w:t>service.commander</w:t>
-            </w:r>
-            <w:proofErr w:type="spellEnd"/>
-            <w:r>
-              <w:rPr>
-                <w:sz w:val="24"/>
-                <w:szCs w:val="24"/>
-                <w:lang w:val="en-US"/>
-              </w:rPr>
-              <w:t>}}</w:t>
+              <w:t>{{service.commander}}</w:t>
             </w:r>
           </w:p>
         </w:tc>
@@ -6198,7 +6446,6 @@
   <w:style w:type="character" w:default="1" w:styleId="DefaultParagraphFont">
     <w:name w:val="Default Paragraph Font"/>
     <w:uiPriority w:val="1"/>
-    <w:semiHidden/>
     <w:unhideWhenUsed/>
   </w:style>
   <w:style w:type="table" w:default="1" w:styleId="TableNormal">

</xml_diff>

<commit_message>
fixed routes, services and models of organization
</commit_message>
<xml_diff>
--- a/app/templates/docx/award_decision_template.docx
+++ b/app/templates/docx/award_decision_template.docx
@@ -293,7 +293,7 @@
         <w:rPr>
           <w:sz w:val="24"/>
           <w:szCs w:val="24"/>
-          <w:lang w:val="el-GR"/>
+          <w:lang w:val="en-US"/>
         </w:rPr>
       </w:pPr>
       <w:r>
@@ -396,6 +396,7 @@
         <w:rPr>
           <w:sz w:val="24"/>
           <w:szCs w:val="24"/>
+          <w:lang w:val="en-US"/>
         </w:rPr>
         <w:t>{{HANDLER_DIRECTORY}}</w:t>
       </w:r>
@@ -427,110 +428,104 @@
         <w:rPr>
           <w:sz w:val="24"/>
           <w:szCs w:val="24"/>
-          <w:lang w:val="el-GR"/>
+          <w:lang w:val="en-US"/>
         </w:rPr>
       </w:pPr>
       <w:r>
         <w:rPr>
           <w:sz w:val="24"/>
           <w:szCs w:val="24"/>
-          <w:lang w:val="el-GR"/>
-        </w:rPr>
-        <w:tab/>
-      </w:r>
-      <w:r>
-        <w:rPr>
-          <w:sz w:val="24"/>
-          <w:szCs w:val="24"/>
-          <w:lang w:val="el-GR"/>
-        </w:rPr>
-        <w:tab/>
-      </w:r>
-      <w:r>
-        <w:rPr>
-          <w:sz w:val="24"/>
-          <w:szCs w:val="24"/>
-          <w:lang w:val="el-GR"/>
-        </w:rPr>
-        <w:tab/>
-      </w:r>
-      <w:r>
-        <w:rPr>
-          <w:sz w:val="24"/>
-          <w:szCs w:val="24"/>
-          <w:lang w:val="el-GR"/>
-        </w:rPr>
-        <w:tab/>
-      </w:r>
-      <w:r>
-        <w:rPr>
-          <w:sz w:val="24"/>
-          <w:szCs w:val="24"/>
-          <w:lang w:val="el-GR"/>
-        </w:rPr>
-        <w:tab/>
-      </w:r>
-      <w:r>
-        <w:rPr>
-          <w:sz w:val="24"/>
-          <w:szCs w:val="24"/>
-          <w:lang w:val="el-GR"/>
-        </w:rPr>
-        <w:tab/>
-      </w:r>
-      <w:r>
-        <w:rPr>
-          <w:sz w:val="24"/>
-          <w:szCs w:val="24"/>
-          <w:lang w:val="el-GR"/>
-        </w:rPr>
-        <w:tab/>
-      </w:r>
-      <w:r>
-        <w:rPr>
-          <w:sz w:val="24"/>
-          <w:szCs w:val="24"/>
-          <w:lang w:val="el-GR"/>
-        </w:rPr>
-        <w:tab/>
-      </w:r>
-      <w:r>
-        <w:rPr>
-          <w:sz w:val="24"/>
-          <w:szCs w:val="24"/>
-          <w:lang w:val="el-GR"/>
-        </w:rPr>
-        <w:tab/>
-      </w:r>
-      <w:r>
-        <w:rPr>
-          <w:sz w:val="24"/>
-          <w:szCs w:val="24"/>
-          <w:lang w:val="el-GR"/>
-        </w:rPr>
-        <w:tab/>
-      </w:r>
-      <w:r>
-        <w:rPr>
-          <w:sz w:val="24"/>
-          <w:szCs w:val="24"/>
-          <w:lang w:val="el-GR"/>
-        </w:rPr>
-        <w:tab/>
-      </w:r>
-      <w:r>
-        <w:rPr>
-          <w:sz w:val="24"/>
-          <w:szCs w:val="24"/>
-          <w:lang w:val="el-GR"/>
-        </w:rPr>
-        <w:tab/>
-      </w:r>
-      <w:r>
-        <w:rPr>
-          <w:sz w:val="24"/>
-          <w:szCs w:val="24"/>
-        </w:rPr>
+          <w:lang w:val="en-US"/>
+        </w:rPr>
+        <w:tab/>
+      </w:r>
+      <w:r>
+        <w:rPr>
+          <w:sz w:val="24"/>
+          <w:szCs w:val="24"/>
+          <w:lang w:val="en-US"/>
+        </w:rPr>
+        <w:tab/>
+      </w:r>
+      <w:r>
+        <w:rPr>
+          <w:sz w:val="24"/>
+          <w:szCs w:val="24"/>
+          <w:lang w:val="en-US"/>
+        </w:rPr>
+        <w:tab/>
+      </w:r>
+      <w:r>
+        <w:rPr>
+          <w:sz w:val="24"/>
+          <w:szCs w:val="24"/>
+          <w:lang w:val="en-US"/>
+        </w:rPr>
+        <w:tab/>
+      </w:r>
+      <w:r>
+        <w:rPr>
+          <w:sz w:val="24"/>
+          <w:szCs w:val="24"/>
+          <w:lang w:val="en-US"/>
+        </w:rPr>
+        <w:tab/>
+      </w:r>
+      <w:r>
+        <w:rPr>
+          <w:sz w:val="24"/>
+          <w:szCs w:val="24"/>
+          <w:lang w:val="en-US"/>
+        </w:rPr>
+        <w:tab/>
+      </w:r>
+      <w:r>
+        <w:rPr>
+          <w:sz w:val="24"/>
+          <w:szCs w:val="24"/>
+          <w:lang w:val="en-US"/>
+        </w:rPr>
+        <w:tab/>
+      </w:r>
+      <w:r>
+        <w:rPr>
+          <w:sz w:val="24"/>
+          <w:szCs w:val="24"/>
+          <w:lang w:val="en-US"/>
+        </w:rPr>
+        <w:tab/>
+      </w:r>
+      <w:r>
+        <w:rPr>
+          <w:sz w:val="24"/>
+          <w:szCs w:val="24"/>
+          <w:lang w:val="en-US"/>
+        </w:rPr>
+        <w:tab/>
+      </w:r>
+      <w:r>
+        <w:rPr>
+          <w:sz w:val="24"/>
+          <w:szCs w:val="24"/>
+          <w:lang w:val="en-US"/>
+        </w:rPr>
+        <w:tab/>
+      </w:r>
+      <w:r>
+        <w:rPr>
+          <w:sz w:val="24"/>
+          <w:szCs w:val="24"/>
+          <w:lang w:val="en-US"/>
+        </w:rPr>
+        <w:tab/>
+      </w:r>
+      <w:r>
+        <w:rPr>
+          <w:sz w:val="24"/>
+          <w:szCs w:val="24"/>
+          <w:lang w:val="en-US"/>
+        </w:rPr>
+        <w:tab/>
         <w:t>{{HANDLER_DEPARTMENT}}</w:t>
       </w:r>
       <w:r>
@@ -731,9 +726,17 @@
         <w:rPr>
           <w:sz w:val="24"/>
           <w:szCs w:val="24"/>
+          <w:lang w:val="el-GR"/>
+        </w:rPr>
+      </w:pPr>
+      <w:r>
+        <w:rPr>
+          <w:sz w:val="24"/>
+          <w:szCs w:val="24"/>
           <w:lang w:val="en-US"/>
         </w:rPr>
-      </w:pPr>
+        <w:tab/>
+      </w:r>
       <w:r>
         <w:rPr>
           <w:sz w:val="24"/>
@@ -826,14 +829,6 @@
         <w:rPr>
           <w:sz w:val="24"/>
           <w:szCs w:val="24"/>
-          <w:lang w:val="en-US"/>
-        </w:rPr>
-        <w:tab/>
-      </w:r>
-      <w:r>
-        <w:rPr>
-          <w:sz w:val="24"/>
-          <w:szCs w:val="24"/>
         </w:rPr>
         <w:t>Φ</w:t>
       </w:r>
@@ -841,7 +836,7 @@
         <w:rPr>
           <w:sz w:val="24"/>
           <w:szCs w:val="24"/>
-          <w:lang w:val="en-US"/>
+          <w:lang w:val="el-GR"/>
         </w:rPr>
         <w:t>.800/</w:t>
       </w:r>
@@ -879,95 +874,95 @@
         <w:rPr>
           <w:sz w:val="24"/>
           <w:szCs w:val="24"/>
-          <w:lang w:val="en-US"/>
-        </w:rPr>
-        <w:tab/>
-      </w:r>
-      <w:r>
-        <w:rPr>
-          <w:sz w:val="24"/>
-          <w:szCs w:val="24"/>
-          <w:lang w:val="en-US"/>
-        </w:rPr>
-        <w:tab/>
-      </w:r>
-      <w:r>
-        <w:rPr>
-          <w:sz w:val="24"/>
-          <w:szCs w:val="24"/>
-          <w:lang w:val="en-US"/>
-        </w:rPr>
-        <w:tab/>
-      </w:r>
-      <w:r>
-        <w:rPr>
-          <w:sz w:val="24"/>
-          <w:szCs w:val="24"/>
-          <w:lang w:val="en-US"/>
-        </w:rPr>
-        <w:tab/>
-      </w:r>
-      <w:r>
-        <w:rPr>
-          <w:sz w:val="24"/>
-          <w:szCs w:val="24"/>
-          <w:lang w:val="en-US"/>
-        </w:rPr>
-        <w:tab/>
-      </w:r>
-      <w:r>
-        <w:rPr>
-          <w:sz w:val="24"/>
-          <w:szCs w:val="24"/>
-          <w:lang w:val="en-US"/>
-        </w:rPr>
-        <w:tab/>
-      </w:r>
-      <w:r>
-        <w:rPr>
-          <w:sz w:val="24"/>
-          <w:szCs w:val="24"/>
-          <w:lang w:val="en-US"/>
-        </w:rPr>
-        <w:tab/>
-      </w:r>
-      <w:r>
-        <w:rPr>
-          <w:sz w:val="24"/>
-          <w:szCs w:val="24"/>
-          <w:lang w:val="en-US"/>
-        </w:rPr>
-        <w:tab/>
-      </w:r>
-      <w:r>
-        <w:rPr>
-          <w:sz w:val="24"/>
-          <w:szCs w:val="24"/>
-          <w:lang w:val="en-US"/>
-        </w:rPr>
-        <w:tab/>
-      </w:r>
-      <w:r>
-        <w:rPr>
-          <w:sz w:val="24"/>
-          <w:szCs w:val="24"/>
-          <w:lang w:val="en-US"/>
-        </w:rPr>
-        <w:tab/>
-      </w:r>
-      <w:r>
-        <w:rPr>
-          <w:sz w:val="24"/>
-          <w:szCs w:val="24"/>
-          <w:lang w:val="en-US"/>
-        </w:rPr>
-        <w:tab/>
-      </w:r>
-      <w:r>
-        <w:rPr>
-          <w:sz w:val="24"/>
-          <w:szCs w:val="24"/>
-          <w:lang w:val="en-US"/>
+          <w:lang w:val="el-GR"/>
+        </w:rPr>
+        <w:tab/>
+      </w:r>
+      <w:r>
+        <w:rPr>
+          <w:sz w:val="24"/>
+          <w:szCs w:val="24"/>
+          <w:lang w:val="el-GR"/>
+        </w:rPr>
+        <w:tab/>
+      </w:r>
+      <w:r>
+        <w:rPr>
+          <w:sz w:val="24"/>
+          <w:szCs w:val="24"/>
+          <w:lang w:val="el-GR"/>
+        </w:rPr>
+        <w:tab/>
+      </w:r>
+      <w:r>
+        <w:rPr>
+          <w:sz w:val="24"/>
+          <w:szCs w:val="24"/>
+          <w:lang w:val="el-GR"/>
+        </w:rPr>
+        <w:tab/>
+      </w:r>
+      <w:r>
+        <w:rPr>
+          <w:sz w:val="24"/>
+          <w:szCs w:val="24"/>
+          <w:lang w:val="el-GR"/>
+        </w:rPr>
+        <w:tab/>
+      </w:r>
+      <w:r>
+        <w:rPr>
+          <w:sz w:val="24"/>
+          <w:szCs w:val="24"/>
+          <w:lang w:val="el-GR"/>
+        </w:rPr>
+        <w:tab/>
+      </w:r>
+      <w:r>
+        <w:rPr>
+          <w:sz w:val="24"/>
+          <w:szCs w:val="24"/>
+          <w:lang w:val="el-GR"/>
+        </w:rPr>
+        <w:tab/>
+      </w:r>
+      <w:r>
+        <w:rPr>
+          <w:sz w:val="24"/>
+          <w:szCs w:val="24"/>
+          <w:lang w:val="el-GR"/>
+        </w:rPr>
+        <w:tab/>
+      </w:r>
+      <w:r>
+        <w:rPr>
+          <w:sz w:val="24"/>
+          <w:szCs w:val="24"/>
+          <w:lang w:val="el-GR"/>
+        </w:rPr>
+        <w:tab/>
+      </w:r>
+      <w:r>
+        <w:rPr>
+          <w:sz w:val="24"/>
+          <w:szCs w:val="24"/>
+          <w:lang w:val="el-GR"/>
+        </w:rPr>
+        <w:tab/>
+      </w:r>
+      <w:r>
+        <w:rPr>
+          <w:sz w:val="24"/>
+          <w:szCs w:val="24"/>
+          <w:lang w:val="el-GR"/>
+        </w:rPr>
+        <w:tab/>
+      </w:r>
+      <w:r>
+        <w:rPr>
+          <w:sz w:val="24"/>
+          <w:szCs w:val="24"/>
+          <w:lang w:val="el-GR"/>
         </w:rPr>
         <w:tab/>
       </w:r>
@@ -1634,6 +1629,7 @@
         </w:rPr>
         <w:t>.</w:t>
       </w:r>
+      <w:proofErr w:type="spellStart"/>
       <w:r>
         <w:rPr>
           <w:sz w:val="24"/>
@@ -1642,6 +1638,7 @@
         </w:rPr>
         <w:t>aay</w:t>
       </w:r>
+      <w:proofErr w:type="spellEnd"/>
       <w:r>
         <w:rPr>
           <w:sz w:val="24"/>
@@ -1682,6 +1679,7 @@
         </w:rPr>
         <w:t>.</w:t>
       </w:r>
+      <w:proofErr w:type="spellStart"/>
       <w:r>
         <w:rPr>
           <w:sz w:val="24"/>
@@ -1690,6 +1688,7 @@
         </w:rPr>
         <w:t>adam</w:t>
       </w:r>
+      <w:proofErr w:type="spellEnd"/>
       <w:r>
         <w:rPr>
           <w:sz w:val="24"/>
@@ -1698,6 +1697,7 @@
         </w:rPr>
         <w:t>_</w:t>
       </w:r>
+      <w:proofErr w:type="spellStart"/>
       <w:r>
         <w:rPr>
           <w:sz w:val="24"/>
@@ -1706,6 +1706,7 @@
         </w:rPr>
         <w:t>aay</w:t>
       </w:r>
+      <w:proofErr w:type="spellEnd"/>
       <w:r>
         <w:rPr>
           <w:sz w:val="24"/>
@@ -1858,6 +1859,7 @@
         </w:rPr>
         <w:t>.</w:t>
       </w:r>
+      <w:proofErr w:type="spellStart"/>
       <w:r>
         <w:rPr>
           <w:sz w:val="24"/>
@@ -1866,6 +1868,7 @@
         </w:rPr>
         <w:t>afm</w:t>
       </w:r>
+      <w:proofErr w:type="spellEnd"/>
       <w:r>
         <w:rPr>
           <w:sz w:val="24"/>
@@ -4699,6 +4702,7 @@
         </w:rPr>
         <w:t>{{</w:t>
       </w:r>
+      <w:proofErr w:type="spellStart"/>
       <w:r>
         <w:rPr>
           <w:sz w:val="24"/>
@@ -4707,6 +4711,7 @@
         </w:rPr>
         <w:t>armodiothtas</w:t>
       </w:r>
+      <w:proofErr w:type="spellEnd"/>
       <w:r>
         <w:rPr>
           <w:sz w:val="24"/>
@@ -4993,12 +4998,21 @@
           <w:sz w:val="24"/>
           <w:szCs w:val="24"/>
         </w:rPr>
-        <w:t>Η παρούσα είναι «Μη καταχωριστέα</w:t>
-      </w:r>
-      <w:r>
-        <w:rPr>
-          <w:sz w:val="24"/>
-          <w:szCs w:val="24"/>
+        <w:t>Η παρούσα είναι «</w:t>
+      </w:r>
+      <w:r>
+        <w:rPr>
+          <w:sz w:val="24"/>
+          <w:szCs w:val="24"/>
+          <w:highlight w:val="yellow"/>
+        </w:rPr>
+        <w:t>Μη καταχωριστέα</w:t>
+      </w:r>
+      <w:r>
+        <w:rPr>
+          <w:sz w:val="24"/>
+          <w:szCs w:val="24"/>
+          <w:highlight w:val="yellow"/>
           <w:lang w:val="el-GR"/>
         </w:rPr>
         <w:t>/καταχωριστέα</w:t>
@@ -5007,8 +5021,16 @@
         <w:rPr>
           <w:sz w:val="24"/>
           <w:szCs w:val="24"/>
-        </w:rPr>
-        <w:t xml:space="preserve"> στο ΚΗΜΔΗΣ». </w:t>
+          <w:highlight w:val="yellow"/>
+        </w:rPr>
+        <w:t xml:space="preserve"> στο ΚΗΜΔΗΣ</w:t>
+      </w:r>
+      <w:r>
+        <w:rPr>
+          <w:sz w:val="24"/>
+          <w:szCs w:val="24"/>
+        </w:rPr>
+        <w:t xml:space="preserve">». </w:t>
       </w:r>
       <w:r>
         <w:rPr>
@@ -5328,7 +5350,25 @@
                 <w:szCs w:val="24"/>
                 <w:lang w:val="en-US"/>
               </w:rPr>
-              <w:t>{{service.commander}}</w:t>
+              <w:t>{{</w:t>
+            </w:r>
+            <w:proofErr w:type="spellStart"/>
+            <w:r>
+              <w:rPr>
+                <w:sz w:val="24"/>
+                <w:szCs w:val="24"/>
+                <w:lang w:val="en-US"/>
+              </w:rPr>
+              <w:t>service.commander</w:t>
+            </w:r>
+            <w:proofErr w:type="spellEnd"/>
+            <w:r>
+              <w:rPr>
+                <w:sz w:val="24"/>
+                <w:szCs w:val="24"/>
+                <w:lang w:val="en-US"/>
+              </w:rPr>
+              <w:t>}}</w:t>
             </w:r>
           </w:p>
         </w:tc>
@@ -6446,6 +6486,7 @@
   <w:style w:type="character" w:default="1" w:styleId="DefaultParagraphFont">
     <w:name w:val="Default Paragraph Font"/>
     <w:uiPriority w:val="1"/>
+    <w:semiHidden/>
     <w:unhideWhenUsed/>
   </w:style>
   <w:style w:type="table" w:default="1" w:styleId="TableNormal">

</xml_diff>

<commit_message>
added place, email to service unit and made award_decision + expense_tranmiter better
</commit_message>
<xml_diff>
--- a/app/templates/docx/award_decision_template.docx
+++ b/app/templates/docx/award_decision_template.docx
@@ -2,1121 +2,707 @@
 <file path=word/document.xml><?xml version="1.0" encoding="utf-8"?>
 <w:document xmlns:wpc="http://schemas.microsoft.com/office/word/2010/wordprocessingCanvas" xmlns:cx="http://schemas.microsoft.com/office/drawing/2014/chartex" xmlns:cx1="http://schemas.microsoft.com/office/drawing/2015/9/8/chartex" xmlns:cx2="http://schemas.microsoft.com/office/drawing/2015/10/21/chartex" xmlns:cx3="http://schemas.microsoft.com/office/drawing/2016/5/9/chartex" xmlns:cx4="http://schemas.microsoft.com/office/drawing/2016/5/10/chartex" xmlns:cx5="http://schemas.microsoft.com/office/drawing/2016/5/11/chartex" xmlns:cx6="http://schemas.microsoft.com/office/drawing/2016/5/12/chartex" xmlns:cx7="http://schemas.microsoft.com/office/drawing/2016/5/13/chartex" xmlns:cx8="http://schemas.microsoft.com/office/drawing/2016/5/14/chartex" xmlns:mc="http://schemas.openxmlformats.org/markup-compatibility/2006" xmlns:aink="http://schemas.microsoft.com/office/drawing/2016/ink" xmlns:am3d="http://schemas.microsoft.com/office/drawing/2017/model3d" xmlns:o="urn:schemas-microsoft-com:office:office" xmlns:oel="http://schemas.microsoft.com/office/2019/extlst" xmlns:r="http://schemas.openxmlformats.org/officeDocument/2006/relationships" xmlns:m="http://schemas.openxmlformats.org/officeDocument/2006/math" xmlns:v="urn:schemas-microsoft-com:vml" xmlns:wp14="http://schemas.microsoft.com/office/word/2010/wordprocessingDrawing" xmlns:wp="http://schemas.openxmlformats.org/drawingml/2006/wordprocessingDrawing" xmlns:w10="urn:schemas-microsoft-com:office:word" xmlns:w="http://schemas.openxmlformats.org/wordprocessingml/2006/main" xmlns:w14="http://schemas.microsoft.com/office/word/2010/wordml" xmlns:w15="http://schemas.microsoft.com/office/word/2012/wordml" xmlns:w16cex="http://schemas.microsoft.com/office/word/2018/wordml/cex" xmlns:w16cid="http://schemas.microsoft.com/office/word/2016/wordml/cid" xmlns:w16="http://schemas.microsoft.com/office/word/2018/wordml" xmlns:w16du="http://schemas.microsoft.com/office/word/2023/wordml/word16du" xmlns:w16sdtdh="http://schemas.microsoft.com/office/word/2020/wordml/sdtdatahash" xmlns:w16sdtfl="http://schemas.microsoft.com/office/word/2024/wordml/sdtformatlock" xmlns:w16se="http://schemas.microsoft.com/office/word/2015/wordml/symex" xmlns:wpg="http://schemas.microsoft.com/office/word/2010/wordprocessingGroup" xmlns:wpi="http://schemas.microsoft.com/office/word/2010/wordprocessingInk" xmlns:wne="http://schemas.microsoft.com/office/word/2006/wordml" xmlns:wps="http://schemas.microsoft.com/office/word/2010/wordprocessingShape" mc:Ignorable="w14 w15 w16se w16cid w16 w16cex w16sdtdh w16sdtfl w16du wp14">
   <w:body>
-    <w:p>
-      <w:pPr>
-        <w:tabs>
-          <w:tab w:val="left" w:pos="426"/>
-          <w:tab w:val="left" w:pos="851"/>
-          <w:tab w:val="left" w:pos="1276"/>
-          <w:tab w:val="left" w:pos="1701"/>
-          <w:tab w:val="left" w:pos="2127"/>
-          <w:tab w:val="left" w:pos="2552"/>
-          <w:tab w:val="left" w:pos="2977"/>
-          <w:tab w:val="left" w:pos="3402"/>
-          <w:tab w:val="left" w:pos="3828"/>
-          <w:tab w:val="left" w:pos="4253"/>
-          <w:tab w:val="left" w:pos="4678"/>
-          <w:tab w:val="left" w:pos="5103"/>
-          <w:tab w:val="left" w:pos="5529"/>
-          <w:tab w:val="left" w:pos="5954"/>
-          <w:tab w:val="left" w:pos="6379"/>
-          <w:tab w:val="left" w:pos="6804"/>
-          <w:tab w:val="left" w:pos="7230"/>
-          <w:tab w:val="left" w:pos="7655"/>
-          <w:tab w:val="left" w:pos="8080"/>
-          <w:tab w:val="left" w:pos="8505"/>
-        </w:tabs>
-        <w:rPr>
-          <w:sz w:val="24"/>
-          <w:szCs w:val="24"/>
-        </w:rPr>
-      </w:pPr>
-      <w:r>
-        <w:rPr>
-          <w:b/>
-          <w:bCs/>
-          <w:sz w:val="24"/>
-          <w:szCs w:val="24"/>
-        </w:rPr>
-        <w:t>ΠΡΟΣ :</w:t>
-      </w:r>
-      <w:r>
-        <w:rPr>
-          <w:b/>
-          <w:bCs/>
-          <w:sz w:val="24"/>
-          <w:szCs w:val="24"/>
-          <w:lang w:val="el-GR"/>
-        </w:rPr>
-        <w:tab/>
-      </w:r>
-      <w:r>
-        <w:rPr>
-          <w:b/>
-          <w:bCs/>
-          <w:sz w:val="24"/>
-          <w:szCs w:val="24"/>
-          <w:lang w:val="el-GR"/>
-        </w:rPr>
-        <w:tab/>
-      </w:r>
-      <w:r>
-        <w:rPr>
-          <w:b/>
-          <w:bCs/>
-          <w:sz w:val="24"/>
-          <w:szCs w:val="24"/>
-          <w:lang w:val="el-GR"/>
-        </w:rPr>
-        <w:tab/>
-      </w:r>
-      <w:r>
-        <w:rPr>
-          <w:b/>
-          <w:bCs/>
-          <w:sz w:val="24"/>
-          <w:szCs w:val="24"/>
-          <w:lang w:val="el-GR"/>
-        </w:rPr>
-        <w:tab/>
-      </w:r>
-      <w:r>
-        <w:rPr>
-          <w:b/>
-          <w:bCs/>
-          <w:sz w:val="24"/>
-          <w:szCs w:val="24"/>
-          <w:lang w:val="el-GR"/>
-        </w:rPr>
-        <w:tab/>
-      </w:r>
-      <w:r>
-        <w:rPr>
-          <w:b/>
-          <w:bCs/>
-          <w:sz w:val="24"/>
-          <w:szCs w:val="24"/>
-          <w:lang w:val="el-GR"/>
-        </w:rPr>
-        <w:tab/>
-      </w:r>
-      <w:r>
-        <w:rPr>
-          <w:sz w:val="24"/>
-          <w:szCs w:val="24"/>
-          <w:lang w:val="el-GR"/>
-        </w:rPr>
-        <w:tab/>
-      </w:r>
-      <w:r>
-        <w:rPr>
-          <w:sz w:val="24"/>
-          <w:szCs w:val="24"/>
-          <w:lang w:val="el-GR"/>
-        </w:rPr>
-        <w:tab/>
-      </w:r>
-      <w:r>
-        <w:rPr>
-          <w:sz w:val="24"/>
-          <w:szCs w:val="24"/>
-          <w:lang w:val="el-GR"/>
-        </w:rPr>
-        <w:tab/>
-      </w:r>
-      <w:r>
-        <w:rPr>
-          <w:sz w:val="24"/>
-          <w:szCs w:val="24"/>
-          <w:lang w:val="el-GR"/>
-        </w:rPr>
-        <w:tab/>
-      </w:r>
-      <w:r>
-        <w:rPr>
-          <w:sz w:val="24"/>
-          <w:szCs w:val="24"/>
-        </w:rPr>
-        <w:tab/>
-        <w:t>ΠΟΛΕΜΙΚΟ ΝΑΥΤΙΚΟ</w:t>
-      </w:r>
-    </w:p>
-    <w:p>
-      <w:pPr>
-        <w:tabs>
-          <w:tab w:val="left" w:pos="426"/>
-          <w:tab w:val="left" w:pos="851"/>
-          <w:tab w:val="left" w:pos="1276"/>
-          <w:tab w:val="left" w:pos="1701"/>
-          <w:tab w:val="left" w:pos="2127"/>
-          <w:tab w:val="left" w:pos="2552"/>
-          <w:tab w:val="left" w:pos="2977"/>
-          <w:tab w:val="left" w:pos="3402"/>
-          <w:tab w:val="left" w:pos="3828"/>
-          <w:tab w:val="left" w:pos="4253"/>
-          <w:tab w:val="left" w:pos="4678"/>
-          <w:tab w:val="left" w:pos="5103"/>
-          <w:tab w:val="left" w:pos="5529"/>
-          <w:tab w:val="left" w:pos="5954"/>
-          <w:tab w:val="left" w:pos="6379"/>
-          <w:tab w:val="left" w:pos="6804"/>
-          <w:tab w:val="left" w:pos="7230"/>
-          <w:tab w:val="left" w:pos="7655"/>
-          <w:tab w:val="left" w:pos="8080"/>
-          <w:tab w:val="left" w:pos="8505"/>
-        </w:tabs>
-        <w:rPr>
-          <w:sz w:val="24"/>
-          <w:szCs w:val="24"/>
-          <w:lang w:val="el-GR"/>
-        </w:rPr>
-      </w:pPr>
-      <w:r>
-        <w:rPr>
-          <w:sz w:val="24"/>
-          <w:szCs w:val="24"/>
-          <w:lang w:val="el-GR"/>
-        </w:rPr>
-        <w:tab/>
-      </w:r>
-      <w:r>
-        <w:rPr>
-          <w:sz w:val="24"/>
-          <w:szCs w:val="24"/>
-          <w:lang w:val="el-GR"/>
-        </w:rPr>
-        <w:tab/>
-      </w:r>
-      <w:r>
-        <w:rPr>
-          <w:sz w:val="24"/>
-          <w:szCs w:val="24"/>
-        </w:rPr>
-        <w:t>Πίνακας</w:t>
-      </w:r>
-      <w:r>
-        <w:rPr>
-          <w:sz w:val="24"/>
-          <w:szCs w:val="24"/>
-          <w:lang w:val="en-US"/>
-        </w:rPr>
-        <w:t xml:space="preserve"> </w:t>
-      </w:r>
-      <w:r>
-        <w:rPr>
-          <w:sz w:val="24"/>
-          <w:szCs w:val="24"/>
-        </w:rPr>
-        <w:t>Αποδεκτώ</w:t>
-      </w:r>
-      <w:r>
-        <w:rPr>
-          <w:sz w:val="24"/>
-          <w:szCs w:val="24"/>
-          <w:lang w:val="el-GR"/>
-        </w:rPr>
-        <w:t>ν</w:t>
-      </w:r>
-      <w:r>
-        <w:rPr>
-          <w:sz w:val="24"/>
-          <w:szCs w:val="24"/>
-          <w:lang w:val="en-US"/>
-        </w:rPr>
-        <w:tab/>
-      </w:r>
-      <w:r>
-        <w:rPr>
-          <w:sz w:val="24"/>
-          <w:szCs w:val="24"/>
-          <w:lang w:val="en-US"/>
-        </w:rPr>
-        <w:tab/>
-      </w:r>
-      <w:r>
-        <w:rPr>
-          <w:sz w:val="24"/>
-          <w:szCs w:val="24"/>
-          <w:lang w:val="en-US"/>
-        </w:rPr>
-        <w:tab/>
-      </w:r>
-      <w:r>
-        <w:rPr>
-          <w:sz w:val="24"/>
-          <w:szCs w:val="24"/>
-          <w:lang w:val="en-US"/>
-        </w:rPr>
-        <w:tab/>
-      </w:r>
-      <w:r>
-        <w:rPr>
-          <w:sz w:val="24"/>
-          <w:szCs w:val="24"/>
-          <w:lang w:val="en-US"/>
-        </w:rPr>
-        <w:tab/>
-      </w:r>
-      <w:r>
-        <w:rPr>
-          <w:sz w:val="24"/>
-          <w:szCs w:val="24"/>
-          <w:lang w:val="en-US"/>
-        </w:rPr>
-        <w:t>{{SERVICE_UNIT_NAME}}</w:t>
-      </w:r>
-    </w:p>
-    <w:p>
-      <w:pPr>
-        <w:tabs>
-          <w:tab w:val="left" w:pos="426"/>
-          <w:tab w:val="left" w:pos="851"/>
-          <w:tab w:val="left" w:pos="1276"/>
-          <w:tab w:val="left" w:pos="1701"/>
-          <w:tab w:val="left" w:pos="2127"/>
-          <w:tab w:val="left" w:pos="2552"/>
-          <w:tab w:val="left" w:pos="2977"/>
-          <w:tab w:val="left" w:pos="3402"/>
-          <w:tab w:val="left" w:pos="3828"/>
-          <w:tab w:val="left" w:pos="4253"/>
-          <w:tab w:val="left" w:pos="4678"/>
-          <w:tab w:val="left" w:pos="5103"/>
-          <w:tab w:val="left" w:pos="5529"/>
-          <w:tab w:val="left" w:pos="5954"/>
-          <w:tab w:val="left" w:pos="6379"/>
-          <w:tab w:val="left" w:pos="6804"/>
-          <w:tab w:val="left" w:pos="7230"/>
-          <w:tab w:val="left" w:pos="7655"/>
-          <w:tab w:val="left" w:pos="8080"/>
-          <w:tab w:val="left" w:pos="8505"/>
-        </w:tabs>
-        <w:rPr>
-          <w:sz w:val="24"/>
-          <w:szCs w:val="24"/>
-          <w:lang w:val="en-US"/>
-        </w:rPr>
-      </w:pPr>
-      <w:r>
-        <w:rPr>
-          <w:sz w:val="24"/>
-          <w:szCs w:val="24"/>
-          <w:lang w:val="el-GR"/>
-        </w:rPr>
-        <w:tab/>
-      </w:r>
-      <w:r>
-        <w:rPr>
-          <w:sz w:val="24"/>
-          <w:szCs w:val="24"/>
-          <w:lang w:val="el-GR"/>
-        </w:rPr>
-        <w:tab/>
-      </w:r>
-      <w:r>
-        <w:rPr>
-          <w:sz w:val="24"/>
-          <w:szCs w:val="24"/>
-          <w:lang w:val="el-GR"/>
-        </w:rPr>
-        <w:tab/>
-      </w:r>
-      <w:r>
-        <w:rPr>
-          <w:sz w:val="24"/>
-          <w:szCs w:val="24"/>
-          <w:lang w:val="el-GR"/>
-        </w:rPr>
-        <w:tab/>
-      </w:r>
-      <w:r>
-        <w:rPr>
-          <w:sz w:val="24"/>
-          <w:szCs w:val="24"/>
-          <w:lang w:val="el-GR"/>
-        </w:rPr>
-        <w:tab/>
-      </w:r>
-      <w:r>
-        <w:rPr>
-          <w:sz w:val="24"/>
-          <w:szCs w:val="24"/>
-          <w:lang w:val="el-GR"/>
-        </w:rPr>
-        <w:tab/>
-      </w:r>
-      <w:r>
-        <w:rPr>
-          <w:sz w:val="24"/>
-          <w:szCs w:val="24"/>
-          <w:lang w:val="el-GR"/>
-        </w:rPr>
-        <w:tab/>
-      </w:r>
-      <w:r>
-        <w:rPr>
-          <w:sz w:val="24"/>
-          <w:szCs w:val="24"/>
-          <w:lang w:val="el-GR"/>
-        </w:rPr>
-        <w:tab/>
-      </w:r>
-      <w:r>
-        <w:rPr>
-          <w:sz w:val="24"/>
-          <w:szCs w:val="24"/>
-          <w:lang w:val="el-GR"/>
-        </w:rPr>
-        <w:tab/>
-      </w:r>
-      <w:r>
-        <w:rPr>
-          <w:sz w:val="24"/>
-          <w:szCs w:val="24"/>
-          <w:lang w:val="el-GR"/>
-        </w:rPr>
-        <w:tab/>
-      </w:r>
-      <w:r>
-        <w:rPr>
-          <w:sz w:val="24"/>
-          <w:szCs w:val="24"/>
-          <w:lang w:val="el-GR"/>
-        </w:rPr>
-        <w:tab/>
-      </w:r>
-      <w:r>
-        <w:rPr>
-          <w:sz w:val="24"/>
-          <w:szCs w:val="24"/>
-          <w:lang w:val="el-GR"/>
-        </w:rPr>
-        <w:tab/>
-      </w:r>
-      <w:r>
-        <w:rPr>
-          <w:sz w:val="24"/>
-          <w:szCs w:val="24"/>
-          <w:lang w:val="en-US"/>
-        </w:rPr>
-        <w:t>{{HANDLER_DIRECTORY}}</w:t>
-      </w:r>
-    </w:p>
-    <w:p>
-      <w:pPr>
-        <w:tabs>
-          <w:tab w:val="left" w:pos="426"/>
-          <w:tab w:val="left" w:pos="851"/>
-          <w:tab w:val="left" w:pos="1276"/>
-          <w:tab w:val="left" w:pos="1701"/>
-          <w:tab w:val="left" w:pos="2127"/>
-          <w:tab w:val="left" w:pos="2552"/>
-          <w:tab w:val="left" w:pos="2977"/>
-          <w:tab w:val="left" w:pos="3402"/>
-          <w:tab w:val="left" w:pos="3828"/>
-          <w:tab w:val="left" w:pos="4253"/>
-          <w:tab w:val="left" w:pos="4678"/>
-          <w:tab w:val="left" w:pos="5103"/>
-          <w:tab w:val="left" w:pos="5529"/>
-          <w:tab w:val="left" w:pos="5954"/>
-          <w:tab w:val="left" w:pos="6379"/>
-          <w:tab w:val="left" w:pos="6804"/>
-          <w:tab w:val="left" w:pos="7230"/>
-          <w:tab w:val="left" w:pos="7655"/>
-          <w:tab w:val="left" w:pos="8080"/>
-          <w:tab w:val="left" w:pos="8505"/>
-        </w:tabs>
-        <w:rPr>
-          <w:sz w:val="24"/>
-          <w:szCs w:val="24"/>
-          <w:lang w:val="en-US"/>
-        </w:rPr>
-      </w:pPr>
-      <w:r>
-        <w:rPr>
-          <w:sz w:val="24"/>
-          <w:szCs w:val="24"/>
-          <w:lang w:val="en-US"/>
-        </w:rPr>
-        <w:tab/>
-      </w:r>
-      <w:r>
-        <w:rPr>
-          <w:sz w:val="24"/>
-          <w:szCs w:val="24"/>
-          <w:lang w:val="en-US"/>
-        </w:rPr>
-        <w:tab/>
-      </w:r>
-      <w:r>
-        <w:rPr>
-          <w:sz w:val="24"/>
-          <w:szCs w:val="24"/>
-          <w:lang w:val="en-US"/>
-        </w:rPr>
-        <w:tab/>
-      </w:r>
-      <w:r>
-        <w:rPr>
-          <w:sz w:val="24"/>
-          <w:szCs w:val="24"/>
-          <w:lang w:val="en-US"/>
-        </w:rPr>
-        <w:tab/>
-      </w:r>
-      <w:r>
-        <w:rPr>
-          <w:sz w:val="24"/>
-          <w:szCs w:val="24"/>
-          <w:lang w:val="en-US"/>
-        </w:rPr>
-        <w:tab/>
-      </w:r>
-      <w:r>
-        <w:rPr>
-          <w:sz w:val="24"/>
-          <w:szCs w:val="24"/>
-          <w:lang w:val="en-US"/>
-        </w:rPr>
-        <w:tab/>
-      </w:r>
-      <w:r>
-        <w:rPr>
-          <w:sz w:val="24"/>
-          <w:szCs w:val="24"/>
-          <w:lang w:val="en-US"/>
-        </w:rPr>
-        <w:tab/>
-      </w:r>
-      <w:r>
-        <w:rPr>
-          <w:sz w:val="24"/>
-          <w:szCs w:val="24"/>
-          <w:lang w:val="en-US"/>
-        </w:rPr>
-        <w:tab/>
-      </w:r>
-      <w:r>
-        <w:rPr>
-          <w:sz w:val="24"/>
-          <w:szCs w:val="24"/>
-          <w:lang w:val="en-US"/>
-        </w:rPr>
-        <w:tab/>
-      </w:r>
-      <w:r>
-        <w:rPr>
-          <w:sz w:val="24"/>
-          <w:szCs w:val="24"/>
-          <w:lang w:val="en-US"/>
-        </w:rPr>
-        <w:tab/>
-      </w:r>
-      <w:r>
-        <w:rPr>
-          <w:sz w:val="24"/>
-          <w:szCs w:val="24"/>
-          <w:lang w:val="en-US"/>
-        </w:rPr>
-        <w:tab/>
-      </w:r>
-      <w:r>
-        <w:rPr>
-          <w:sz w:val="24"/>
-          <w:szCs w:val="24"/>
-          <w:lang w:val="en-US"/>
-        </w:rPr>
-        <w:tab/>
-        <w:t>{{HANDLER_DEPARTMENT}}</w:t>
-      </w:r>
-      <w:r>
-        <w:rPr>
-          <w:sz w:val="24"/>
-          <w:szCs w:val="24"/>
-          <w:lang w:val="en-US"/>
-        </w:rPr>
-        <w:tab/>
-      </w:r>
-    </w:p>
-    <w:p>
-      <w:pPr>
-        <w:tabs>
-          <w:tab w:val="left" w:pos="426"/>
-          <w:tab w:val="left" w:pos="851"/>
-          <w:tab w:val="left" w:pos="1276"/>
-          <w:tab w:val="left" w:pos="1701"/>
-          <w:tab w:val="left" w:pos="2127"/>
-          <w:tab w:val="left" w:pos="2552"/>
-          <w:tab w:val="left" w:pos="2977"/>
-          <w:tab w:val="left" w:pos="3402"/>
-          <w:tab w:val="left" w:pos="3828"/>
-          <w:tab w:val="left" w:pos="4253"/>
-          <w:tab w:val="left" w:pos="4678"/>
-          <w:tab w:val="left" w:pos="5103"/>
-          <w:tab w:val="left" w:pos="5529"/>
-          <w:tab w:val="left" w:pos="5954"/>
-          <w:tab w:val="left" w:pos="6379"/>
-          <w:tab w:val="left" w:pos="6804"/>
-          <w:tab w:val="left" w:pos="7230"/>
-          <w:tab w:val="left" w:pos="7655"/>
-          <w:tab w:val="left" w:pos="8080"/>
-          <w:tab w:val="left" w:pos="8505"/>
-        </w:tabs>
-        <w:rPr>
-          <w:sz w:val="24"/>
-          <w:szCs w:val="24"/>
-          <w:lang w:val="en-US"/>
-        </w:rPr>
-      </w:pPr>
-      <w:r>
-        <w:rPr>
-          <w:b/>
-          <w:bCs/>
-          <w:sz w:val="24"/>
-          <w:szCs w:val="24"/>
-        </w:rPr>
-        <w:t>ΚΟΙΝ</w:t>
-      </w:r>
-      <w:r>
-        <w:rPr>
-          <w:b/>
-          <w:bCs/>
-          <w:sz w:val="24"/>
-          <w:szCs w:val="24"/>
-          <w:lang w:val="en-US"/>
-        </w:rPr>
-        <w:t>.:</w:t>
-      </w:r>
-      <w:r>
-        <w:rPr>
-          <w:sz w:val="24"/>
-          <w:szCs w:val="24"/>
-          <w:lang w:val="en-US"/>
-        </w:rPr>
-        <w:tab/>
-      </w:r>
-      <w:r>
-        <w:rPr>
-          <w:sz w:val="24"/>
-          <w:szCs w:val="24"/>
-          <w:lang w:val="en-US"/>
-        </w:rPr>
-        <w:tab/>
-      </w:r>
-      <w:r>
-        <w:rPr>
-          <w:sz w:val="24"/>
-          <w:szCs w:val="24"/>
-          <w:lang w:val="en-US"/>
-        </w:rPr>
-        <w:tab/>
-      </w:r>
-      <w:r>
-        <w:rPr>
-          <w:sz w:val="24"/>
-          <w:szCs w:val="24"/>
-          <w:lang w:val="en-US"/>
-        </w:rPr>
-        <w:tab/>
-      </w:r>
-      <w:r>
-        <w:rPr>
-          <w:sz w:val="24"/>
-          <w:szCs w:val="24"/>
-          <w:lang w:val="en-US"/>
-        </w:rPr>
-        <w:tab/>
-      </w:r>
-      <w:r>
-        <w:rPr>
-          <w:sz w:val="24"/>
-          <w:szCs w:val="24"/>
-          <w:lang w:val="en-US"/>
-        </w:rPr>
-        <w:tab/>
-      </w:r>
-      <w:r>
-        <w:rPr>
-          <w:sz w:val="24"/>
-          <w:szCs w:val="24"/>
-          <w:lang w:val="en-US"/>
-        </w:rPr>
-        <w:tab/>
-      </w:r>
-      <w:r>
-        <w:rPr>
-          <w:sz w:val="24"/>
-          <w:szCs w:val="24"/>
-          <w:lang w:val="en-US"/>
-        </w:rPr>
-        <w:tab/>
-      </w:r>
-      <w:r>
-        <w:rPr>
-          <w:sz w:val="24"/>
-          <w:szCs w:val="24"/>
-          <w:lang w:val="en-US"/>
-        </w:rPr>
-        <w:tab/>
-      </w:r>
-      <w:r>
-        <w:rPr>
-          <w:sz w:val="24"/>
-          <w:szCs w:val="24"/>
-          <w:lang w:val="en-US"/>
-        </w:rPr>
-        <w:tab/>
-      </w:r>
-      <w:r>
-        <w:rPr>
-          <w:sz w:val="24"/>
-          <w:szCs w:val="24"/>
-          <w:lang w:val="en-US"/>
-        </w:rPr>
-        <w:tab/>
-      </w:r>
-      <w:r>
-        <w:rPr>
-          <w:sz w:val="24"/>
-          <w:szCs w:val="24"/>
-          <w:lang w:val="en-US"/>
-        </w:rPr>
-        <w:t>{{</w:t>
-      </w:r>
-      <w:r>
-        <w:rPr>
-          <w:sz w:val="24"/>
-          <w:szCs w:val="24"/>
-          <w:lang w:val="en-US"/>
-        </w:rPr>
-        <w:t>SERVICE_UNIT_PHONE</w:t>
-      </w:r>
-      <w:r>
-        <w:rPr>
-          <w:sz w:val="24"/>
-          <w:szCs w:val="24"/>
-          <w:lang w:val="en-US"/>
-        </w:rPr>
-        <w:t>}}</w:t>
-      </w:r>
-    </w:p>
-    <w:p>
-      <w:pPr>
-        <w:tabs>
-          <w:tab w:val="left" w:pos="426"/>
-          <w:tab w:val="left" w:pos="851"/>
-          <w:tab w:val="left" w:pos="1276"/>
-          <w:tab w:val="left" w:pos="1701"/>
-          <w:tab w:val="left" w:pos="2127"/>
-          <w:tab w:val="left" w:pos="2552"/>
-          <w:tab w:val="left" w:pos="2977"/>
-          <w:tab w:val="left" w:pos="3402"/>
-          <w:tab w:val="left" w:pos="3828"/>
-          <w:tab w:val="left" w:pos="4253"/>
-          <w:tab w:val="left" w:pos="4678"/>
-          <w:tab w:val="left" w:pos="5103"/>
-          <w:tab w:val="left" w:pos="5529"/>
-          <w:tab w:val="left" w:pos="5954"/>
-          <w:tab w:val="left" w:pos="6379"/>
-          <w:tab w:val="left" w:pos="6804"/>
-          <w:tab w:val="left" w:pos="7230"/>
-          <w:tab w:val="left" w:pos="7655"/>
-          <w:tab w:val="left" w:pos="8080"/>
-          <w:tab w:val="left" w:pos="8505"/>
-        </w:tabs>
-        <w:rPr>
-          <w:sz w:val="24"/>
-          <w:szCs w:val="24"/>
-          <w:lang w:val="el-GR"/>
-        </w:rPr>
-      </w:pPr>
-      <w:r>
-        <w:rPr>
-          <w:sz w:val="24"/>
-          <w:szCs w:val="24"/>
-          <w:lang w:val="en-US"/>
-        </w:rPr>
-        <w:tab/>
-      </w:r>
-      <w:r>
-        <w:rPr>
-          <w:sz w:val="24"/>
-          <w:szCs w:val="24"/>
-          <w:lang w:val="en-US"/>
-        </w:rPr>
-        <w:tab/>
-      </w:r>
-      <w:r>
-        <w:rPr>
-          <w:sz w:val="24"/>
-          <w:szCs w:val="24"/>
-          <w:lang w:val="en-US"/>
-        </w:rPr>
-        <w:tab/>
-      </w:r>
-      <w:r>
-        <w:rPr>
-          <w:sz w:val="24"/>
-          <w:szCs w:val="24"/>
-          <w:lang w:val="en-US"/>
-        </w:rPr>
-        <w:tab/>
-      </w:r>
-      <w:r>
-        <w:rPr>
-          <w:sz w:val="24"/>
-          <w:szCs w:val="24"/>
-          <w:lang w:val="en-US"/>
-        </w:rPr>
-        <w:tab/>
-      </w:r>
-      <w:r>
-        <w:rPr>
-          <w:sz w:val="24"/>
-          <w:szCs w:val="24"/>
-          <w:lang w:val="en-US"/>
-        </w:rPr>
-        <w:tab/>
-      </w:r>
-      <w:r>
-        <w:rPr>
-          <w:sz w:val="24"/>
-          <w:szCs w:val="24"/>
-          <w:lang w:val="en-US"/>
-        </w:rPr>
-        <w:tab/>
-      </w:r>
-      <w:r>
-        <w:rPr>
-          <w:sz w:val="24"/>
-          <w:szCs w:val="24"/>
-          <w:lang w:val="en-US"/>
-        </w:rPr>
-        <w:tab/>
-      </w:r>
-      <w:r>
-        <w:rPr>
-          <w:sz w:val="24"/>
-          <w:szCs w:val="24"/>
-          <w:lang w:val="en-US"/>
-        </w:rPr>
-        <w:tab/>
-      </w:r>
-      <w:r>
-        <w:rPr>
-          <w:sz w:val="24"/>
-          <w:szCs w:val="24"/>
-          <w:lang w:val="en-US"/>
-        </w:rPr>
-        <w:tab/>
-      </w:r>
-      <w:r>
-        <w:rPr>
-          <w:sz w:val="24"/>
-          <w:szCs w:val="24"/>
-          <w:lang w:val="en-US"/>
-        </w:rPr>
-        <w:tab/>
-      </w:r>
-      <w:r>
-        <w:rPr>
-          <w:sz w:val="24"/>
-          <w:szCs w:val="24"/>
-          <w:lang w:val="en-US"/>
-        </w:rPr>
-        <w:tab/>
-      </w:r>
-      <w:r>
-        <w:rPr>
-          <w:sz w:val="24"/>
-          <w:szCs w:val="24"/>
-        </w:rPr>
-        <w:t>Φ</w:t>
-      </w:r>
-      <w:r>
-        <w:rPr>
-          <w:sz w:val="24"/>
-          <w:szCs w:val="24"/>
-          <w:lang w:val="el-GR"/>
-        </w:rPr>
-        <w:t>.800/</w:t>
-      </w:r>
-    </w:p>
-    <w:p>
-      <w:pPr>
-        <w:tabs>
-          <w:tab w:val="left" w:pos="426"/>
-          <w:tab w:val="left" w:pos="851"/>
-          <w:tab w:val="left" w:pos="1276"/>
-          <w:tab w:val="left" w:pos="1701"/>
-          <w:tab w:val="left" w:pos="2127"/>
-          <w:tab w:val="left" w:pos="2552"/>
-          <w:tab w:val="left" w:pos="2977"/>
-          <w:tab w:val="left" w:pos="3402"/>
-          <w:tab w:val="left" w:pos="3828"/>
-          <w:tab w:val="left" w:pos="4253"/>
-          <w:tab w:val="left" w:pos="4678"/>
-          <w:tab w:val="left" w:pos="5103"/>
-          <w:tab w:val="left" w:pos="5529"/>
-          <w:tab w:val="left" w:pos="5954"/>
-          <w:tab w:val="left" w:pos="6379"/>
-          <w:tab w:val="left" w:pos="6804"/>
-          <w:tab w:val="left" w:pos="7230"/>
-          <w:tab w:val="left" w:pos="7655"/>
-          <w:tab w:val="left" w:pos="8080"/>
-          <w:tab w:val="left" w:pos="8505"/>
-        </w:tabs>
-        <w:rPr>
-          <w:sz w:val="24"/>
-          <w:szCs w:val="24"/>
-        </w:rPr>
-      </w:pPr>
-      <w:r>
-        <w:rPr>
-          <w:sz w:val="24"/>
-          <w:szCs w:val="24"/>
-          <w:lang w:val="el-GR"/>
-        </w:rPr>
-        <w:tab/>
-      </w:r>
-      <w:r>
-        <w:rPr>
-          <w:sz w:val="24"/>
-          <w:szCs w:val="24"/>
-          <w:lang w:val="el-GR"/>
-        </w:rPr>
-        <w:tab/>
-      </w:r>
-      <w:r>
-        <w:rPr>
-          <w:sz w:val="24"/>
-          <w:szCs w:val="24"/>
-          <w:lang w:val="el-GR"/>
-        </w:rPr>
-        <w:tab/>
-      </w:r>
-      <w:r>
-        <w:rPr>
-          <w:sz w:val="24"/>
-          <w:szCs w:val="24"/>
-          <w:lang w:val="el-GR"/>
-        </w:rPr>
-        <w:tab/>
-      </w:r>
-      <w:r>
-        <w:rPr>
-          <w:sz w:val="24"/>
-          <w:szCs w:val="24"/>
-          <w:lang w:val="el-GR"/>
-        </w:rPr>
-        <w:tab/>
-      </w:r>
-      <w:r>
-        <w:rPr>
-          <w:sz w:val="24"/>
-          <w:szCs w:val="24"/>
-          <w:lang w:val="el-GR"/>
-        </w:rPr>
-        <w:tab/>
-      </w:r>
-      <w:r>
-        <w:rPr>
-          <w:sz w:val="24"/>
-          <w:szCs w:val="24"/>
-          <w:lang w:val="el-GR"/>
-        </w:rPr>
-        <w:tab/>
-      </w:r>
-      <w:r>
-        <w:rPr>
-          <w:sz w:val="24"/>
-          <w:szCs w:val="24"/>
-          <w:lang w:val="el-GR"/>
-        </w:rPr>
-        <w:tab/>
-      </w:r>
-      <w:r>
-        <w:rPr>
-          <w:sz w:val="24"/>
-          <w:szCs w:val="24"/>
-          <w:lang w:val="el-GR"/>
-        </w:rPr>
-        <w:tab/>
-      </w:r>
-      <w:r>
-        <w:rPr>
-          <w:sz w:val="24"/>
-          <w:szCs w:val="24"/>
-          <w:lang w:val="el-GR"/>
-        </w:rPr>
-        <w:tab/>
-      </w:r>
-      <w:r>
-        <w:rPr>
-          <w:sz w:val="24"/>
-          <w:szCs w:val="24"/>
-          <w:lang w:val="el-GR"/>
-        </w:rPr>
-        <w:tab/>
-      </w:r>
-      <w:r>
-        <w:rPr>
-          <w:sz w:val="24"/>
-          <w:szCs w:val="24"/>
-          <w:lang w:val="el-GR"/>
-        </w:rPr>
-        <w:tab/>
-      </w:r>
-      <w:r>
-        <w:rPr>
-          <w:sz w:val="24"/>
-          <w:szCs w:val="24"/>
-        </w:rPr>
-        <w:t>Σ.</w:t>
-      </w:r>
-    </w:p>
-    <w:p>
-      <w:pPr>
-        <w:tabs>
-          <w:tab w:val="left" w:pos="426"/>
-          <w:tab w:val="left" w:pos="851"/>
-          <w:tab w:val="left" w:pos="1276"/>
-          <w:tab w:val="left" w:pos="1701"/>
-          <w:tab w:val="left" w:pos="2127"/>
-          <w:tab w:val="left" w:pos="2552"/>
-          <w:tab w:val="left" w:pos="2977"/>
-          <w:tab w:val="left" w:pos="3402"/>
-          <w:tab w:val="left" w:pos="3828"/>
-          <w:tab w:val="left" w:pos="4253"/>
-          <w:tab w:val="left" w:pos="4678"/>
-          <w:tab w:val="left" w:pos="5103"/>
-          <w:tab w:val="left" w:pos="5529"/>
-          <w:tab w:val="left" w:pos="5954"/>
-          <w:tab w:val="left" w:pos="6379"/>
-          <w:tab w:val="left" w:pos="6804"/>
-          <w:tab w:val="left" w:pos="7230"/>
-          <w:tab w:val="left" w:pos="7655"/>
-          <w:tab w:val="left" w:pos="8080"/>
-          <w:tab w:val="left" w:pos="8505"/>
-        </w:tabs>
-        <w:rPr>
-          <w:sz w:val="24"/>
-          <w:szCs w:val="24"/>
-        </w:rPr>
-      </w:pPr>
-      <w:r>
-        <w:rPr>
-          <w:sz w:val="24"/>
-          <w:szCs w:val="24"/>
-          <w:lang w:val="el-GR"/>
-        </w:rPr>
-        <w:tab/>
-      </w:r>
-      <w:r>
-        <w:rPr>
-          <w:sz w:val="24"/>
-          <w:szCs w:val="24"/>
-          <w:lang w:val="el-GR"/>
-        </w:rPr>
-        <w:tab/>
-      </w:r>
-      <w:r>
-        <w:rPr>
-          <w:sz w:val="24"/>
-          <w:szCs w:val="24"/>
-          <w:lang w:val="el-GR"/>
-        </w:rPr>
-        <w:tab/>
-      </w:r>
-      <w:r>
-        <w:rPr>
-          <w:sz w:val="24"/>
-          <w:szCs w:val="24"/>
-          <w:lang w:val="el-GR"/>
-        </w:rPr>
-        <w:tab/>
-      </w:r>
-      <w:r>
-        <w:rPr>
-          <w:sz w:val="24"/>
-          <w:szCs w:val="24"/>
-          <w:lang w:val="el-GR"/>
-        </w:rPr>
-        <w:tab/>
-      </w:r>
-      <w:r>
-        <w:rPr>
-          <w:sz w:val="24"/>
-          <w:szCs w:val="24"/>
-          <w:lang w:val="el-GR"/>
-        </w:rPr>
-        <w:tab/>
-      </w:r>
-      <w:r>
-        <w:rPr>
-          <w:sz w:val="24"/>
-          <w:szCs w:val="24"/>
-          <w:lang w:val="el-GR"/>
-        </w:rPr>
-        <w:tab/>
-      </w:r>
-      <w:r>
-        <w:rPr>
-          <w:sz w:val="24"/>
-          <w:szCs w:val="24"/>
-          <w:lang w:val="el-GR"/>
-        </w:rPr>
-        <w:tab/>
-      </w:r>
-      <w:r>
-        <w:rPr>
-          <w:sz w:val="24"/>
-          <w:szCs w:val="24"/>
-          <w:lang w:val="el-GR"/>
-        </w:rPr>
-        <w:tab/>
-      </w:r>
-      <w:r>
-        <w:rPr>
-          <w:sz w:val="24"/>
-          <w:szCs w:val="24"/>
-          <w:lang w:val="el-GR"/>
-        </w:rPr>
-        <w:tab/>
-      </w:r>
-      <w:r>
-        <w:rPr>
-          <w:sz w:val="24"/>
-          <w:szCs w:val="24"/>
-          <w:lang w:val="el-GR"/>
-        </w:rPr>
-        <w:tab/>
-      </w:r>
-      <w:r>
-        <w:rPr>
-          <w:sz w:val="24"/>
-          <w:szCs w:val="24"/>
-          <w:lang w:val="el-GR"/>
-        </w:rPr>
-        <w:tab/>
-      </w:r>
-      <w:r>
-        <w:rPr>
-          <w:sz w:val="24"/>
-          <w:szCs w:val="24"/>
-          <w:highlight w:val="yellow"/>
-          <w:lang w:val="el-GR"/>
-        </w:rPr>
-        <w:t>Τοποθεσία</w:t>
-      </w:r>
-      <w:r>
-        <w:rPr>
-          <w:sz w:val="24"/>
-          <w:szCs w:val="24"/>
-          <w:highlight w:val="yellow"/>
-        </w:rPr>
-        <w:t>, ………..</w:t>
-      </w:r>
-    </w:p>
+    <w:tbl>
+      <w:tblPr>
+        <w:tblStyle w:val="TableGrid"/>
+        <w:tblW w:w="0" w:type="auto"/>
+        <w:tblBorders>
+          <w:top w:val="none" w:sz="0" w:space="0" w:color="auto"/>
+          <w:left w:val="none" w:sz="0" w:space="0" w:color="auto"/>
+          <w:bottom w:val="none" w:sz="0" w:space="0" w:color="auto"/>
+          <w:right w:val="none" w:sz="0" w:space="0" w:color="auto"/>
+          <w:insideH w:val="none" w:sz="0" w:space="0" w:color="auto"/>
+          <w:insideV w:val="none" w:sz="0" w:space="0" w:color="auto"/>
+        </w:tblBorders>
+        <w:tblLook w:val="04A0" w:firstRow="1" w:lastRow="0" w:firstColumn="1" w:lastColumn="0" w:noHBand="0" w:noVBand="1"/>
+      </w:tblPr>
+      <w:tblGrid>
+        <w:gridCol w:w="4820"/>
+        <w:gridCol w:w="4199"/>
+      </w:tblGrid>
+      <w:tr>
+        <w:tc>
+          <w:tcPr>
+            <w:tcW w:w="4820" w:type="dxa"/>
+          </w:tcPr>
+          <w:p>
+            <w:pPr>
+              <w:tabs>
+                <w:tab w:val="left" w:pos="426"/>
+                <w:tab w:val="left" w:pos="851"/>
+                <w:tab w:val="left" w:pos="1276"/>
+                <w:tab w:val="left" w:pos="1701"/>
+                <w:tab w:val="left" w:pos="2127"/>
+                <w:tab w:val="left" w:pos="2552"/>
+                <w:tab w:val="left" w:pos="2977"/>
+                <w:tab w:val="left" w:pos="3402"/>
+                <w:tab w:val="left" w:pos="3828"/>
+                <w:tab w:val="left" w:pos="4253"/>
+                <w:tab w:val="left" w:pos="4678"/>
+                <w:tab w:val="left" w:pos="5103"/>
+                <w:tab w:val="left" w:pos="5529"/>
+                <w:tab w:val="left" w:pos="5954"/>
+                <w:tab w:val="left" w:pos="6379"/>
+                <w:tab w:val="left" w:pos="6804"/>
+                <w:tab w:val="left" w:pos="7230"/>
+                <w:tab w:val="left" w:pos="7655"/>
+                <w:tab w:val="left" w:pos="8080"/>
+                <w:tab w:val="left" w:pos="8505"/>
+              </w:tabs>
+              <w:rPr>
+                <w:b/>
+                <w:bCs/>
+                <w:sz w:val="24"/>
+                <w:szCs w:val="24"/>
+                <w:lang w:val="el-GR"/>
+              </w:rPr>
+            </w:pPr>
+            <w:r>
+              <w:rPr>
+                <w:b/>
+                <w:bCs/>
+                <w:sz w:val="24"/>
+                <w:szCs w:val="24"/>
+              </w:rPr>
+              <w:t>ΠΡΟΣ</w:t>
+            </w:r>
+            <w:r>
+              <w:rPr>
+                <w:b/>
+                <w:bCs/>
+                <w:sz w:val="24"/>
+                <w:szCs w:val="24"/>
+                <w:lang w:val="el-GR"/>
+              </w:rPr>
+              <w:t xml:space="preserve"> :</w:t>
+            </w:r>
+            <w:r>
+              <w:rPr>
+                <w:b/>
+                <w:bCs/>
+                <w:sz w:val="24"/>
+                <w:szCs w:val="24"/>
+                <w:lang w:val="el-GR"/>
+              </w:rPr>
+              <w:tab/>
+            </w:r>
+            <w:r>
+              <w:rPr>
+                <w:b/>
+                <w:bCs/>
+                <w:sz w:val="24"/>
+                <w:szCs w:val="24"/>
+                <w:lang w:val="el-GR"/>
+              </w:rPr>
+              <w:t xml:space="preserve"> </w:t>
+            </w:r>
+            <w:r>
+              <w:rPr>
+                <w:sz w:val="24"/>
+                <w:szCs w:val="24"/>
+              </w:rPr>
+              <w:t>Πίνακας</w:t>
+            </w:r>
+            <w:r>
+              <w:rPr>
+                <w:sz w:val="24"/>
+                <w:szCs w:val="24"/>
+                <w:lang w:val="el-GR"/>
+              </w:rPr>
+              <w:t xml:space="preserve"> </w:t>
+            </w:r>
+            <w:r>
+              <w:rPr>
+                <w:sz w:val="24"/>
+                <w:szCs w:val="24"/>
+              </w:rPr>
+              <w:t>Αποδεκτώ</w:t>
+            </w:r>
+            <w:r>
+              <w:rPr>
+                <w:sz w:val="24"/>
+                <w:szCs w:val="24"/>
+                <w:lang w:val="el-GR"/>
+              </w:rPr>
+              <w:t>ν</w:t>
+            </w:r>
+          </w:p>
+        </w:tc>
+        <w:tc>
+          <w:tcPr>
+            <w:tcW w:w="4199" w:type="dxa"/>
+          </w:tcPr>
+          <w:p>
+            <w:pPr>
+              <w:tabs>
+                <w:tab w:val="left" w:pos="426"/>
+                <w:tab w:val="left" w:pos="851"/>
+                <w:tab w:val="left" w:pos="1276"/>
+                <w:tab w:val="left" w:pos="1701"/>
+                <w:tab w:val="left" w:pos="2127"/>
+                <w:tab w:val="left" w:pos="2552"/>
+                <w:tab w:val="left" w:pos="2977"/>
+                <w:tab w:val="left" w:pos="3402"/>
+                <w:tab w:val="left" w:pos="3828"/>
+                <w:tab w:val="left" w:pos="4253"/>
+                <w:tab w:val="left" w:pos="4678"/>
+                <w:tab w:val="left" w:pos="5103"/>
+                <w:tab w:val="left" w:pos="5529"/>
+                <w:tab w:val="left" w:pos="5954"/>
+                <w:tab w:val="left" w:pos="6379"/>
+                <w:tab w:val="left" w:pos="6804"/>
+                <w:tab w:val="left" w:pos="7230"/>
+                <w:tab w:val="left" w:pos="7655"/>
+                <w:tab w:val="left" w:pos="8080"/>
+                <w:tab w:val="left" w:pos="8505"/>
+              </w:tabs>
+              <w:rPr>
+                <w:b/>
+                <w:bCs/>
+                <w:sz w:val="24"/>
+                <w:szCs w:val="24"/>
+                <w:lang w:val="el-GR"/>
+              </w:rPr>
+            </w:pPr>
+            <w:r>
+              <w:rPr>
+                <w:sz w:val="24"/>
+                <w:szCs w:val="24"/>
+                <w:lang w:val="el-GR"/>
+              </w:rPr>
+              <w:t>{{</w:t>
+            </w:r>
+            <w:r>
+              <w:rPr>
+                <w:sz w:val="24"/>
+                <w:szCs w:val="24"/>
+                <w:lang w:val="en-US"/>
+              </w:rPr>
+              <w:t>SERVICE</w:t>
+            </w:r>
+            <w:r>
+              <w:rPr>
+                <w:sz w:val="24"/>
+                <w:szCs w:val="24"/>
+                <w:lang w:val="el-GR"/>
+              </w:rPr>
+              <w:t>_</w:t>
+            </w:r>
+            <w:r>
+              <w:rPr>
+                <w:sz w:val="24"/>
+                <w:szCs w:val="24"/>
+                <w:lang w:val="en-US"/>
+              </w:rPr>
+              <w:t>UNIT</w:t>
+            </w:r>
+            <w:r>
+              <w:rPr>
+                <w:sz w:val="24"/>
+                <w:szCs w:val="24"/>
+                <w:lang w:val="el-GR"/>
+              </w:rPr>
+              <w:t>_</w:t>
+            </w:r>
+            <w:r>
+              <w:rPr>
+                <w:sz w:val="24"/>
+                <w:szCs w:val="24"/>
+                <w:lang w:val="en-US"/>
+              </w:rPr>
+              <w:t>NAME</w:t>
+            </w:r>
+            <w:r>
+              <w:rPr>
+                <w:sz w:val="24"/>
+                <w:szCs w:val="24"/>
+                <w:lang w:val="el-GR"/>
+              </w:rPr>
+              <w:t>}}</w:t>
+            </w:r>
+          </w:p>
+        </w:tc>
+      </w:tr>
+      <w:tr>
+        <w:tc>
+          <w:tcPr>
+            <w:tcW w:w="4820" w:type="dxa"/>
+          </w:tcPr>
+          <w:p>
+            <w:pPr>
+              <w:tabs>
+                <w:tab w:val="left" w:pos="426"/>
+                <w:tab w:val="left" w:pos="851"/>
+                <w:tab w:val="left" w:pos="1276"/>
+                <w:tab w:val="left" w:pos="1701"/>
+                <w:tab w:val="left" w:pos="2127"/>
+                <w:tab w:val="left" w:pos="2552"/>
+                <w:tab w:val="left" w:pos="2977"/>
+                <w:tab w:val="left" w:pos="3402"/>
+                <w:tab w:val="left" w:pos="3828"/>
+                <w:tab w:val="left" w:pos="4253"/>
+                <w:tab w:val="left" w:pos="4678"/>
+                <w:tab w:val="left" w:pos="5103"/>
+                <w:tab w:val="left" w:pos="5529"/>
+                <w:tab w:val="left" w:pos="5954"/>
+                <w:tab w:val="left" w:pos="6379"/>
+                <w:tab w:val="left" w:pos="6804"/>
+                <w:tab w:val="left" w:pos="7230"/>
+                <w:tab w:val="left" w:pos="7655"/>
+                <w:tab w:val="left" w:pos="8080"/>
+                <w:tab w:val="left" w:pos="8505"/>
+              </w:tabs>
+              <w:rPr>
+                <w:b/>
+                <w:bCs/>
+                <w:sz w:val="24"/>
+                <w:szCs w:val="24"/>
+              </w:rPr>
+            </w:pPr>
+          </w:p>
+        </w:tc>
+        <w:tc>
+          <w:tcPr>
+            <w:tcW w:w="4199" w:type="dxa"/>
+          </w:tcPr>
+          <w:p>
+            <w:pPr>
+              <w:tabs>
+                <w:tab w:val="left" w:pos="426"/>
+                <w:tab w:val="left" w:pos="851"/>
+                <w:tab w:val="left" w:pos="1276"/>
+                <w:tab w:val="left" w:pos="1701"/>
+                <w:tab w:val="left" w:pos="2127"/>
+                <w:tab w:val="left" w:pos="2552"/>
+                <w:tab w:val="left" w:pos="2977"/>
+                <w:tab w:val="left" w:pos="3402"/>
+                <w:tab w:val="left" w:pos="3828"/>
+                <w:tab w:val="left" w:pos="4253"/>
+                <w:tab w:val="left" w:pos="4678"/>
+                <w:tab w:val="left" w:pos="5103"/>
+                <w:tab w:val="left" w:pos="5529"/>
+                <w:tab w:val="left" w:pos="5954"/>
+                <w:tab w:val="left" w:pos="6379"/>
+                <w:tab w:val="left" w:pos="6804"/>
+                <w:tab w:val="left" w:pos="7230"/>
+                <w:tab w:val="left" w:pos="7655"/>
+                <w:tab w:val="left" w:pos="8080"/>
+                <w:tab w:val="left" w:pos="8505"/>
+              </w:tabs>
+              <w:rPr>
+                <w:sz w:val="24"/>
+                <w:szCs w:val="24"/>
+                <w:lang w:val="el-GR"/>
+              </w:rPr>
+            </w:pPr>
+            <w:r>
+              <w:rPr>
+                <w:sz w:val="24"/>
+                <w:szCs w:val="24"/>
+                <w:lang w:val="en-US"/>
+              </w:rPr>
+              <w:t>{{HANDLER_DIRECTORY}}</w:t>
+            </w:r>
+          </w:p>
+        </w:tc>
+      </w:tr>
+      <w:tr>
+        <w:tc>
+          <w:tcPr>
+            <w:tcW w:w="4820" w:type="dxa"/>
+          </w:tcPr>
+          <w:p>
+            <w:pPr>
+              <w:tabs>
+                <w:tab w:val="left" w:pos="426"/>
+                <w:tab w:val="left" w:pos="851"/>
+                <w:tab w:val="left" w:pos="1276"/>
+                <w:tab w:val="left" w:pos="1701"/>
+                <w:tab w:val="left" w:pos="2127"/>
+                <w:tab w:val="left" w:pos="2552"/>
+                <w:tab w:val="left" w:pos="2977"/>
+                <w:tab w:val="left" w:pos="3402"/>
+                <w:tab w:val="left" w:pos="3828"/>
+                <w:tab w:val="left" w:pos="4253"/>
+                <w:tab w:val="left" w:pos="4678"/>
+                <w:tab w:val="left" w:pos="5103"/>
+                <w:tab w:val="left" w:pos="5529"/>
+                <w:tab w:val="left" w:pos="5954"/>
+                <w:tab w:val="left" w:pos="6379"/>
+                <w:tab w:val="left" w:pos="6804"/>
+                <w:tab w:val="left" w:pos="7230"/>
+                <w:tab w:val="left" w:pos="7655"/>
+                <w:tab w:val="left" w:pos="8080"/>
+                <w:tab w:val="left" w:pos="8505"/>
+              </w:tabs>
+              <w:rPr>
+                <w:b/>
+                <w:bCs/>
+                <w:sz w:val="24"/>
+                <w:szCs w:val="24"/>
+              </w:rPr>
+            </w:pPr>
+          </w:p>
+        </w:tc>
+        <w:tc>
+          <w:tcPr>
+            <w:tcW w:w="4199" w:type="dxa"/>
+          </w:tcPr>
+          <w:p>
+            <w:pPr>
+              <w:tabs>
+                <w:tab w:val="left" w:pos="426"/>
+                <w:tab w:val="left" w:pos="851"/>
+                <w:tab w:val="left" w:pos="1276"/>
+                <w:tab w:val="left" w:pos="1701"/>
+                <w:tab w:val="left" w:pos="2127"/>
+                <w:tab w:val="left" w:pos="2552"/>
+                <w:tab w:val="left" w:pos="2977"/>
+                <w:tab w:val="left" w:pos="3402"/>
+                <w:tab w:val="left" w:pos="3828"/>
+                <w:tab w:val="left" w:pos="4253"/>
+                <w:tab w:val="left" w:pos="4678"/>
+                <w:tab w:val="left" w:pos="5103"/>
+                <w:tab w:val="left" w:pos="5529"/>
+                <w:tab w:val="left" w:pos="5954"/>
+                <w:tab w:val="left" w:pos="6379"/>
+                <w:tab w:val="left" w:pos="6804"/>
+                <w:tab w:val="left" w:pos="7230"/>
+                <w:tab w:val="left" w:pos="7655"/>
+                <w:tab w:val="left" w:pos="8080"/>
+                <w:tab w:val="left" w:pos="8505"/>
+              </w:tabs>
+              <w:rPr>
+                <w:sz w:val="24"/>
+                <w:szCs w:val="24"/>
+                <w:lang w:val="en-US"/>
+              </w:rPr>
+            </w:pPr>
+            <w:r>
+              <w:rPr>
+                <w:sz w:val="24"/>
+                <w:szCs w:val="24"/>
+                <w:lang w:val="el-GR"/>
+              </w:rPr>
+              <w:t xml:space="preserve">Τηλ: </w:t>
+            </w:r>
+            <w:r>
+              <w:rPr>
+                <w:sz w:val="24"/>
+                <w:szCs w:val="24"/>
+                <w:lang w:val="en-US"/>
+              </w:rPr>
+              <w:t>{{</w:t>
+            </w:r>
+            <w:r>
+              <w:rPr>
+                <w:sz w:val="24"/>
+                <w:szCs w:val="24"/>
+                <w:lang w:val="en-US"/>
+              </w:rPr>
+              <w:t>SERVICE_UNIT_PHONE</w:t>
+            </w:r>
+            <w:r>
+              <w:rPr>
+                <w:sz w:val="24"/>
+                <w:szCs w:val="24"/>
+                <w:lang w:val="en-US"/>
+              </w:rPr>
+              <w:t>}}</w:t>
+            </w:r>
+          </w:p>
+        </w:tc>
+      </w:tr>
+      <w:tr>
+        <w:tc>
+          <w:tcPr>
+            <w:tcW w:w="4820" w:type="dxa"/>
+          </w:tcPr>
+          <w:p>
+            <w:pPr>
+              <w:tabs>
+                <w:tab w:val="left" w:pos="426"/>
+                <w:tab w:val="left" w:pos="851"/>
+                <w:tab w:val="left" w:pos="1276"/>
+                <w:tab w:val="left" w:pos="1701"/>
+                <w:tab w:val="left" w:pos="2127"/>
+                <w:tab w:val="left" w:pos="2552"/>
+                <w:tab w:val="left" w:pos="2977"/>
+                <w:tab w:val="left" w:pos="3402"/>
+                <w:tab w:val="left" w:pos="3828"/>
+                <w:tab w:val="left" w:pos="4253"/>
+                <w:tab w:val="left" w:pos="4678"/>
+                <w:tab w:val="left" w:pos="5103"/>
+                <w:tab w:val="left" w:pos="5529"/>
+                <w:tab w:val="left" w:pos="5954"/>
+                <w:tab w:val="left" w:pos="6379"/>
+                <w:tab w:val="left" w:pos="6804"/>
+                <w:tab w:val="left" w:pos="7230"/>
+                <w:tab w:val="left" w:pos="7655"/>
+                <w:tab w:val="left" w:pos="8080"/>
+                <w:tab w:val="left" w:pos="8505"/>
+              </w:tabs>
+              <w:rPr>
+                <w:b/>
+                <w:bCs/>
+                <w:sz w:val="24"/>
+                <w:szCs w:val="24"/>
+              </w:rPr>
+            </w:pPr>
+            <w:r>
+              <w:rPr>
+                <w:b/>
+                <w:bCs/>
+                <w:sz w:val="24"/>
+                <w:szCs w:val="24"/>
+              </w:rPr>
+              <w:t>ΚΟΙΝ</w:t>
+            </w:r>
+            <w:r>
+              <w:rPr>
+                <w:b/>
+                <w:bCs/>
+                <w:sz w:val="24"/>
+                <w:szCs w:val="24"/>
+                <w:lang w:val="en-US"/>
+              </w:rPr>
+              <w:t>.:</w:t>
+            </w:r>
+          </w:p>
+        </w:tc>
+        <w:tc>
+          <w:tcPr>
+            <w:tcW w:w="4199" w:type="dxa"/>
+          </w:tcPr>
+          <w:p>
+            <w:pPr>
+              <w:tabs>
+                <w:tab w:val="left" w:pos="426"/>
+                <w:tab w:val="left" w:pos="851"/>
+                <w:tab w:val="left" w:pos="1276"/>
+                <w:tab w:val="left" w:pos="1701"/>
+                <w:tab w:val="left" w:pos="2127"/>
+                <w:tab w:val="left" w:pos="2552"/>
+                <w:tab w:val="left" w:pos="2977"/>
+                <w:tab w:val="left" w:pos="3402"/>
+                <w:tab w:val="left" w:pos="3828"/>
+                <w:tab w:val="left" w:pos="4253"/>
+                <w:tab w:val="left" w:pos="4678"/>
+                <w:tab w:val="left" w:pos="5103"/>
+                <w:tab w:val="left" w:pos="5529"/>
+                <w:tab w:val="left" w:pos="5954"/>
+                <w:tab w:val="left" w:pos="6379"/>
+                <w:tab w:val="left" w:pos="6804"/>
+                <w:tab w:val="left" w:pos="7230"/>
+                <w:tab w:val="left" w:pos="7655"/>
+                <w:tab w:val="left" w:pos="8080"/>
+                <w:tab w:val="left" w:pos="8505"/>
+              </w:tabs>
+              <w:rPr>
+                <w:sz w:val="24"/>
+                <w:szCs w:val="24"/>
+                <w:lang w:val="en-US"/>
+              </w:rPr>
+            </w:pPr>
+            <w:r>
+              <w:rPr>
+                <w:sz w:val="24"/>
+                <w:szCs w:val="24"/>
+              </w:rPr>
+              <w:t>Φ</w:t>
+            </w:r>
+            <w:r>
+              <w:rPr>
+                <w:sz w:val="24"/>
+                <w:szCs w:val="24"/>
+                <w:lang w:val="en-US"/>
+              </w:rPr>
+              <w:t>.800/</w:t>
+            </w:r>
+          </w:p>
+        </w:tc>
+      </w:tr>
+      <w:tr>
+        <w:tc>
+          <w:tcPr>
+            <w:tcW w:w="4820" w:type="dxa"/>
+          </w:tcPr>
+          <w:p>
+            <w:pPr>
+              <w:tabs>
+                <w:tab w:val="left" w:pos="426"/>
+                <w:tab w:val="left" w:pos="851"/>
+                <w:tab w:val="left" w:pos="1276"/>
+                <w:tab w:val="left" w:pos="1701"/>
+                <w:tab w:val="left" w:pos="2127"/>
+                <w:tab w:val="left" w:pos="2552"/>
+                <w:tab w:val="left" w:pos="2977"/>
+                <w:tab w:val="left" w:pos="3402"/>
+                <w:tab w:val="left" w:pos="3828"/>
+                <w:tab w:val="left" w:pos="4253"/>
+                <w:tab w:val="left" w:pos="4678"/>
+                <w:tab w:val="left" w:pos="5103"/>
+                <w:tab w:val="left" w:pos="5529"/>
+                <w:tab w:val="left" w:pos="5954"/>
+                <w:tab w:val="left" w:pos="6379"/>
+                <w:tab w:val="left" w:pos="6804"/>
+                <w:tab w:val="left" w:pos="7230"/>
+                <w:tab w:val="left" w:pos="7655"/>
+                <w:tab w:val="left" w:pos="8080"/>
+                <w:tab w:val="left" w:pos="8505"/>
+              </w:tabs>
+              <w:rPr>
+                <w:b/>
+                <w:bCs/>
+                <w:sz w:val="24"/>
+                <w:szCs w:val="24"/>
+              </w:rPr>
+            </w:pPr>
+          </w:p>
+        </w:tc>
+        <w:tc>
+          <w:tcPr>
+            <w:tcW w:w="4199" w:type="dxa"/>
+          </w:tcPr>
+          <w:p>
+            <w:pPr>
+              <w:tabs>
+                <w:tab w:val="left" w:pos="426"/>
+                <w:tab w:val="left" w:pos="851"/>
+                <w:tab w:val="left" w:pos="1276"/>
+                <w:tab w:val="left" w:pos="1701"/>
+                <w:tab w:val="left" w:pos="2127"/>
+                <w:tab w:val="left" w:pos="2552"/>
+                <w:tab w:val="left" w:pos="2977"/>
+                <w:tab w:val="left" w:pos="3402"/>
+                <w:tab w:val="left" w:pos="3828"/>
+                <w:tab w:val="left" w:pos="4253"/>
+                <w:tab w:val="left" w:pos="4678"/>
+                <w:tab w:val="left" w:pos="5103"/>
+                <w:tab w:val="left" w:pos="5529"/>
+                <w:tab w:val="left" w:pos="5954"/>
+                <w:tab w:val="left" w:pos="6379"/>
+                <w:tab w:val="left" w:pos="6804"/>
+                <w:tab w:val="left" w:pos="7230"/>
+                <w:tab w:val="left" w:pos="7655"/>
+                <w:tab w:val="left" w:pos="8080"/>
+                <w:tab w:val="left" w:pos="8505"/>
+              </w:tabs>
+              <w:rPr>
+                <w:sz w:val="24"/>
+                <w:szCs w:val="24"/>
+              </w:rPr>
+            </w:pPr>
+            <w:r>
+              <w:rPr>
+                <w:sz w:val="24"/>
+                <w:szCs w:val="24"/>
+              </w:rPr>
+              <w:t>Σ</w:t>
+            </w:r>
+            <w:r>
+              <w:rPr>
+                <w:sz w:val="24"/>
+                <w:szCs w:val="24"/>
+                <w:lang w:val="en-US"/>
+              </w:rPr>
+              <w:t>.</w:t>
+            </w:r>
+          </w:p>
+        </w:tc>
+      </w:tr>
+      <w:tr>
+        <w:tc>
+          <w:tcPr>
+            <w:tcW w:w="4820" w:type="dxa"/>
+          </w:tcPr>
+          <w:p>
+            <w:pPr>
+              <w:tabs>
+                <w:tab w:val="left" w:pos="426"/>
+                <w:tab w:val="left" w:pos="851"/>
+                <w:tab w:val="left" w:pos="1276"/>
+                <w:tab w:val="left" w:pos="1701"/>
+                <w:tab w:val="left" w:pos="2127"/>
+                <w:tab w:val="left" w:pos="2552"/>
+                <w:tab w:val="left" w:pos="2977"/>
+                <w:tab w:val="left" w:pos="3402"/>
+                <w:tab w:val="left" w:pos="3828"/>
+                <w:tab w:val="left" w:pos="4253"/>
+                <w:tab w:val="left" w:pos="4678"/>
+                <w:tab w:val="left" w:pos="5103"/>
+                <w:tab w:val="left" w:pos="5529"/>
+                <w:tab w:val="left" w:pos="5954"/>
+                <w:tab w:val="left" w:pos="6379"/>
+                <w:tab w:val="left" w:pos="6804"/>
+                <w:tab w:val="left" w:pos="7230"/>
+                <w:tab w:val="left" w:pos="7655"/>
+                <w:tab w:val="left" w:pos="8080"/>
+                <w:tab w:val="left" w:pos="8505"/>
+              </w:tabs>
+              <w:rPr>
+                <w:b/>
+                <w:bCs/>
+                <w:sz w:val="24"/>
+                <w:szCs w:val="24"/>
+              </w:rPr>
+            </w:pPr>
+          </w:p>
+        </w:tc>
+        <w:tc>
+          <w:tcPr>
+            <w:tcW w:w="4199" w:type="dxa"/>
+          </w:tcPr>
+          <w:p>
+            <w:pPr>
+              <w:tabs>
+                <w:tab w:val="left" w:pos="426"/>
+                <w:tab w:val="left" w:pos="851"/>
+                <w:tab w:val="left" w:pos="1276"/>
+                <w:tab w:val="left" w:pos="1701"/>
+                <w:tab w:val="left" w:pos="2127"/>
+                <w:tab w:val="left" w:pos="2552"/>
+                <w:tab w:val="left" w:pos="2977"/>
+                <w:tab w:val="left" w:pos="3402"/>
+                <w:tab w:val="left" w:pos="3828"/>
+                <w:tab w:val="left" w:pos="4253"/>
+                <w:tab w:val="left" w:pos="4678"/>
+                <w:tab w:val="left" w:pos="5103"/>
+                <w:tab w:val="left" w:pos="5529"/>
+                <w:tab w:val="left" w:pos="5954"/>
+                <w:tab w:val="left" w:pos="6379"/>
+                <w:tab w:val="left" w:pos="6804"/>
+                <w:tab w:val="left" w:pos="7230"/>
+                <w:tab w:val="left" w:pos="7655"/>
+                <w:tab w:val="left" w:pos="8080"/>
+                <w:tab w:val="left" w:pos="8505"/>
+              </w:tabs>
+              <w:rPr>
+                <w:sz w:val="24"/>
+                <w:szCs w:val="24"/>
+                <w:lang w:val="en-US"/>
+              </w:rPr>
+            </w:pPr>
+            <w:r>
+              <w:rPr>
+                <w:sz w:val="24"/>
+                <w:szCs w:val="24"/>
+                <w:lang w:val="en-US"/>
+              </w:rPr>
+              <w:t>{{</w:t>
+            </w:r>
+            <w:r>
+              <w:rPr>
+                <w:sz w:val="24"/>
+                <w:szCs w:val="24"/>
+                <w:lang w:val="en-US"/>
+              </w:rPr>
+              <w:t>SERVICE_UNIT_REGION}}, {{SHORT_DATE}}</w:t>
+            </w:r>
+          </w:p>
+        </w:tc>
+      </w:tr>
+    </w:tbl>
     <w:p>
       <w:pPr>
         <w:tabs>
@@ -1142,17 +728,23 @@
           <w:tab w:val="left" w:pos="8505"/>
         </w:tabs>
         <w:spacing w:before="240"/>
-        <w:rPr>
-          <w:sz w:val="24"/>
-          <w:szCs w:val="24"/>
+        <w:jc w:val="center"/>
+        <w:rPr>
+          <w:b/>
+          <w:bCs/>
+          <w:sz w:val="24"/>
+          <w:szCs w:val="24"/>
+          <w:lang w:val="el-GR"/>
         </w:rPr>
       </w:pPr>
       <w:r>
         <w:rPr>
-          <w:sz w:val="24"/>
-          <w:szCs w:val="24"/>
-        </w:rPr>
-        <w:t xml:space="preserve"> </w:t>
+          <w:b/>
+          <w:bCs/>
+          <w:sz w:val="24"/>
+          <w:szCs w:val="24"/>
+        </w:rPr>
+        <w:t>ΑΠΟΦΑΣΗ</w:t>
       </w:r>
     </w:p>
     <w:p>
@@ -1182,12 +774,19 @@
         <w:spacing w:before="240"/>
         <w:jc w:val="center"/>
         <w:rPr>
+          <w:sz w:val="24"/>
+          <w:szCs w:val="24"/>
+        </w:rPr>
+      </w:pPr>
+      <w:r>
+        <w:rPr>
           <w:b/>
           <w:bCs/>
           <w:sz w:val="24"/>
           <w:szCs w:val="24"/>
         </w:rPr>
-      </w:pPr>
+        <w:t xml:space="preserve">«Ανάθεσης για την </w:t>
+      </w:r>
       <w:r>
         <w:rPr>
           <w:b/>
@@ -1195,7 +794,782 @@
           <w:sz w:val="24"/>
           <w:szCs w:val="24"/>
         </w:rPr>
-        <w:t>ΑΠΟΦΑΣΗ</w:t>
+        <w:t>{{PROC_TYPE}}</w:t>
+      </w:r>
+      <w:r>
+        <w:rPr>
+          <w:b/>
+          <w:bCs/>
+          <w:sz w:val="24"/>
+          <w:szCs w:val="24"/>
+        </w:rPr>
+        <w:t>»</w:t>
+      </w:r>
+    </w:p>
+    <w:p>
+      <w:pPr>
+        <w:tabs>
+          <w:tab w:val="left" w:pos="426"/>
+          <w:tab w:val="left" w:pos="851"/>
+          <w:tab w:val="left" w:pos="1276"/>
+          <w:tab w:val="left" w:pos="1701"/>
+          <w:tab w:val="left" w:pos="2127"/>
+          <w:tab w:val="left" w:pos="2552"/>
+          <w:tab w:val="left" w:pos="2977"/>
+          <w:tab w:val="left" w:pos="3402"/>
+          <w:tab w:val="left" w:pos="3828"/>
+          <w:tab w:val="left" w:pos="4253"/>
+          <w:tab w:val="left" w:pos="4678"/>
+          <w:tab w:val="left" w:pos="5103"/>
+          <w:tab w:val="left" w:pos="5529"/>
+          <w:tab w:val="left" w:pos="5954"/>
+          <w:tab w:val="left" w:pos="6379"/>
+          <w:tab w:val="left" w:pos="6804"/>
+          <w:tab w:val="left" w:pos="7230"/>
+          <w:tab w:val="left" w:pos="7655"/>
+          <w:tab w:val="left" w:pos="8080"/>
+          <w:tab w:val="left" w:pos="8505"/>
+        </w:tabs>
+        <w:spacing w:before="240"/>
+        <w:jc w:val="both"/>
+        <w:rPr>
+          <w:sz w:val="24"/>
+          <w:szCs w:val="24"/>
+        </w:rPr>
+      </w:pPr>
+      <w:r>
+        <w:rPr>
+          <w:sz w:val="24"/>
+          <w:szCs w:val="24"/>
+        </w:rPr>
+        <w:t>Έχοντας υπόψη:</w:t>
+      </w:r>
+      <w:r>
+        <w:rPr>
+          <w:sz w:val="24"/>
+          <w:szCs w:val="24"/>
+        </w:rPr>
+        <w:tab/>
+      </w:r>
+    </w:p>
+    <w:p>
+      <w:pPr>
+        <w:tabs>
+          <w:tab w:val="left" w:pos="426"/>
+          <w:tab w:val="left" w:pos="851"/>
+          <w:tab w:val="left" w:pos="1276"/>
+          <w:tab w:val="left" w:pos="1701"/>
+          <w:tab w:val="left" w:pos="2127"/>
+          <w:tab w:val="left" w:pos="2552"/>
+          <w:tab w:val="left" w:pos="2977"/>
+          <w:tab w:val="left" w:pos="3402"/>
+          <w:tab w:val="left" w:pos="3828"/>
+          <w:tab w:val="left" w:pos="4253"/>
+          <w:tab w:val="left" w:pos="4678"/>
+          <w:tab w:val="left" w:pos="5103"/>
+          <w:tab w:val="left" w:pos="5529"/>
+          <w:tab w:val="left" w:pos="5954"/>
+          <w:tab w:val="left" w:pos="6379"/>
+          <w:tab w:val="left" w:pos="6804"/>
+          <w:tab w:val="left" w:pos="7230"/>
+          <w:tab w:val="left" w:pos="7655"/>
+          <w:tab w:val="left" w:pos="8080"/>
+          <w:tab w:val="left" w:pos="8505"/>
+        </w:tabs>
+        <w:spacing w:before="240"/>
+        <w:jc w:val="both"/>
+        <w:rPr>
+          <w:sz w:val="24"/>
+          <w:szCs w:val="24"/>
+        </w:rPr>
+      </w:pPr>
+      <w:r>
+        <w:rPr>
+          <w:sz w:val="24"/>
+          <w:szCs w:val="24"/>
+          <w:lang w:val="el-GR"/>
+        </w:rPr>
+        <w:tab/>
+        <w:t>α.</w:t>
+      </w:r>
+      <w:r>
+        <w:rPr>
+          <w:sz w:val="24"/>
+          <w:szCs w:val="24"/>
+          <w:lang w:val="el-GR"/>
+        </w:rPr>
+        <w:tab/>
+      </w:r>
+      <w:r>
+        <w:rPr>
+          <w:sz w:val="24"/>
+          <w:szCs w:val="24"/>
+        </w:rPr>
+        <w:t>Το Νομοθετικό Διάταγμα 721/1970 «Περί Οικονομικής Μερίμνης και Λογιστικού των   Ε.Δ», (ΦΕΚ 251Α/70).</w:t>
+      </w:r>
+    </w:p>
+    <w:p>
+      <w:pPr>
+        <w:tabs>
+          <w:tab w:val="left" w:pos="426"/>
+          <w:tab w:val="left" w:pos="851"/>
+          <w:tab w:val="left" w:pos="1276"/>
+          <w:tab w:val="left" w:pos="1701"/>
+          <w:tab w:val="left" w:pos="2127"/>
+          <w:tab w:val="left" w:pos="2552"/>
+          <w:tab w:val="left" w:pos="2977"/>
+          <w:tab w:val="left" w:pos="3402"/>
+          <w:tab w:val="left" w:pos="3828"/>
+          <w:tab w:val="left" w:pos="4253"/>
+          <w:tab w:val="left" w:pos="4678"/>
+          <w:tab w:val="left" w:pos="5103"/>
+          <w:tab w:val="left" w:pos="5529"/>
+          <w:tab w:val="left" w:pos="5954"/>
+          <w:tab w:val="left" w:pos="6379"/>
+          <w:tab w:val="left" w:pos="6804"/>
+          <w:tab w:val="left" w:pos="7230"/>
+          <w:tab w:val="left" w:pos="7655"/>
+          <w:tab w:val="left" w:pos="8080"/>
+          <w:tab w:val="left" w:pos="8505"/>
+        </w:tabs>
+        <w:spacing w:before="240"/>
+        <w:jc w:val="both"/>
+        <w:rPr>
+          <w:sz w:val="24"/>
+          <w:szCs w:val="24"/>
+        </w:rPr>
+      </w:pPr>
+      <w:r>
+        <w:rPr>
+          <w:sz w:val="24"/>
+          <w:szCs w:val="24"/>
+          <w:lang w:val="el-GR"/>
+        </w:rPr>
+        <w:tab/>
+      </w:r>
+      <w:r>
+        <w:rPr>
+          <w:sz w:val="24"/>
+          <w:szCs w:val="24"/>
+        </w:rPr>
+        <w:t>β.</w:t>
+      </w:r>
+      <w:r>
+        <w:rPr>
+          <w:sz w:val="24"/>
+          <w:szCs w:val="24"/>
+          <w:lang w:val="el-GR"/>
+        </w:rPr>
+        <w:tab/>
+      </w:r>
+      <w:r>
+        <w:rPr>
+          <w:sz w:val="24"/>
+          <w:szCs w:val="24"/>
+        </w:rPr>
+        <w:t>Την απόφαση ΥΦΕΘΑ Φ.800/133/134893/07 (ΦΕΚ 2300//3-12-07) «Περί Μεταβιβάσεως Οικονομικής Εξουσίας σε Κεντρικά και Περιφερειακά Όργανα  της Διοίκησης  των ΕΔ και σε προϊσταμένους των Υπηρεσιών που εξαρτώνται από αυτές, όπως αυτή τροποποιήθηκε με την απόφαση ΥΦΕΘΑ Φ.800/88/131798/Σ2063/25-7-08(ΦΕΚ Β΄ 1753 )».</w:t>
+      </w:r>
+    </w:p>
+    <w:p>
+      <w:pPr>
+        <w:tabs>
+          <w:tab w:val="left" w:pos="426"/>
+          <w:tab w:val="left" w:pos="851"/>
+          <w:tab w:val="left" w:pos="1276"/>
+          <w:tab w:val="left" w:pos="1701"/>
+          <w:tab w:val="left" w:pos="2127"/>
+          <w:tab w:val="left" w:pos="2552"/>
+          <w:tab w:val="left" w:pos="2977"/>
+          <w:tab w:val="left" w:pos="3402"/>
+          <w:tab w:val="left" w:pos="3828"/>
+          <w:tab w:val="left" w:pos="4253"/>
+          <w:tab w:val="left" w:pos="4678"/>
+          <w:tab w:val="left" w:pos="5103"/>
+          <w:tab w:val="left" w:pos="5529"/>
+          <w:tab w:val="left" w:pos="5954"/>
+          <w:tab w:val="left" w:pos="6379"/>
+          <w:tab w:val="left" w:pos="6804"/>
+          <w:tab w:val="left" w:pos="7230"/>
+          <w:tab w:val="left" w:pos="7655"/>
+          <w:tab w:val="left" w:pos="8080"/>
+          <w:tab w:val="left" w:pos="8505"/>
+        </w:tabs>
+        <w:spacing w:before="240"/>
+        <w:jc w:val="both"/>
+        <w:rPr>
+          <w:sz w:val="24"/>
+          <w:szCs w:val="24"/>
+        </w:rPr>
+      </w:pPr>
+      <w:r>
+        <w:rPr>
+          <w:rFonts w:eastAsia="Arial Unicode MS"/>
+          <w:sz w:val="24"/>
+          <w:szCs w:val="24"/>
+          <w:lang w:val="el-GR"/>
+        </w:rPr>
+        <w:tab/>
+      </w:r>
+      <w:r>
+        <w:rPr>
+          <w:rFonts w:eastAsia="Arial Unicode MS"/>
+          <w:sz w:val="24"/>
+          <w:szCs w:val="24"/>
+        </w:rPr>
+        <w:t>γ.</w:t>
+      </w:r>
+      <w:r>
+        <w:rPr>
+          <w:rFonts w:eastAsia="Arial Unicode MS"/>
+          <w:sz w:val="24"/>
+          <w:szCs w:val="24"/>
+          <w:lang w:val="el-GR"/>
+        </w:rPr>
+        <w:tab/>
+      </w:r>
+      <w:r>
+        <w:rPr>
+          <w:rFonts w:eastAsia="Arial Unicode MS"/>
+          <w:sz w:val="24"/>
+          <w:szCs w:val="24"/>
+        </w:rPr>
+        <w:t>Το Ν.4270/14 (Α’ 174) «Περί Αρχών δημοσιονομικής διαχείρισης και εποπτείας (ενσωμάτωση της Οδηγίας 2011/85/ΕΕ) − δημόσιο λογιστικό και άλλες διατάξεις.».</w:t>
+      </w:r>
+    </w:p>
+    <w:p>
+      <w:pPr>
+        <w:tabs>
+          <w:tab w:val="left" w:pos="426"/>
+          <w:tab w:val="left" w:pos="851"/>
+          <w:tab w:val="left" w:pos="1276"/>
+          <w:tab w:val="left" w:pos="1701"/>
+          <w:tab w:val="left" w:pos="2127"/>
+          <w:tab w:val="left" w:pos="2552"/>
+          <w:tab w:val="left" w:pos="2977"/>
+          <w:tab w:val="left" w:pos="3402"/>
+          <w:tab w:val="left" w:pos="3828"/>
+          <w:tab w:val="left" w:pos="4253"/>
+          <w:tab w:val="left" w:pos="4678"/>
+          <w:tab w:val="left" w:pos="5103"/>
+          <w:tab w:val="left" w:pos="5529"/>
+          <w:tab w:val="left" w:pos="5954"/>
+          <w:tab w:val="left" w:pos="6379"/>
+          <w:tab w:val="left" w:pos="6804"/>
+          <w:tab w:val="left" w:pos="7230"/>
+          <w:tab w:val="left" w:pos="7655"/>
+          <w:tab w:val="left" w:pos="8080"/>
+          <w:tab w:val="left" w:pos="8505"/>
+        </w:tabs>
+        <w:spacing w:before="240"/>
+        <w:jc w:val="both"/>
+        <w:rPr>
+          <w:sz w:val="24"/>
+          <w:szCs w:val="24"/>
+        </w:rPr>
+      </w:pPr>
+      <w:r>
+        <w:rPr>
+          <w:sz w:val="24"/>
+          <w:szCs w:val="24"/>
+          <w:lang w:val="el-GR"/>
+        </w:rPr>
+        <w:tab/>
+      </w:r>
+      <w:r>
+        <w:rPr>
+          <w:sz w:val="24"/>
+          <w:szCs w:val="24"/>
+        </w:rPr>
+        <w:t>δ.</w:t>
+      </w:r>
+      <w:r>
+        <w:rPr>
+          <w:sz w:val="24"/>
+          <w:szCs w:val="24"/>
+          <w:lang w:val="el-GR"/>
+        </w:rPr>
+        <w:tab/>
+      </w:r>
+      <w:r>
+        <w:rPr>
+          <w:sz w:val="24"/>
+          <w:szCs w:val="24"/>
+        </w:rPr>
+        <w:t>Τον Ν.4412/16 (Α’147) «Περί Δημοσίων Συμβάσεων Έργων, Προμηθειών και Υπηρεσιών (προσαρμογή στις Οδηγίες 2014/24/ΕΕ και 2014/25/ΕΕ)», όπως τροποποιήθηκε και ισχύει.</w:t>
+      </w:r>
+    </w:p>
+    <w:p>
+      <w:pPr>
+        <w:tabs>
+          <w:tab w:val="left" w:pos="426"/>
+          <w:tab w:val="left" w:pos="851"/>
+          <w:tab w:val="left" w:pos="1276"/>
+          <w:tab w:val="left" w:pos="1701"/>
+          <w:tab w:val="left" w:pos="2127"/>
+          <w:tab w:val="left" w:pos="2552"/>
+          <w:tab w:val="left" w:pos="2977"/>
+          <w:tab w:val="left" w:pos="3402"/>
+          <w:tab w:val="left" w:pos="3828"/>
+          <w:tab w:val="left" w:pos="4253"/>
+          <w:tab w:val="left" w:pos="4678"/>
+          <w:tab w:val="left" w:pos="5103"/>
+          <w:tab w:val="left" w:pos="5529"/>
+          <w:tab w:val="left" w:pos="5954"/>
+          <w:tab w:val="left" w:pos="6379"/>
+          <w:tab w:val="left" w:pos="6804"/>
+          <w:tab w:val="left" w:pos="7230"/>
+          <w:tab w:val="left" w:pos="7655"/>
+          <w:tab w:val="left" w:pos="8080"/>
+          <w:tab w:val="left" w:pos="8505"/>
+        </w:tabs>
+        <w:spacing w:before="240"/>
+        <w:jc w:val="both"/>
+        <w:rPr>
+          <w:sz w:val="24"/>
+          <w:szCs w:val="24"/>
+          <w:lang w:val="el-GR"/>
+        </w:rPr>
+      </w:pPr>
+      <w:r>
+        <w:rPr>
+          <w:sz w:val="24"/>
+          <w:szCs w:val="24"/>
+          <w:lang w:val="el-GR"/>
+        </w:rPr>
+        <w:tab/>
+      </w:r>
+      <w:r>
+        <w:rPr>
+          <w:sz w:val="24"/>
+          <w:szCs w:val="24"/>
+        </w:rPr>
+        <w:t>ε.</w:t>
+      </w:r>
+      <w:r>
+        <w:rPr>
+          <w:sz w:val="24"/>
+          <w:szCs w:val="24"/>
+          <w:lang w:val="el-GR"/>
+        </w:rPr>
+        <w:tab/>
+        <w:t xml:space="preserve">Την ΑΑΥ με αριθμό </w:t>
+      </w:r>
+      <w:r>
+        <w:rPr>
+          <w:sz w:val="24"/>
+          <w:szCs w:val="24"/>
+          <w:lang w:val="el-GR"/>
+        </w:rPr>
+        <w:t>{{</w:t>
+      </w:r>
+      <w:r>
+        <w:rPr>
+          <w:sz w:val="24"/>
+          <w:szCs w:val="24"/>
+          <w:lang w:val="en-US"/>
+        </w:rPr>
+        <w:t>procurement</w:t>
+      </w:r>
+      <w:r>
+        <w:rPr>
+          <w:sz w:val="24"/>
+          <w:szCs w:val="24"/>
+          <w:lang w:val="el-GR"/>
+        </w:rPr>
+        <w:t>.</w:t>
+      </w:r>
+      <w:proofErr w:type="spellStart"/>
+      <w:r>
+        <w:rPr>
+          <w:sz w:val="24"/>
+          <w:szCs w:val="24"/>
+          <w:lang w:val="en-US"/>
+        </w:rPr>
+        <w:t>aay</w:t>
+      </w:r>
+      <w:proofErr w:type="spellEnd"/>
+      <w:r>
+        <w:rPr>
+          <w:sz w:val="24"/>
+          <w:szCs w:val="24"/>
+          <w:lang w:val="el-GR"/>
+        </w:rPr>
+        <w:t>}}</w:t>
+      </w:r>
+      <w:r>
+        <w:rPr>
+          <w:sz w:val="24"/>
+          <w:szCs w:val="24"/>
+          <w:lang w:val="el-GR"/>
+        </w:rPr>
+        <w:t xml:space="preserve"> και ΑΔΑΜ </w:t>
+      </w:r>
+      <w:r>
+        <w:rPr>
+          <w:sz w:val="24"/>
+          <w:szCs w:val="24"/>
+          <w:lang w:val="el-GR"/>
+        </w:rPr>
+        <w:t>{{</w:t>
+      </w:r>
+      <w:r>
+        <w:rPr>
+          <w:sz w:val="24"/>
+          <w:szCs w:val="24"/>
+          <w:lang w:val="en-US"/>
+        </w:rPr>
+        <w:t>procurement</w:t>
+      </w:r>
+      <w:r>
+        <w:rPr>
+          <w:sz w:val="24"/>
+          <w:szCs w:val="24"/>
+          <w:lang w:val="el-GR"/>
+        </w:rPr>
+        <w:t>.</w:t>
+      </w:r>
+      <w:proofErr w:type="spellStart"/>
+      <w:r>
+        <w:rPr>
+          <w:sz w:val="24"/>
+          <w:szCs w:val="24"/>
+          <w:lang w:val="en-US"/>
+        </w:rPr>
+        <w:t>adam</w:t>
+      </w:r>
+      <w:proofErr w:type="spellEnd"/>
+      <w:r>
+        <w:rPr>
+          <w:sz w:val="24"/>
+          <w:szCs w:val="24"/>
+          <w:lang w:val="el-GR"/>
+        </w:rPr>
+        <w:t>_</w:t>
+      </w:r>
+      <w:proofErr w:type="spellStart"/>
+      <w:r>
+        <w:rPr>
+          <w:sz w:val="24"/>
+          <w:szCs w:val="24"/>
+          <w:lang w:val="en-US"/>
+        </w:rPr>
+        <w:t>aay</w:t>
+      </w:r>
+      <w:proofErr w:type="spellEnd"/>
+      <w:r>
+        <w:rPr>
+          <w:sz w:val="24"/>
+          <w:szCs w:val="24"/>
+          <w:lang w:val="el-GR"/>
+        </w:rPr>
+        <w:t>}}</w:t>
+      </w:r>
+      <w:r>
+        <w:rPr>
+          <w:sz w:val="24"/>
+          <w:szCs w:val="24"/>
+          <w:lang w:val="el-GR"/>
+        </w:rPr>
+        <w:t>.</w:t>
+      </w:r>
+    </w:p>
+    <w:p>
+      <w:pPr>
+        <w:tabs>
+          <w:tab w:val="left" w:pos="426"/>
+          <w:tab w:val="left" w:pos="851"/>
+          <w:tab w:val="left" w:pos="1276"/>
+          <w:tab w:val="left" w:pos="1701"/>
+          <w:tab w:val="left" w:pos="2127"/>
+          <w:tab w:val="left" w:pos="2552"/>
+          <w:tab w:val="left" w:pos="2977"/>
+          <w:tab w:val="left" w:pos="3402"/>
+          <w:tab w:val="left" w:pos="3828"/>
+          <w:tab w:val="left" w:pos="4253"/>
+          <w:tab w:val="left" w:pos="4678"/>
+          <w:tab w:val="left" w:pos="5103"/>
+          <w:tab w:val="left" w:pos="5529"/>
+          <w:tab w:val="left" w:pos="5954"/>
+          <w:tab w:val="left" w:pos="6379"/>
+          <w:tab w:val="left" w:pos="6804"/>
+          <w:tab w:val="left" w:pos="7230"/>
+          <w:tab w:val="left" w:pos="7655"/>
+          <w:tab w:val="left" w:pos="8080"/>
+          <w:tab w:val="left" w:pos="8505"/>
+        </w:tabs>
+        <w:spacing w:before="240"/>
+        <w:jc w:val="both"/>
+        <w:rPr>
+          <w:sz w:val="24"/>
+          <w:szCs w:val="24"/>
+          <w:lang w:val="el-GR"/>
+        </w:rPr>
+      </w:pPr>
+      <w:r>
+        <w:rPr>
+          <w:sz w:val="24"/>
+          <w:szCs w:val="24"/>
+          <w:lang w:val="el-GR"/>
+        </w:rPr>
+        <w:tab/>
+        <w:t>στ.</w:t>
+      </w:r>
+      <w:r>
+        <w:rPr>
+          <w:sz w:val="24"/>
+          <w:szCs w:val="24"/>
+          <w:lang w:val="el-GR"/>
+        </w:rPr>
+        <w:tab/>
+        <w:t xml:space="preserve">Την προσφορά του προμηθευτή </w:t>
+      </w:r>
+      <w:r>
+        <w:rPr>
+          <w:sz w:val="24"/>
+          <w:szCs w:val="24"/>
+        </w:rPr>
+        <w:t>{{</w:t>
+      </w:r>
+      <w:r>
+        <w:rPr>
+          <w:sz w:val="24"/>
+          <w:szCs w:val="24"/>
+          <w:lang w:val="en-US"/>
+        </w:rPr>
+        <w:t>supplier</w:t>
+      </w:r>
+      <w:r>
+        <w:rPr>
+          <w:sz w:val="24"/>
+          <w:szCs w:val="24"/>
+          <w:lang w:val="el-GR"/>
+        </w:rPr>
+        <w:t>.</w:t>
+      </w:r>
+      <w:r>
+        <w:rPr>
+          <w:sz w:val="24"/>
+          <w:szCs w:val="24"/>
+          <w:lang w:val="en-US"/>
+        </w:rPr>
+        <w:t>name</w:t>
+      </w:r>
+      <w:r>
+        <w:rPr>
+          <w:sz w:val="24"/>
+          <w:szCs w:val="24"/>
+        </w:rPr>
+        <w:t>}}</w:t>
+      </w:r>
+      <w:r>
+        <w:rPr>
+          <w:sz w:val="24"/>
+          <w:szCs w:val="24"/>
+          <w:lang w:val="el-GR"/>
+        </w:rPr>
+        <w:t xml:space="preserve"> </w:t>
+      </w:r>
+      <w:r>
+        <w:rPr>
+          <w:sz w:val="24"/>
+          <w:szCs w:val="24"/>
+          <w:lang w:val="el-GR"/>
+        </w:rPr>
+        <w:t>με ΑΦΜ</w:t>
+      </w:r>
+      <w:r>
+        <w:rPr>
+          <w:sz w:val="24"/>
+          <w:szCs w:val="24"/>
+          <w:lang w:val="el-GR"/>
+        </w:rPr>
+        <w:t>:</w:t>
+      </w:r>
+      <w:r>
+        <w:rPr>
+          <w:sz w:val="24"/>
+          <w:szCs w:val="24"/>
+        </w:rPr>
+        <w:t>{{</w:t>
+      </w:r>
+      <w:r>
+        <w:rPr>
+          <w:sz w:val="24"/>
+          <w:szCs w:val="24"/>
+          <w:lang w:val="en-US"/>
+        </w:rPr>
+        <w:t>supplier</w:t>
+      </w:r>
+      <w:r>
+        <w:rPr>
+          <w:sz w:val="24"/>
+          <w:szCs w:val="24"/>
+          <w:lang w:val="el-GR"/>
+        </w:rPr>
+        <w:t>.</w:t>
+      </w:r>
+      <w:proofErr w:type="spellStart"/>
+      <w:r>
+        <w:rPr>
+          <w:sz w:val="24"/>
+          <w:szCs w:val="24"/>
+          <w:lang w:val="en-US"/>
+        </w:rPr>
+        <w:t>afm</w:t>
+      </w:r>
+      <w:proofErr w:type="spellEnd"/>
+      <w:r>
+        <w:rPr>
+          <w:sz w:val="24"/>
+          <w:szCs w:val="24"/>
+        </w:rPr>
+        <w:t>}}</w:t>
+      </w:r>
+      <w:r>
+        <w:rPr>
+          <w:sz w:val="24"/>
+          <w:szCs w:val="24"/>
+          <w:lang w:val="el-GR"/>
+        </w:rPr>
+        <w:t>.</w:t>
+      </w:r>
+    </w:p>
+    <w:p>
+      <w:pPr>
+        <w:tabs>
+          <w:tab w:val="left" w:pos="426"/>
+          <w:tab w:val="left" w:pos="851"/>
+          <w:tab w:val="left" w:pos="1276"/>
+          <w:tab w:val="left" w:pos="1701"/>
+          <w:tab w:val="left" w:pos="2127"/>
+          <w:tab w:val="left" w:pos="2552"/>
+          <w:tab w:val="left" w:pos="2977"/>
+          <w:tab w:val="left" w:pos="3402"/>
+          <w:tab w:val="left" w:pos="3828"/>
+          <w:tab w:val="left" w:pos="4253"/>
+          <w:tab w:val="left" w:pos="4678"/>
+          <w:tab w:val="left" w:pos="5103"/>
+          <w:tab w:val="left" w:pos="5529"/>
+          <w:tab w:val="left" w:pos="5954"/>
+          <w:tab w:val="left" w:pos="6379"/>
+          <w:tab w:val="left" w:pos="6804"/>
+          <w:tab w:val="left" w:pos="7230"/>
+          <w:tab w:val="left" w:pos="7655"/>
+          <w:tab w:val="left" w:pos="8080"/>
+          <w:tab w:val="left" w:pos="8505"/>
+        </w:tabs>
+        <w:spacing w:before="240"/>
+        <w:jc w:val="both"/>
+        <w:rPr>
+          <w:sz w:val="24"/>
+          <w:szCs w:val="24"/>
+          <w:lang w:val="el-GR"/>
+        </w:rPr>
+      </w:pPr>
+      <w:r>
+        <w:rPr>
+          <w:sz w:val="24"/>
+          <w:szCs w:val="24"/>
+          <w:lang w:val="el-GR"/>
+        </w:rPr>
+        <w:tab/>
+        <w:t>ζ</w:t>
+      </w:r>
+      <w:r>
+        <w:rPr>
+          <w:sz w:val="24"/>
+          <w:szCs w:val="24"/>
+        </w:rPr>
+        <w:t>.</w:t>
+      </w:r>
+      <w:r>
+        <w:rPr>
+          <w:sz w:val="24"/>
+          <w:szCs w:val="24"/>
+          <w:lang w:val="el-GR"/>
+        </w:rPr>
+        <w:tab/>
+      </w:r>
+      <w:r>
+        <w:rPr>
+          <w:sz w:val="24"/>
+          <w:szCs w:val="24"/>
+          <w:highlight w:val="yellow"/>
+          <w:lang w:val="el-GR"/>
+        </w:rPr>
+        <w:t xml:space="preserve">Την δέσμευση πίστωση με </w:t>
+      </w:r>
+      <w:r>
+        <w:rPr>
+          <w:sz w:val="24"/>
+          <w:szCs w:val="24"/>
+          <w:highlight w:val="yellow"/>
+          <w:lang w:val="el-GR"/>
+        </w:rPr>
+        <w:t>{{</w:t>
+      </w:r>
+      <w:r>
+        <w:rPr>
+          <w:sz w:val="24"/>
+          <w:szCs w:val="24"/>
+          <w:highlight w:val="yellow"/>
+          <w:lang w:val="en-US"/>
+        </w:rPr>
+        <w:t>procurement</w:t>
+      </w:r>
+      <w:r>
+        <w:rPr>
+          <w:sz w:val="24"/>
+          <w:szCs w:val="24"/>
+          <w:highlight w:val="yellow"/>
+          <w:lang w:val="el-GR"/>
+        </w:rPr>
+        <w:t>.identity_prosklisis}}</w:t>
+      </w:r>
+      <w:r>
+        <w:rPr>
+          <w:sz w:val="24"/>
+          <w:szCs w:val="24"/>
+          <w:highlight w:val="yellow"/>
+          <w:lang w:val="el-GR"/>
+        </w:rPr>
+        <w:t xml:space="preserve"> και ΑΔΑΜ: </w:t>
+      </w:r>
+      <w:r>
+        <w:rPr>
+          <w:sz w:val="24"/>
+          <w:szCs w:val="24"/>
+          <w:highlight w:val="yellow"/>
+          <w:lang w:val="el-GR"/>
+        </w:rPr>
+        <w:t xml:space="preserve">{{ </w:t>
+      </w:r>
+      <w:r>
+        <w:rPr>
+          <w:sz w:val="24"/>
+          <w:szCs w:val="24"/>
+          <w:highlight w:val="yellow"/>
+          <w:lang w:val="en-US"/>
+        </w:rPr>
+        <w:t>procurement</w:t>
+      </w:r>
+      <w:r>
+        <w:rPr>
+          <w:sz w:val="24"/>
+          <w:szCs w:val="24"/>
+          <w:highlight w:val="yellow"/>
+          <w:lang w:val="el-GR"/>
+        </w:rPr>
+        <w:t>.adam_prosklisis}}</w:t>
+      </w:r>
+      <w:r>
+        <w:rPr>
+          <w:sz w:val="24"/>
+          <w:szCs w:val="24"/>
+          <w:highlight w:val="yellow"/>
+          <w:lang w:val="el-GR"/>
+        </w:rPr>
+        <w:t>.</w:t>
       </w:r>
     </w:p>
     <w:p>
@@ -1236,25 +1610,7 @@
           <w:sz w:val="24"/>
           <w:szCs w:val="24"/>
         </w:rPr>
-        <w:t xml:space="preserve">«Ανάθεσης για την </w:t>
-      </w:r>
-      <w:r>
-        <w:rPr>
-          <w:b/>
-          <w:bCs/>
-          <w:sz w:val="24"/>
-          <w:szCs w:val="24"/>
-        </w:rPr>
-        <w:t>{{PROC_TYPE}}</w:t>
-      </w:r>
-      <w:r>
-        <w:rPr>
-          <w:b/>
-          <w:bCs/>
-          <w:sz w:val="24"/>
-          <w:szCs w:val="24"/>
-        </w:rPr>
-        <w:t>»</w:t>
+        <w:t>ΑΠΟΦΑΣΙΖΟΥΜΕ</w:t>
       </w:r>
     </w:p>
     <w:p>
@@ -1286,6 +1642,7 @@
         <w:rPr>
           <w:sz w:val="24"/>
           <w:szCs w:val="24"/>
+          <w:lang w:val="el-GR"/>
         </w:rPr>
       </w:pPr>
       <w:r>
@@ -1293,14 +1650,134 @@
           <w:sz w:val="24"/>
           <w:szCs w:val="24"/>
         </w:rPr>
-        <w:t>Έχοντας υπόψη:</w:t>
-      </w:r>
-      <w:r>
-        <w:rPr>
-          <w:sz w:val="24"/>
-          <w:szCs w:val="24"/>
-        </w:rPr>
         <w:tab/>
+        <w:t>1.</w:t>
+      </w:r>
+      <w:r>
+        <w:rPr>
+          <w:sz w:val="24"/>
+          <w:szCs w:val="24"/>
+          <w:lang w:val="el-GR"/>
+        </w:rPr>
+        <w:tab/>
+      </w:r>
+      <w:r>
+        <w:rPr>
+          <w:sz w:val="24"/>
+          <w:szCs w:val="24"/>
+        </w:rPr>
+        <w:t>Την ανάθεση στον οικονομικό φορέα «</w:t>
+      </w:r>
+      <w:r>
+        <w:rPr>
+          <w:sz w:val="24"/>
+          <w:szCs w:val="24"/>
+        </w:rPr>
+        <w:t>{{WINNER_SUPPLIER_LINE}}</w:t>
+      </w:r>
+      <w:r>
+        <w:rPr>
+          <w:sz w:val="24"/>
+          <w:szCs w:val="24"/>
+          <w:lang w:val="el-GR"/>
+        </w:rPr>
+        <w:t xml:space="preserve"> </w:t>
+      </w:r>
+      <w:r>
+        <w:rPr>
+          <w:sz w:val="24"/>
+          <w:szCs w:val="24"/>
+        </w:rPr>
+        <w:t xml:space="preserve">για </w:t>
+      </w:r>
+      <w:r>
+        <w:rPr>
+          <w:sz w:val="24"/>
+          <w:szCs w:val="24"/>
+          <w:lang w:val="el-GR"/>
+        </w:rPr>
+        <w:t>τ</w:t>
+      </w:r>
+      <w:r>
+        <w:rPr>
+          <w:sz w:val="24"/>
+          <w:szCs w:val="24"/>
+        </w:rPr>
+        <w:t xml:space="preserve">ην </w:t>
+      </w:r>
+      <w:r>
+        <w:rPr>
+          <w:sz w:val="24"/>
+          <w:szCs w:val="24"/>
+        </w:rPr>
+        <w:t>{{PROC_TYPE}}</w:t>
+      </w:r>
+      <w:r>
+        <w:rPr>
+          <w:sz w:val="24"/>
+          <w:szCs w:val="24"/>
+        </w:rPr>
+        <w:t xml:space="preserve"> έναντι συνολικής αξίας</w:t>
+      </w:r>
+      <w:r>
+        <w:rPr>
+          <w:sz w:val="24"/>
+          <w:szCs w:val="24"/>
+          <w:lang w:val="el-GR"/>
+        </w:rPr>
+        <w:t xml:space="preserve"> </w:t>
+      </w:r>
+      <w:r>
+        <w:rPr>
+          <w:sz w:val="24"/>
+          <w:szCs w:val="24"/>
+        </w:rPr>
+        <w:t>{{ML_TOTAL_WORDS}}</w:t>
+      </w:r>
+      <w:r>
+        <w:rPr>
+          <w:sz w:val="24"/>
+          <w:szCs w:val="24"/>
+        </w:rPr>
+        <w:t xml:space="preserve"> </w:t>
+      </w:r>
+      <w:r>
+        <w:rPr>
+          <w:sz w:val="24"/>
+          <w:szCs w:val="24"/>
+          <w:lang w:val="el-GR"/>
+        </w:rPr>
+        <w:t>(</w:t>
+      </w:r>
+      <w:r>
+        <w:rPr>
+          <w:sz w:val="24"/>
+          <w:szCs w:val="24"/>
+        </w:rPr>
+        <w:t>{{ML_TOTAL}}</w:t>
+      </w:r>
+      <w:r>
+        <w:rPr>
+          <w:sz w:val="24"/>
+          <w:szCs w:val="24"/>
+        </w:rPr>
+        <w:t xml:space="preserve"> €) συμπεριλαμβανομένων κρατήσεων</w:t>
+      </w:r>
+      <w:r>
+        <w:rPr>
+          <w:sz w:val="24"/>
+          <w:szCs w:val="24"/>
+          <w:lang w:val="el-GR"/>
+        </w:rPr>
+        <w:t xml:space="preserve">, </w:t>
+      </w:r>
+      <w:r>
+        <w:rPr>
+          <w:sz w:val="24"/>
+          <w:szCs w:val="24"/>
+          <w:lang w:val="el-GR"/>
+        </w:rPr>
+        <w:t>άνευ ΦΠΑ/ και ΦΠΑ.</w:t>
       </w:r>
     </w:p>
     <w:p>
@@ -1330,33 +1807,31 @@
         <w:spacing w:before="240"/>
         <w:jc w:val="both"/>
         <w:rPr>
-          <w:sz w:val="24"/>
-          <w:szCs w:val="24"/>
+          <w:b/>
+          <w:bCs/>
+          <w:sz w:val="24"/>
+          <w:szCs w:val="24"/>
+          <w:lang w:val="el-GR"/>
         </w:rPr>
       </w:pPr>
       <w:r>
         <w:rPr>
+          <w:b/>
+          <w:bCs/>
           <w:sz w:val="24"/>
           <w:szCs w:val="24"/>
           <w:lang w:val="el-GR"/>
         </w:rPr>
         <w:tab/>
-        <w:t>α.</w:t>
-      </w:r>
-      <w:r>
-        <w:rPr>
-          <w:sz w:val="24"/>
-          <w:szCs w:val="24"/>
-          <w:lang w:val="el-GR"/>
-        </w:rPr>
-        <w:tab/>
-      </w:r>
-      <w:r>
-        <w:rPr>
-          <w:sz w:val="24"/>
-          <w:szCs w:val="24"/>
-        </w:rPr>
-        <w:t>Το Νομοθετικό Διάταγμα 721/1970 «Περί Οικονομικής Μερίμνης και Λογιστικού των   Ε.Δ», (ΦΕΚ 251Α/70).</w:t>
+      </w:r>
+      <w:r>
+        <w:rPr>
+          <w:b/>
+          <w:bCs/>
+          <w:sz w:val="24"/>
+          <w:szCs w:val="24"/>
+        </w:rPr>
+        <w:t>Αντικείμενο Σύμβασης</w:t>
       </w:r>
     </w:p>
     <w:p>
@@ -1383,11 +1858,12 @@
           <w:tab w:val="left" w:pos="8080"/>
           <w:tab w:val="left" w:pos="8505"/>
         </w:tabs>
-        <w:spacing w:before="240"/>
+        <w:spacing w:before="240" w:after="240"/>
         <w:jc w:val="both"/>
         <w:rPr>
           <w:sz w:val="24"/>
           <w:szCs w:val="24"/>
+          <w:lang w:val="el-GR"/>
         </w:rPr>
       </w:pPr>
       <w:r>
@@ -1403,7 +1879,7 @@
           <w:sz w:val="24"/>
           <w:szCs w:val="24"/>
         </w:rPr>
-        <w:t>β.</w:t>
+        <w:t>2.</w:t>
       </w:r>
       <w:r>
         <w:rPr>
@@ -1418,728 +1894,7 @@
           <w:sz w:val="24"/>
           <w:szCs w:val="24"/>
         </w:rPr>
-        <w:t>Την απόφαση ΥΦΕΘΑ Φ.800/133/134893/07 (ΦΕΚ 2300//3-12-07) «Περί Μεταβιβάσεως Οικονομικής Εξουσίας σε Κεντρικά και Περιφερειακά Όργανα  της Διοίκησης  των ΕΔ και σε προϊσταμένους των Υπηρεσιών που εξαρτώνται από αυτές, όπως αυτή τροποποιήθηκε με την απόφαση ΥΦΕΘΑ Φ.800/88/131798/Σ2063/25-7-08(ΦΕΚ Β΄ 1753 )».</w:t>
-      </w:r>
-    </w:p>
-    <w:p>
-      <w:pPr>
-        <w:tabs>
-          <w:tab w:val="left" w:pos="426"/>
-          <w:tab w:val="left" w:pos="851"/>
-          <w:tab w:val="left" w:pos="1276"/>
-          <w:tab w:val="left" w:pos="1701"/>
-          <w:tab w:val="left" w:pos="2127"/>
-          <w:tab w:val="left" w:pos="2552"/>
-          <w:tab w:val="left" w:pos="2977"/>
-          <w:tab w:val="left" w:pos="3402"/>
-          <w:tab w:val="left" w:pos="3828"/>
-          <w:tab w:val="left" w:pos="4253"/>
-          <w:tab w:val="left" w:pos="4678"/>
-          <w:tab w:val="left" w:pos="5103"/>
-          <w:tab w:val="left" w:pos="5529"/>
-          <w:tab w:val="left" w:pos="5954"/>
-          <w:tab w:val="left" w:pos="6379"/>
-          <w:tab w:val="left" w:pos="6804"/>
-          <w:tab w:val="left" w:pos="7230"/>
-          <w:tab w:val="left" w:pos="7655"/>
-          <w:tab w:val="left" w:pos="8080"/>
-          <w:tab w:val="left" w:pos="8505"/>
-        </w:tabs>
-        <w:spacing w:before="240"/>
-        <w:jc w:val="both"/>
-        <w:rPr>
-          <w:sz w:val="24"/>
-          <w:szCs w:val="24"/>
-        </w:rPr>
-      </w:pPr>
-      <w:r>
-        <w:rPr>
-          <w:rFonts w:eastAsia="Arial Unicode MS"/>
-          <w:sz w:val="24"/>
-          <w:szCs w:val="24"/>
-          <w:lang w:val="el-GR"/>
-        </w:rPr>
-        <w:tab/>
-      </w:r>
-      <w:r>
-        <w:rPr>
-          <w:rFonts w:eastAsia="Arial Unicode MS"/>
-          <w:sz w:val="24"/>
-          <w:szCs w:val="24"/>
-        </w:rPr>
-        <w:t>γ.</w:t>
-      </w:r>
-      <w:r>
-        <w:rPr>
-          <w:rFonts w:eastAsia="Arial Unicode MS"/>
-          <w:sz w:val="24"/>
-          <w:szCs w:val="24"/>
-          <w:lang w:val="el-GR"/>
-        </w:rPr>
-        <w:tab/>
-      </w:r>
-      <w:r>
-        <w:rPr>
-          <w:rFonts w:eastAsia="Arial Unicode MS"/>
-          <w:sz w:val="24"/>
-          <w:szCs w:val="24"/>
-        </w:rPr>
-        <w:t>Το Ν.4270/14 (Α’ 174) «Περί Αρχών δημοσιονομικής διαχείρισης και εποπτείας (ενσωμάτωση της Οδηγίας 2011/85/ΕΕ) − δημόσιο λογιστικό και άλλες διατάξεις.».</w:t>
-      </w:r>
-    </w:p>
-    <w:p>
-      <w:pPr>
-        <w:tabs>
-          <w:tab w:val="left" w:pos="426"/>
-          <w:tab w:val="left" w:pos="851"/>
-          <w:tab w:val="left" w:pos="1276"/>
-          <w:tab w:val="left" w:pos="1701"/>
-          <w:tab w:val="left" w:pos="2127"/>
-          <w:tab w:val="left" w:pos="2552"/>
-          <w:tab w:val="left" w:pos="2977"/>
-          <w:tab w:val="left" w:pos="3402"/>
-          <w:tab w:val="left" w:pos="3828"/>
-          <w:tab w:val="left" w:pos="4253"/>
-          <w:tab w:val="left" w:pos="4678"/>
-          <w:tab w:val="left" w:pos="5103"/>
-          <w:tab w:val="left" w:pos="5529"/>
-          <w:tab w:val="left" w:pos="5954"/>
-          <w:tab w:val="left" w:pos="6379"/>
-          <w:tab w:val="left" w:pos="6804"/>
-          <w:tab w:val="left" w:pos="7230"/>
-          <w:tab w:val="left" w:pos="7655"/>
-          <w:tab w:val="left" w:pos="8080"/>
-          <w:tab w:val="left" w:pos="8505"/>
-        </w:tabs>
-        <w:spacing w:before="240"/>
-        <w:jc w:val="both"/>
-        <w:rPr>
-          <w:sz w:val="24"/>
-          <w:szCs w:val="24"/>
-        </w:rPr>
-      </w:pPr>
-      <w:r>
-        <w:rPr>
-          <w:sz w:val="24"/>
-          <w:szCs w:val="24"/>
-          <w:lang w:val="el-GR"/>
-        </w:rPr>
-        <w:tab/>
-      </w:r>
-      <w:r>
-        <w:rPr>
-          <w:sz w:val="24"/>
-          <w:szCs w:val="24"/>
-        </w:rPr>
-        <w:t>δ.</w:t>
-      </w:r>
-      <w:r>
-        <w:rPr>
-          <w:sz w:val="24"/>
-          <w:szCs w:val="24"/>
-          <w:lang w:val="el-GR"/>
-        </w:rPr>
-        <w:tab/>
-      </w:r>
-      <w:r>
-        <w:rPr>
-          <w:sz w:val="24"/>
-          <w:szCs w:val="24"/>
-        </w:rPr>
-        <w:t>Τον Ν.4412/16 (Α’147) «Περί Δημοσίων Συμβάσεων Έργων, Προμηθειών και Υπηρεσιών (προσαρμογή στις Οδηγίες 2014/24/ΕΕ και 2014/25/ΕΕ)», όπως τροποποιήθηκε και ισχύει.</w:t>
-      </w:r>
-    </w:p>
-    <w:p>
-      <w:pPr>
-        <w:tabs>
-          <w:tab w:val="left" w:pos="426"/>
-          <w:tab w:val="left" w:pos="851"/>
-          <w:tab w:val="left" w:pos="1276"/>
-          <w:tab w:val="left" w:pos="1701"/>
-          <w:tab w:val="left" w:pos="2127"/>
-          <w:tab w:val="left" w:pos="2552"/>
-          <w:tab w:val="left" w:pos="2977"/>
-          <w:tab w:val="left" w:pos="3402"/>
-          <w:tab w:val="left" w:pos="3828"/>
-          <w:tab w:val="left" w:pos="4253"/>
-          <w:tab w:val="left" w:pos="4678"/>
-          <w:tab w:val="left" w:pos="5103"/>
-          <w:tab w:val="left" w:pos="5529"/>
-          <w:tab w:val="left" w:pos="5954"/>
-          <w:tab w:val="left" w:pos="6379"/>
-          <w:tab w:val="left" w:pos="6804"/>
-          <w:tab w:val="left" w:pos="7230"/>
-          <w:tab w:val="left" w:pos="7655"/>
-          <w:tab w:val="left" w:pos="8080"/>
-          <w:tab w:val="left" w:pos="8505"/>
-        </w:tabs>
-        <w:spacing w:before="240"/>
-        <w:jc w:val="both"/>
-        <w:rPr>
-          <w:sz w:val="24"/>
-          <w:szCs w:val="24"/>
-          <w:lang w:val="el-GR"/>
-        </w:rPr>
-      </w:pPr>
-      <w:r>
-        <w:rPr>
-          <w:sz w:val="24"/>
-          <w:szCs w:val="24"/>
-          <w:lang w:val="el-GR"/>
-        </w:rPr>
-        <w:tab/>
-      </w:r>
-      <w:r>
-        <w:rPr>
-          <w:sz w:val="24"/>
-          <w:szCs w:val="24"/>
-        </w:rPr>
-        <w:t>ε.</w:t>
-      </w:r>
-      <w:r>
-        <w:rPr>
-          <w:sz w:val="24"/>
-          <w:szCs w:val="24"/>
-          <w:lang w:val="el-GR"/>
-        </w:rPr>
-        <w:tab/>
-        <w:t xml:space="preserve">Την ΑΑΥ με αριθμό </w:t>
-      </w:r>
-      <w:r>
-        <w:rPr>
-          <w:sz w:val="24"/>
-          <w:szCs w:val="24"/>
-          <w:lang w:val="el-GR"/>
-        </w:rPr>
-        <w:t>{{</w:t>
-      </w:r>
-      <w:r>
-        <w:rPr>
-          <w:sz w:val="24"/>
-          <w:szCs w:val="24"/>
-          <w:lang w:val="en-US"/>
-        </w:rPr>
-        <w:t>procurement</w:t>
-      </w:r>
-      <w:r>
-        <w:rPr>
-          <w:sz w:val="24"/>
-          <w:szCs w:val="24"/>
-          <w:lang w:val="el-GR"/>
-        </w:rPr>
-        <w:t>.</w:t>
-      </w:r>
-      <w:proofErr w:type="spellStart"/>
-      <w:r>
-        <w:rPr>
-          <w:sz w:val="24"/>
-          <w:szCs w:val="24"/>
-          <w:lang w:val="en-US"/>
-        </w:rPr>
-        <w:t>aay</w:t>
-      </w:r>
-      <w:proofErr w:type="spellEnd"/>
-      <w:r>
-        <w:rPr>
-          <w:sz w:val="24"/>
-          <w:szCs w:val="24"/>
-          <w:lang w:val="el-GR"/>
-        </w:rPr>
-        <w:t>}}</w:t>
-      </w:r>
-      <w:r>
-        <w:rPr>
-          <w:sz w:val="24"/>
-          <w:szCs w:val="24"/>
-          <w:lang w:val="el-GR"/>
-        </w:rPr>
-        <w:t xml:space="preserve"> και ΑΔΑΜ </w:t>
-      </w:r>
-      <w:r>
-        <w:rPr>
-          <w:sz w:val="24"/>
-          <w:szCs w:val="24"/>
-          <w:lang w:val="el-GR"/>
-        </w:rPr>
-        <w:t>{{</w:t>
-      </w:r>
-      <w:r>
-        <w:rPr>
-          <w:sz w:val="24"/>
-          <w:szCs w:val="24"/>
-          <w:lang w:val="en-US"/>
-        </w:rPr>
-        <w:t>procurement</w:t>
-      </w:r>
-      <w:r>
-        <w:rPr>
-          <w:sz w:val="24"/>
-          <w:szCs w:val="24"/>
-          <w:lang w:val="el-GR"/>
-        </w:rPr>
-        <w:t>.</w:t>
-      </w:r>
-      <w:proofErr w:type="spellStart"/>
-      <w:r>
-        <w:rPr>
-          <w:sz w:val="24"/>
-          <w:szCs w:val="24"/>
-          <w:lang w:val="en-US"/>
-        </w:rPr>
-        <w:t>adam</w:t>
-      </w:r>
-      <w:proofErr w:type="spellEnd"/>
-      <w:r>
-        <w:rPr>
-          <w:sz w:val="24"/>
-          <w:szCs w:val="24"/>
-          <w:lang w:val="el-GR"/>
-        </w:rPr>
-        <w:t>_</w:t>
-      </w:r>
-      <w:proofErr w:type="spellStart"/>
-      <w:r>
-        <w:rPr>
-          <w:sz w:val="24"/>
-          <w:szCs w:val="24"/>
-          <w:lang w:val="en-US"/>
-        </w:rPr>
-        <w:t>aay</w:t>
-      </w:r>
-      <w:proofErr w:type="spellEnd"/>
-      <w:r>
-        <w:rPr>
-          <w:sz w:val="24"/>
-          <w:szCs w:val="24"/>
-          <w:lang w:val="el-GR"/>
-        </w:rPr>
-        <w:t>}}</w:t>
-      </w:r>
-      <w:r>
-        <w:rPr>
-          <w:sz w:val="24"/>
-          <w:szCs w:val="24"/>
-          <w:lang w:val="el-GR"/>
-        </w:rPr>
-        <w:t>.</w:t>
-      </w:r>
-    </w:p>
-    <w:p>
-      <w:pPr>
-        <w:tabs>
-          <w:tab w:val="left" w:pos="426"/>
-          <w:tab w:val="left" w:pos="851"/>
-          <w:tab w:val="left" w:pos="1276"/>
-          <w:tab w:val="left" w:pos="1701"/>
-          <w:tab w:val="left" w:pos="2127"/>
-          <w:tab w:val="left" w:pos="2552"/>
-          <w:tab w:val="left" w:pos="2977"/>
-          <w:tab w:val="left" w:pos="3402"/>
-          <w:tab w:val="left" w:pos="3828"/>
-          <w:tab w:val="left" w:pos="4253"/>
-          <w:tab w:val="left" w:pos="4678"/>
-          <w:tab w:val="left" w:pos="5103"/>
-          <w:tab w:val="left" w:pos="5529"/>
-          <w:tab w:val="left" w:pos="5954"/>
-          <w:tab w:val="left" w:pos="6379"/>
-          <w:tab w:val="left" w:pos="6804"/>
-          <w:tab w:val="left" w:pos="7230"/>
-          <w:tab w:val="left" w:pos="7655"/>
-          <w:tab w:val="left" w:pos="8080"/>
-          <w:tab w:val="left" w:pos="8505"/>
-        </w:tabs>
-        <w:spacing w:before="240"/>
-        <w:jc w:val="both"/>
-        <w:rPr>
-          <w:sz w:val="24"/>
-          <w:szCs w:val="24"/>
-          <w:lang w:val="el-GR"/>
-        </w:rPr>
-      </w:pPr>
-      <w:r>
-        <w:rPr>
-          <w:sz w:val="24"/>
-          <w:szCs w:val="24"/>
-          <w:lang w:val="el-GR"/>
-        </w:rPr>
-        <w:tab/>
-        <w:t>στ.</w:t>
-      </w:r>
-      <w:r>
-        <w:rPr>
-          <w:sz w:val="24"/>
-          <w:szCs w:val="24"/>
-          <w:lang w:val="el-GR"/>
-        </w:rPr>
-        <w:tab/>
-        <w:t xml:space="preserve">Την προσφορά του προμηθευτή </w:t>
-      </w:r>
-      <w:r>
-        <w:rPr>
-          <w:sz w:val="24"/>
-          <w:szCs w:val="24"/>
-        </w:rPr>
-        <w:t>{{</w:t>
-      </w:r>
-      <w:r>
-        <w:rPr>
-          <w:sz w:val="24"/>
-          <w:szCs w:val="24"/>
-          <w:lang w:val="en-US"/>
-        </w:rPr>
-        <w:t>supplier</w:t>
-      </w:r>
-      <w:r>
-        <w:rPr>
-          <w:sz w:val="24"/>
-          <w:szCs w:val="24"/>
-          <w:lang w:val="el-GR"/>
-        </w:rPr>
-        <w:t>.</w:t>
-      </w:r>
-      <w:r>
-        <w:rPr>
-          <w:sz w:val="24"/>
-          <w:szCs w:val="24"/>
-          <w:lang w:val="en-US"/>
-        </w:rPr>
-        <w:t>name</w:t>
-      </w:r>
-      <w:r>
-        <w:rPr>
-          <w:sz w:val="24"/>
-          <w:szCs w:val="24"/>
-        </w:rPr>
-        <w:t>}}</w:t>
-      </w:r>
-      <w:r>
-        <w:rPr>
-          <w:sz w:val="24"/>
-          <w:szCs w:val="24"/>
-          <w:lang w:val="el-GR"/>
-        </w:rPr>
-        <w:t xml:space="preserve"> </w:t>
-      </w:r>
-      <w:r>
-        <w:rPr>
-          <w:sz w:val="24"/>
-          <w:szCs w:val="24"/>
-          <w:lang w:val="el-GR"/>
-        </w:rPr>
-        <w:t>με ΑΦΜ</w:t>
-      </w:r>
-      <w:r>
-        <w:rPr>
-          <w:sz w:val="24"/>
-          <w:szCs w:val="24"/>
-          <w:lang w:val="el-GR"/>
-        </w:rPr>
-        <w:t>:</w:t>
-      </w:r>
-      <w:r>
-        <w:rPr>
-          <w:sz w:val="24"/>
-          <w:szCs w:val="24"/>
-        </w:rPr>
-        <w:t>{{</w:t>
-      </w:r>
-      <w:r>
-        <w:rPr>
-          <w:sz w:val="24"/>
-          <w:szCs w:val="24"/>
-          <w:lang w:val="en-US"/>
-        </w:rPr>
-        <w:t>supplier</w:t>
-      </w:r>
-      <w:r>
-        <w:rPr>
-          <w:sz w:val="24"/>
-          <w:szCs w:val="24"/>
-          <w:lang w:val="el-GR"/>
-        </w:rPr>
-        <w:t>.</w:t>
-      </w:r>
-      <w:proofErr w:type="spellStart"/>
-      <w:r>
-        <w:rPr>
-          <w:sz w:val="24"/>
-          <w:szCs w:val="24"/>
-          <w:lang w:val="en-US"/>
-        </w:rPr>
-        <w:t>afm</w:t>
-      </w:r>
-      <w:proofErr w:type="spellEnd"/>
-      <w:r>
-        <w:rPr>
-          <w:sz w:val="24"/>
-          <w:szCs w:val="24"/>
-        </w:rPr>
-        <w:t>}}</w:t>
-      </w:r>
-      <w:r>
-        <w:rPr>
-          <w:sz w:val="24"/>
-          <w:szCs w:val="24"/>
-          <w:lang w:val="el-GR"/>
-        </w:rPr>
-        <w:t>.</w:t>
-      </w:r>
-    </w:p>
-    <w:p>
-      <w:pPr>
-        <w:tabs>
-          <w:tab w:val="left" w:pos="426"/>
-          <w:tab w:val="left" w:pos="851"/>
-          <w:tab w:val="left" w:pos="1276"/>
-          <w:tab w:val="left" w:pos="1701"/>
-          <w:tab w:val="left" w:pos="2127"/>
-          <w:tab w:val="left" w:pos="2552"/>
-          <w:tab w:val="left" w:pos="2977"/>
-          <w:tab w:val="left" w:pos="3402"/>
-          <w:tab w:val="left" w:pos="3828"/>
-          <w:tab w:val="left" w:pos="4253"/>
-          <w:tab w:val="left" w:pos="4678"/>
-          <w:tab w:val="left" w:pos="5103"/>
-          <w:tab w:val="left" w:pos="5529"/>
-          <w:tab w:val="left" w:pos="5954"/>
-          <w:tab w:val="left" w:pos="6379"/>
-          <w:tab w:val="left" w:pos="6804"/>
-          <w:tab w:val="left" w:pos="7230"/>
-          <w:tab w:val="left" w:pos="7655"/>
-          <w:tab w:val="left" w:pos="8080"/>
-          <w:tab w:val="left" w:pos="8505"/>
-        </w:tabs>
-        <w:spacing w:before="240"/>
-        <w:jc w:val="both"/>
-        <w:rPr>
-          <w:sz w:val="24"/>
-          <w:szCs w:val="24"/>
-          <w:lang w:val="el-GR"/>
-        </w:rPr>
-      </w:pPr>
-      <w:r>
-        <w:rPr>
-          <w:sz w:val="24"/>
-          <w:szCs w:val="24"/>
-          <w:lang w:val="el-GR"/>
-        </w:rPr>
-        <w:tab/>
-        <w:t>ζ</w:t>
-      </w:r>
-      <w:r>
-        <w:rPr>
-          <w:sz w:val="24"/>
-          <w:szCs w:val="24"/>
-        </w:rPr>
-        <w:t>.</w:t>
-      </w:r>
-      <w:r>
-        <w:rPr>
-          <w:sz w:val="24"/>
-          <w:szCs w:val="24"/>
-          <w:lang w:val="el-GR"/>
-        </w:rPr>
-        <w:tab/>
-      </w:r>
-      <w:r>
-        <w:rPr>
-          <w:sz w:val="24"/>
-          <w:szCs w:val="24"/>
-          <w:highlight w:val="yellow"/>
-          <w:lang w:val="el-GR"/>
-        </w:rPr>
-        <w:t xml:space="preserve">Την δέσμευση πίστωση με </w:t>
-      </w:r>
-      <w:r>
-        <w:rPr>
-          <w:sz w:val="24"/>
-          <w:szCs w:val="24"/>
-          <w:highlight w:val="yellow"/>
-          <w:lang w:val="el-GR"/>
-        </w:rPr>
-        <w:t>{{</w:t>
-      </w:r>
-      <w:r>
-        <w:rPr>
-          <w:sz w:val="24"/>
-          <w:szCs w:val="24"/>
-          <w:highlight w:val="yellow"/>
-          <w:lang w:val="en-US"/>
-        </w:rPr>
-        <w:t>procurement</w:t>
-      </w:r>
-      <w:r>
-        <w:rPr>
-          <w:sz w:val="24"/>
-          <w:szCs w:val="24"/>
-          <w:highlight w:val="yellow"/>
-          <w:lang w:val="el-GR"/>
-        </w:rPr>
-        <w:t>.identity_prosklisis}}</w:t>
-      </w:r>
-      <w:r>
-        <w:rPr>
-          <w:sz w:val="24"/>
-          <w:szCs w:val="24"/>
-          <w:highlight w:val="yellow"/>
-          <w:lang w:val="el-GR"/>
-        </w:rPr>
-        <w:t xml:space="preserve"> και ΑΔΑΜ: </w:t>
-      </w:r>
-      <w:r>
-        <w:rPr>
-          <w:sz w:val="24"/>
-          <w:szCs w:val="24"/>
-          <w:highlight w:val="yellow"/>
-          <w:lang w:val="el-GR"/>
-        </w:rPr>
-        <w:t xml:space="preserve">{{ </w:t>
-      </w:r>
-      <w:r>
-        <w:rPr>
-          <w:sz w:val="24"/>
-          <w:szCs w:val="24"/>
-          <w:highlight w:val="yellow"/>
-          <w:lang w:val="en-US"/>
-        </w:rPr>
-        <w:t>procurement</w:t>
-      </w:r>
-      <w:r>
-        <w:rPr>
-          <w:sz w:val="24"/>
-          <w:szCs w:val="24"/>
-          <w:highlight w:val="yellow"/>
-          <w:lang w:val="el-GR"/>
-        </w:rPr>
-        <w:t>.adam_prosklisis}}</w:t>
-      </w:r>
-      <w:r>
-        <w:rPr>
-          <w:sz w:val="24"/>
-          <w:szCs w:val="24"/>
-          <w:highlight w:val="yellow"/>
-          <w:lang w:val="el-GR"/>
-        </w:rPr>
-        <w:t>.</w:t>
-      </w:r>
-    </w:p>
-    <w:p>
-      <w:pPr>
-        <w:tabs>
-          <w:tab w:val="left" w:pos="426"/>
-          <w:tab w:val="left" w:pos="851"/>
-          <w:tab w:val="left" w:pos="1276"/>
-          <w:tab w:val="left" w:pos="1701"/>
-          <w:tab w:val="left" w:pos="2127"/>
-          <w:tab w:val="left" w:pos="2552"/>
-          <w:tab w:val="left" w:pos="2977"/>
-          <w:tab w:val="left" w:pos="3402"/>
-          <w:tab w:val="left" w:pos="3828"/>
-          <w:tab w:val="left" w:pos="4253"/>
-          <w:tab w:val="left" w:pos="4678"/>
-          <w:tab w:val="left" w:pos="5103"/>
-          <w:tab w:val="left" w:pos="5529"/>
-          <w:tab w:val="left" w:pos="5954"/>
-          <w:tab w:val="left" w:pos="6379"/>
-          <w:tab w:val="left" w:pos="6804"/>
-          <w:tab w:val="left" w:pos="7230"/>
-          <w:tab w:val="left" w:pos="7655"/>
-          <w:tab w:val="left" w:pos="8080"/>
-          <w:tab w:val="left" w:pos="8505"/>
-        </w:tabs>
-        <w:spacing w:before="240"/>
-        <w:jc w:val="center"/>
-        <w:rPr>
-          <w:sz w:val="24"/>
-          <w:szCs w:val="24"/>
-        </w:rPr>
-      </w:pPr>
-      <w:r>
-        <w:rPr>
-          <w:b/>
-          <w:bCs/>
-          <w:sz w:val="24"/>
-          <w:szCs w:val="24"/>
-        </w:rPr>
-        <w:t>ΑΠΟΦΑΣΙΖΟΥΜΕ</w:t>
-      </w:r>
-    </w:p>
-    <w:p>
-      <w:pPr>
-        <w:tabs>
-          <w:tab w:val="left" w:pos="426"/>
-          <w:tab w:val="left" w:pos="851"/>
-          <w:tab w:val="left" w:pos="1276"/>
-          <w:tab w:val="left" w:pos="1701"/>
-          <w:tab w:val="left" w:pos="2127"/>
-          <w:tab w:val="left" w:pos="2552"/>
-          <w:tab w:val="left" w:pos="2977"/>
-          <w:tab w:val="left" w:pos="3402"/>
-          <w:tab w:val="left" w:pos="3828"/>
-          <w:tab w:val="left" w:pos="4253"/>
-          <w:tab w:val="left" w:pos="4678"/>
-          <w:tab w:val="left" w:pos="5103"/>
-          <w:tab w:val="left" w:pos="5529"/>
-          <w:tab w:val="left" w:pos="5954"/>
-          <w:tab w:val="left" w:pos="6379"/>
-          <w:tab w:val="left" w:pos="6804"/>
-          <w:tab w:val="left" w:pos="7230"/>
-          <w:tab w:val="left" w:pos="7655"/>
-          <w:tab w:val="left" w:pos="8080"/>
-          <w:tab w:val="left" w:pos="8505"/>
-        </w:tabs>
-        <w:spacing w:before="240"/>
-        <w:jc w:val="both"/>
-        <w:rPr>
-          <w:sz w:val="24"/>
-          <w:szCs w:val="24"/>
-          <w:lang w:val="el-GR"/>
-        </w:rPr>
-      </w:pPr>
-      <w:r>
-        <w:rPr>
-          <w:sz w:val="24"/>
-          <w:szCs w:val="24"/>
-        </w:rPr>
-        <w:tab/>
-        <w:t>1.</w:t>
-      </w:r>
-      <w:r>
-        <w:rPr>
-          <w:sz w:val="24"/>
-          <w:szCs w:val="24"/>
-          <w:lang w:val="el-GR"/>
-        </w:rPr>
-        <w:tab/>
-      </w:r>
-      <w:r>
-        <w:rPr>
-          <w:sz w:val="24"/>
-          <w:szCs w:val="24"/>
-        </w:rPr>
-        <w:t>Την ανάθεση στον οικονομικό φορέα «</w:t>
-      </w:r>
-      <w:r>
-        <w:rPr>
-          <w:sz w:val="24"/>
-          <w:szCs w:val="24"/>
-        </w:rPr>
-        <w:t>{{WINNER_SUPPLIER_LINE}}</w:t>
-      </w:r>
-      <w:r>
-        <w:rPr>
-          <w:sz w:val="24"/>
-          <w:szCs w:val="24"/>
-          <w:lang w:val="el-GR"/>
-        </w:rPr>
-        <w:tab/>
-      </w:r>
-      <w:r>
-        <w:rPr>
-          <w:sz w:val="24"/>
-          <w:szCs w:val="24"/>
-        </w:rPr>
-        <w:t xml:space="preserve">για την </w:t>
+        <w:t xml:space="preserve">Αντικείμενο σύμβασης είναι η </w:t>
       </w:r>
       <w:r>
         <w:rPr>
@@ -2153,239 +1908,7 @@
           <w:sz w:val="24"/>
           <w:szCs w:val="24"/>
         </w:rPr>
-        <w:t xml:space="preserve"> έναντι συνολικής αξίας</w:t>
-      </w:r>
-      <w:r>
-        <w:rPr>
-          <w:sz w:val="24"/>
-          <w:szCs w:val="24"/>
-          <w:lang w:val="el-GR"/>
-        </w:rPr>
-        <w:t xml:space="preserve"> </w:t>
-      </w:r>
-      <w:r>
-        <w:rPr>
-          <w:sz w:val="24"/>
-          <w:szCs w:val="24"/>
-          <w:highlight w:val="yellow"/>
-        </w:rPr>
-        <w:t>…………………………………..</w:t>
-      </w:r>
-      <w:r>
-        <w:rPr>
-          <w:sz w:val="24"/>
-          <w:szCs w:val="24"/>
-        </w:rPr>
-        <w:t xml:space="preserve"> ευρώ </w:t>
-      </w:r>
-      <w:r>
-        <w:rPr>
-          <w:sz w:val="24"/>
-          <w:szCs w:val="24"/>
-          <w:lang w:val="el-GR"/>
-        </w:rPr>
-        <w:t>(</w:t>
-      </w:r>
-      <w:r>
-        <w:rPr>
-          <w:sz w:val="24"/>
-          <w:szCs w:val="24"/>
-        </w:rPr>
-        <w:t>{{ML_TOTAL}}</w:t>
-      </w:r>
-      <w:r>
-        <w:rPr>
-          <w:sz w:val="24"/>
-          <w:szCs w:val="24"/>
-        </w:rPr>
-        <w:t xml:space="preserve"> €) συμπεριλαμβανομένων κρατήσεων</w:t>
-      </w:r>
-      <w:r>
-        <w:rPr>
-          <w:sz w:val="24"/>
-          <w:szCs w:val="24"/>
-          <w:lang w:val="el-GR"/>
-        </w:rPr>
-        <w:t xml:space="preserve">, </w:t>
-      </w:r>
-      <w:r>
-        <w:rPr>
-          <w:sz w:val="24"/>
-          <w:szCs w:val="24"/>
-          <w:lang w:val="el-GR"/>
-        </w:rPr>
-        <w:t>άνευ ΦΠΑ/ και ΦΠΑ.</w:t>
-      </w:r>
-    </w:p>
-    <w:p>
-      <w:pPr>
-        <w:tabs>
-          <w:tab w:val="left" w:pos="426"/>
-          <w:tab w:val="left" w:pos="851"/>
-          <w:tab w:val="left" w:pos="1276"/>
-          <w:tab w:val="left" w:pos="1701"/>
-          <w:tab w:val="left" w:pos="2127"/>
-          <w:tab w:val="left" w:pos="2552"/>
-          <w:tab w:val="left" w:pos="2977"/>
-          <w:tab w:val="left" w:pos="3402"/>
-          <w:tab w:val="left" w:pos="3828"/>
-          <w:tab w:val="left" w:pos="4253"/>
-          <w:tab w:val="left" w:pos="4678"/>
-          <w:tab w:val="left" w:pos="5103"/>
-          <w:tab w:val="left" w:pos="5529"/>
-          <w:tab w:val="left" w:pos="5954"/>
-          <w:tab w:val="left" w:pos="6379"/>
-          <w:tab w:val="left" w:pos="6804"/>
-          <w:tab w:val="left" w:pos="7230"/>
-          <w:tab w:val="left" w:pos="7655"/>
-          <w:tab w:val="left" w:pos="8080"/>
-          <w:tab w:val="left" w:pos="8505"/>
-        </w:tabs>
-        <w:spacing w:before="240"/>
-        <w:jc w:val="both"/>
-        <w:rPr>
-          <w:b/>
-          <w:bCs/>
-          <w:sz w:val="24"/>
-          <w:szCs w:val="24"/>
-          <w:lang w:val="el-GR"/>
-        </w:rPr>
-      </w:pPr>
-      <w:r>
-        <w:rPr>
-          <w:b/>
-          <w:bCs/>
-          <w:sz w:val="24"/>
-          <w:szCs w:val="24"/>
-          <w:lang w:val="el-GR"/>
-        </w:rPr>
-        <w:lastRenderedPageBreak/>
-        <w:tab/>
-      </w:r>
-      <w:r>
-        <w:rPr>
-          <w:b/>
-          <w:bCs/>
-          <w:sz w:val="24"/>
-          <w:szCs w:val="24"/>
-        </w:rPr>
-        <w:t>Αντικείμενο Σύμβασης</w:t>
-      </w:r>
-    </w:p>
-    <w:p>
-      <w:pPr>
-        <w:tabs>
-          <w:tab w:val="left" w:pos="426"/>
-          <w:tab w:val="left" w:pos="851"/>
-          <w:tab w:val="left" w:pos="1276"/>
-          <w:tab w:val="left" w:pos="1701"/>
-          <w:tab w:val="left" w:pos="2127"/>
-          <w:tab w:val="left" w:pos="2552"/>
-          <w:tab w:val="left" w:pos="2977"/>
-          <w:tab w:val="left" w:pos="3402"/>
-          <w:tab w:val="left" w:pos="3828"/>
-          <w:tab w:val="left" w:pos="4253"/>
-          <w:tab w:val="left" w:pos="4678"/>
-          <w:tab w:val="left" w:pos="5103"/>
-          <w:tab w:val="left" w:pos="5529"/>
-          <w:tab w:val="left" w:pos="5954"/>
-          <w:tab w:val="left" w:pos="6379"/>
-          <w:tab w:val="left" w:pos="6804"/>
-          <w:tab w:val="left" w:pos="7230"/>
-          <w:tab w:val="left" w:pos="7655"/>
-          <w:tab w:val="left" w:pos="8080"/>
-          <w:tab w:val="left" w:pos="8505"/>
-        </w:tabs>
-        <w:spacing w:before="240"/>
-        <w:jc w:val="both"/>
-        <w:rPr>
-          <w:sz w:val="24"/>
-          <w:szCs w:val="24"/>
-        </w:rPr>
-      </w:pPr>
-      <w:r>
-        <w:rPr>
-          <w:sz w:val="24"/>
-          <w:szCs w:val="24"/>
-          <w:lang w:val="el-GR"/>
-        </w:rPr>
-        <w:tab/>
-      </w:r>
-      <w:r>
-        <w:rPr>
-          <w:sz w:val="24"/>
-          <w:szCs w:val="24"/>
-        </w:rPr>
-        <w:t>2.</w:t>
-      </w:r>
-      <w:r>
-        <w:rPr>
-          <w:sz w:val="24"/>
-          <w:szCs w:val="24"/>
-          <w:lang w:val="el-GR"/>
-        </w:rPr>
-        <w:tab/>
-      </w:r>
-      <w:r>
-        <w:rPr>
-          <w:sz w:val="24"/>
-          <w:szCs w:val="24"/>
-        </w:rPr>
-        <w:t xml:space="preserve">Αντικείμενο σύμβασης είναι η </w:t>
-      </w:r>
-      <w:r>
-        <w:rPr>
-          <w:sz w:val="24"/>
-          <w:szCs w:val="24"/>
-        </w:rPr>
-        <w:t>{{PROC_TYPE}}</w:t>
-      </w:r>
-      <w:r>
-        <w:rPr>
-          <w:sz w:val="24"/>
-          <w:szCs w:val="24"/>
-        </w:rPr>
         <w:t xml:space="preserve"> ως ακολούθως:</w:t>
-      </w:r>
-    </w:p>
-    <w:p>
-      <w:pPr>
-        <w:tabs>
-          <w:tab w:val="left" w:pos="426"/>
-          <w:tab w:val="left" w:pos="851"/>
-          <w:tab w:val="left" w:pos="1276"/>
-          <w:tab w:val="left" w:pos="1701"/>
-          <w:tab w:val="left" w:pos="2127"/>
-          <w:tab w:val="left" w:pos="2552"/>
-          <w:tab w:val="left" w:pos="2977"/>
-          <w:tab w:val="left" w:pos="3402"/>
-          <w:tab w:val="left" w:pos="3828"/>
-          <w:tab w:val="left" w:pos="4253"/>
-          <w:tab w:val="left" w:pos="4678"/>
-          <w:tab w:val="left" w:pos="5103"/>
-          <w:tab w:val="left" w:pos="5529"/>
-          <w:tab w:val="left" w:pos="5954"/>
-          <w:tab w:val="left" w:pos="6379"/>
-          <w:tab w:val="left" w:pos="6804"/>
-          <w:tab w:val="left" w:pos="7230"/>
-          <w:tab w:val="left" w:pos="7655"/>
-          <w:tab w:val="left" w:pos="8080"/>
-          <w:tab w:val="left" w:pos="8505"/>
-        </w:tabs>
-        <w:spacing w:before="240"/>
-        <w:jc w:val="both"/>
-        <w:rPr>
-          <w:sz w:val="24"/>
-          <w:szCs w:val="24"/>
-          <w:lang w:val="el-GR"/>
-        </w:rPr>
-      </w:pPr>
-      <w:r>
-        <w:rPr>
-          <w:sz w:val="24"/>
-          <w:szCs w:val="24"/>
-        </w:rPr>
-        <w:t xml:space="preserve"> </w:t>
       </w:r>
     </w:p>
     <w:tbl>
@@ -2449,6 +1972,7 @@
                 <w:sz w:val="24"/>
                 <w:szCs w:val="24"/>
               </w:rPr>
+              <w:lastRenderedPageBreak/>
               <w:t>Α/Α</w:t>
             </w:r>
           </w:p>
@@ -2975,11 +2499,12 @@
           <w:tab w:val="left" w:pos="8080"/>
           <w:tab w:val="left" w:pos="8505"/>
         </w:tabs>
-        <w:spacing w:before="240"/>
+        <w:spacing w:before="240" w:after="240"/>
         <w:jc w:val="both"/>
         <w:rPr>
           <w:sz w:val="24"/>
           <w:szCs w:val="24"/>
+          <w:lang w:val="el-GR"/>
         </w:rPr>
       </w:pPr>
       <w:r>
@@ -3011,46 +2536,6 @@
           <w:szCs w:val="24"/>
         </w:rPr>
         <w:t>Η ανάλυση κόστους της υπόψη ανάθεσης αναλύεται ως ακολούθως:</w:t>
-      </w:r>
-    </w:p>
-    <w:p>
-      <w:pPr>
-        <w:tabs>
-          <w:tab w:val="left" w:pos="426"/>
-          <w:tab w:val="left" w:pos="851"/>
-          <w:tab w:val="left" w:pos="1276"/>
-          <w:tab w:val="left" w:pos="1701"/>
-          <w:tab w:val="left" w:pos="2127"/>
-          <w:tab w:val="left" w:pos="2552"/>
-          <w:tab w:val="left" w:pos="2977"/>
-          <w:tab w:val="left" w:pos="3402"/>
-          <w:tab w:val="left" w:pos="3828"/>
-          <w:tab w:val="left" w:pos="4253"/>
-          <w:tab w:val="left" w:pos="4678"/>
-          <w:tab w:val="left" w:pos="5103"/>
-          <w:tab w:val="left" w:pos="5529"/>
-          <w:tab w:val="left" w:pos="5954"/>
-          <w:tab w:val="left" w:pos="6379"/>
-          <w:tab w:val="left" w:pos="6804"/>
-          <w:tab w:val="left" w:pos="7230"/>
-          <w:tab w:val="left" w:pos="7655"/>
-          <w:tab w:val="left" w:pos="8080"/>
-          <w:tab w:val="left" w:pos="8505"/>
-        </w:tabs>
-        <w:spacing w:before="240"/>
-        <w:jc w:val="both"/>
-        <w:rPr>
-          <w:sz w:val="24"/>
-          <w:szCs w:val="24"/>
-          <w:lang w:val="el-GR"/>
-        </w:rPr>
-      </w:pPr>
-      <w:r>
-        <w:rPr>
-          <w:sz w:val="24"/>
-          <w:szCs w:val="24"/>
-        </w:rPr>
-        <w:t xml:space="preserve"> </w:t>
       </w:r>
     </w:p>
     <w:tbl>
@@ -4282,9 +3767,27 @@
         <w:rPr>
           <w:sz w:val="24"/>
           <w:szCs w:val="24"/>
+        </w:rPr>
+      </w:pPr>
+      <w:r>
+        <w:rPr>
+          <w:b/>
+          <w:bCs/>
+          <w:sz w:val="24"/>
+          <w:szCs w:val="24"/>
           <w:lang w:val="en-US"/>
         </w:rPr>
-      </w:pPr>
+        <w:tab/>
+      </w:r>
+      <w:r>
+        <w:rPr>
+          <w:b/>
+          <w:bCs/>
+          <w:sz w:val="24"/>
+          <w:szCs w:val="24"/>
+        </w:rPr>
+        <w:t>Πιστώσεις</w:t>
+      </w:r>
     </w:p>
     <w:p>
       <w:pPr>
@@ -4319,13 +3822,33 @@
       </w:pPr>
       <w:r>
         <w:rPr>
-          <w:b/>
-          <w:bCs/>
-          <w:sz w:val="24"/>
-          <w:szCs w:val="24"/>
+          <w:sz w:val="24"/>
+          <w:szCs w:val="24"/>
+          <w:lang w:val="el-GR"/>
         </w:rPr>
         <w:tab/>
-        <w:t>Πιστώσεις</w:t>
+      </w:r>
+      <w:r>
+        <w:rPr>
+          <w:sz w:val="24"/>
+          <w:szCs w:val="24"/>
+        </w:rPr>
+        <w:t>4.</w:t>
+      </w:r>
+      <w:r>
+        <w:rPr>
+          <w:sz w:val="24"/>
+          <w:szCs w:val="24"/>
+          <w:lang w:val="el-GR"/>
+        </w:rPr>
+        <w:tab/>
+      </w:r>
+      <w:r>
+        <w:rPr>
+          <w:sz w:val="24"/>
+          <w:szCs w:val="24"/>
+        </w:rPr>
+        <w:t>Οι απαιτούμενες πιστώσεις θα διατεθούν:</w:t>
       </w:r>
     </w:p>
     <w:p>
@@ -4371,13 +3894,6 @@
         <w:rPr>
           <w:sz w:val="24"/>
           <w:szCs w:val="24"/>
-        </w:rPr>
-        <w:t>4.</w:t>
-      </w:r>
-      <w:r>
-        <w:rPr>
-          <w:sz w:val="24"/>
-          <w:szCs w:val="24"/>
           <w:lang w:val="el-GR"/>
         </w:rPr>
         <w:tab/>
@@ -4387,7 +3903,69 @@
           <w:sz w:val="24"/>
           <w:szCs w:val="24"/>
         </w:rPr>
-        <w:t>Οι απαιτούμενες πιστώσεις θα διατεθούν:</w:t>
+        <w:t>α.</w:t>
+      </w:r>
+      <w:r>
+        <w:rPr>
+          <w:sz w:val="24"/>
+          <w:szCs w:val="24"/>
+          <w:lang w:val="el-GR"/>
+        </w:rPr>
+        <w:tab/>
+      </w:r>
+      <w:r>
+        <w:rPr>
+          <w:sz w:val="24"/>
+          <w:szCs w:val="24"/>
+        </w:rPr>
+        <w:t xml:space="preserve">Από ΑΛΕ </w:t>
+      </w:r>
+      <w:r>
+        <w:rPr>
+          <w:sz w:val="24"/>
+          <w:szCs w:val="24"/>
+          <w:lang w:val="el-GR"/>
+        </w:rPr>
+        <w:t>{{</w:t>
+      </w:r>
+      <w:r>
+        <w:rPr>
+          <w:sz w:val="24"/>
+          <w:szCs w:val="24"/>
+          <w:lang w:val="en-US"/>
+        </w:rPr>
+        <w:t>procurement</w:t>
+      </w:r>
+      <w:r>
+        <w:rPr>
+          <w:sz w:val="24"/>
+          <w:szCs w:val="24"/>
+          <w:lang w:val="el-GR"/>
+        </w:rPr>
+        <w:t>.</w:t>
+      </w:r>
+      <w:r>
+        <w:rPr>
+          <w:sz w:val="24"/>
+          <w:szCs w:val="24"/>
+          <w:lang w:val="en-US"/>
+        </w:rPr>
+        <w:t>ale</w:t>
+      </w:r>
+      <w:r>
+        <w:rPr>
+          <w:sz w:val="24"/>
+          <w:szCs w:val="24"/>
+          <w:lang w:val="el-GR"/>
+        </w:rPr>
+        <w:t>}}</w:t>
+      </w:r>
+      <w:r>
+        <w:rPr>
+          <w:sz w:val="24"/>
+          <w:szCs w:val="24"/>
+        </w:rPr>
+        <w:t>.</w:t>
       </w:r>
     </w:p>
     <w:p>
@@ -4442,7 +4020,7 @@
           <w:sz w:val="24"/>
           <w:szCs w:val="24"/>
         </w:rPr>
-        <w:t>α.</w:t>
+        <w:t>β.</w:t>
       </w:r>
       <w:r>
         <w:rPr>
@@ -4457,7 +4035,7 @@
           <w:sz w:val="24"/>
           <w:szCs w:val="24"/>
         </w:rPr>
-        <w:t xml:space="preserve">Από ΑΛΕ </w:t>
+        <w:t xml:space="preserve">Εις βάρος Π/Υ έτους </w:t>
       </w:r>
       <w:r>
         <w:rPr>
@@ -4473,15 +4051,15 @@
           <w:szCs w:val="24"/>
           <w:lang w:val="en-US"/>
         </w:rPr>
-        <w:t>procurement</w:t>
-      </w:r>
-      <w:r>
-        <w:rPr>
-          <w:sz w:val="24"/>
-          <w:szCs w:val="24"/>
-          <w:lang w:val="el-GR"/>
-        </w:rPr>
-        <w:t>.</w:t>
+        <w:t>current</w:t>
+      </w:r>
+      <w:r>
+        <w:rPr>
+          <w:sz w:val="24"/>
+          <w:szCs w:val="24"/>
+          <w:lang w:val="el-GR"/>
+        </w:rPr>
+        <w:t xml:space="preserve"> </w:t>
       </w:r>
       <w:r>
         <w:rPr>
@@ -4489,7 +4067,7 @@
           <w:szCs w:val="24"/>
           <w:lang w:val="en-US"/>
         </w:rPr>
-        <w:t>ale</w:t>
+        <w:t>year</w:t>
       </w:r>
       <w:r>
         <w:rPr>
@@ -4536,6 +4114,7 @@
         <w:rPr>
           <w:sz w:val="24"/>
           <w:szCs w:val="24"/>
+          <w:lang w:val="el-GR"/>
         </w:rPr>
       </w:pPr>
       <w:r>
@@ -4559,7 +4138,7 @@
           <w:sz w:val="24"/>
           <w:szCs w:val="24"/>
         </w:rPr>
-        <w:t>β.</w:t>
+        <w:t>γ.</w:t>
       </w:r>
       <w:r>
         <w:rPr>
@@ -4574,7 +4153,7 @@
           <w:sz w:val="24"/>
           <w:szCs w:val="24"/>
         </w:rPr>
-        <w:t xml:space="preserve">Εις βάρος Π/Υ έτους </w:t>
+        <w:t xml:space="preserve">Αρμοδιότητας: </w:t>
       </w:r>
       <w:r>
         <w:rPr>
@@ -4584,44 +4163,23 @@
         </w:rPr>
         <w:t>{{</w:t>
       </w:r>
+      <w:proofErr w:type="spellStart"/>
       <w:r>
         <w:rPr>
           <w:sz w:val="24"/>
           <w:szCs w:val="24"/>
           <w:lang w:val="en-US"/>
         </w:rPr>
-        <w:t>current</w:t>
-      </w:r>
-      <w:r>
-        <w:rPr>
-          <w:sz w:val="24"/>
-          <w:szCs w:val="24"/>
-          <w:lang w:val="el-GR"/>
-        </w:rPr>
-        <w:t xml:space="preserve"> </w:t>
-      </w:r>
-      <w:r>
-        <w:rPr>
-          <w:sz w:val="24"/>
-          <w:szCs w:val="24"/>
-          <w:lang w:val="en-US"/>
-        </w:rPr>
-        <w:t>year</w:t>
-      </w:r>
-      <w:r>
-        <w:rPr>
-          <w:sz w:val="24"/>
-          <w:szCs w:val="24"/>
-          <w:lang w:val="el-GR"/>
-        </w:rPr>
-        <w:t>}}</w:t>
-      </w:r>
-      <w:r>
-        <w:rPr>
-          <w:sz w:val="24"/>
-          <w:szCs w:val="24"/>
-        </w:rPr>
-        <w:t>.</w:t>
+        <w:t>armodiothtas</w:t>
+      </w:r>
+      <w:proofErr w:type="spellEnd"/>
+      <w:r>
+        <w:rPr>
+          <w:sz w:val="24"/>
+          <w:szCs w:val="24"/>
+          <w:lang w:val="el-GR"/>
+        </w:rPr>
+        <w:t>}}.</w:t>
       </w:r>
     </w:p>
     <w:p>
@@ -4653,106 +4211,18 @@
         <w:rPr>
           <w:sz w:val="24"/>
           <w:szCs w:val="24"/>
-          <w:lang w:val="el-GR"/>
         </w:rPr>
       </w:pPr>
       <w:r>
         <w:rPr>
+          <w:b/>
+          <w:bCs/>
           <w:sz w:val="24"/>
           <w:szCs w:val="24"/>
           <w:lang w:val="el-GR"/>
         </w:rPr>
         <w:tab/>
       </w:r>
-      <w:r>
-        <w:rPr>
-          <w:sz w:val="24"/>
-          <w:szCs w:val="24"/>
-          <w:lang w:val="el-GR"/>
-        </w:rPr>
-        <w:tab/>
-      </w:r>
-      <w:r>
-        <w:rPr>
-          <w:sz w:val="24"/>
-          <w:szCs w:val="24"/>
-        </w:rPr>
-        <w:t>γ.</w:t>
-      </w:r>
-      <w:r>
-        <w:rPr>
-          <w:sz w:val="24"/>
-          <w:szCs w:val="24"/>
-          <w:lang w:val="el-GR"/>
-        </w:rPr>
-        <w:tab/>
-      </w:r>
-      <w:r>
-        <w:rPr>
-          <w:sz w:val="24"/>
-          <w:szCs w:val="24"/>
-        </w:rPr>
-        <w:t xml:space="preserve">Αρμοδιότητας: </w:t>
-      </w:r>
-      <w:r>
-        <w:rPr>
-          <w:sz w:val="24"/>
-          <w:szCs w:val="24"/>
-          <w:lang w:val="el-GR"/>
-        </w:rPr>
-        <w:t>{{</w:t>
-      </w:r>
-      <w:proofErr w:type="spellStart"/>
-      <w:r>
-        <w:rPr>
-          <w:sz w:val="24"/>
-          <w:szCs w:val="24"/>
-          <w:lang w:val="en-US"/>
-        </w:rPr>
-        <w:t>armodiothtas</w:t>
-      </w:r>
-      <w:proofErr w:type="spellEnd"/>
-      <w:r>
-        <w:rPr>
-          <w:sz w:val="24"/>
-          <w:szCs w:val="24"/>
-          <w:lang w:val="el-GR"/>
-        </w:rPr>
-        <w:t>}}.</w:t>
-      </w:r>
-    </w:p>
-    <w:p>
-      <w:pPr>
-        <w:tabs>
-          <w:tab w:val="left" w:pos="426"/>
-          <w:tab w:val="left" w:pos="851"/>
-          <w:tab w:val="left" w:pos="1276"/>
-          <w:tab w:val="left" w:pos="1701"/>
-          <w:tab w:val="left" w:pos="2127"/>
-          <w:tab w:val="left" w:pos="2552"/>
-          <w:tab w:val="left" w:pos="2977"/>
-          <w:tab w:val="left" w:pos="3402"/>
-          <w:tab w:val="left" w:pos="3828"/>
-          <w:tab w:val="left" w:pos="4253"/>
-          <w:tab w:val="left" w:pos="4678"/>
-          <w:tab w:val="left" w:pos="5103"/>
-          <w:tab w:val="left" w:pos="5529"/>
-          <w:tab w:val="left" w:pos="5954"/>
-          <w:tab w:val="left" w:pos="6379"/>
-          <w:tab w:val="left" w:pos="6804"/>
-          <w:tab w:val="left" w:pos="7230"/>
-          <w:tab w:val="left" w:pos="7655"/>
-          <w:tab w:val="left" w:pos="8080"/>
-          <w:tab w:val="left" w:pos="8505"/>
-        </w:tabs>
-        <w:spacing w:before="240"/>
-        <w:ind w:firstLine="700"/>
-        <w:jc w:val="both"/>
-        <w:rPr>
-          <w:sz w:val="24"/>
-          <w:szCs w:val="24"/>
-        </w:rPr>
-      </w:pPr>
       <w:r>
         <w:rPr>
           <w:b/>
@@ -4800,7 +4270,6 @@
           <w:szCs w:val="24"/>
           <w:lang w:val="el-GR"/>
         </w:rPr>
-        <w:lastRenderedPageBreak/>
         <w:tab/>
       </w:r>
       <w:r>
@@ -4906,6 +4375,7 @@
         <w:rPr>
           <w:sz w:val="24"/>
           <w:szCs w:val="24"/>
+          <w:lang w:val="en-US"/>
         </w:rPr>
       </w:pPr>
       <w:r>
@@ -4937,6 +4407,23 @@
           <w:szCs w:val="24"/>
         </w:rPr>
         <w:t>Κατά τα λοιπά ισχύουν τα καθοριζόμενα στον σχετικό (ε) νόμο.</w:t>
+      </w:r>
+    </w:p>
+    <w:p>
+      <w:pPr>
+        <w:rPr>
+          <w:sz w:val="24"/>
+          <w:szCs w:val="24"/>
+          <w:lang w:val="en-US"/>
+        </w:rPr>
+      </w:pPr>
+      <w:r>
+        <w:rPr>
+          <w:sz w:val="24"/>
+          <w:szCs w:val="24"/>
+          <w:lang w:val="en-US"/>
+        </w:rPr>
+        <w:br w:type="page"/>
       </w:r>
     </w:p>
     <w:p>
@@ -4968,6 +4455,7 @@
         <w:rPr>
           <w:sz w:val="24"/>
           <w:szCs w:val="24"/>
+          <w:lang w:val="el-GR"/>
         </w:rPr>
       </w:pPr>
       <w:r>
@@ -4976,6 +4464,7 @@
           <w:szCs w:val="24"/>
           <w:lang w:val="el-GR"/>
         </w:rPr>
+        <w:lastRenderedPageBreak/>
         <w:tab/>
       </w:r>
       <w:r>
@@ -5204,34 +4693,24 @@
               <w:rPr>
                 <w:sz w:val="24"/>
                 <w:szCs w:val="24"/>
-                <w:lang w:val="el-GR"/>
+                <w:lang w:val="en-US"/>
               </w:rPr>
             </w:pPr>
             <w:r>
               <w:rPr>
                 <w:sz w:val="24"/>
                 <w:szCs w:val="24"/>
-                <w:highlight w:val="yellow"/>
-                <w:lang w:val="el-GR"/>
-              </w:rPr>
-              <w:t>Τοποθεσία</w:t>
-            </w:r>
-            <w:r>
-              <w:rPr>
-                <w:sz w:val="24"/>
-                <w:szCs w:val="24"/>
-                <w:highlight w:val="yellow"/>
-              </w:rPr>
-              <w:t xml:space="preserve">, </w:t>
-            </w:r>
-            <w:r>
-              <w:rPr>
-                <w:sz w:val="24"/>
-                <w:szCs w:val="24"/>
-                <w:highlight w:val="yellow"/>
-                <w:lang w:val="el-GR"/>
-              </w:rPr>
-              <w:t>................</w:t>
+                <w:lang w:val="en-US"/>
+              </w:rPr>
+              <w:t>{{</w:t>
+            </w:r>
+            <w:r>
+              <w:rPr>
+                <w:sz w:val="24"/>
+                <w:szCs w:val="24"/>
+                <w:lang w:val="en-US"/>
+              </w:rPr>
+              <w:t>SERVICE_UNIT_REGION}}, {{SHORT_DATE}}</w:t>
             </w:r>
           </w:p>
         </w:tc>
@@ -5285,12 +4764,14 @@
               <w:rPr>
                 <w:sz w:val="24"/>
                 <w:szCs w:val="24"/>
+                <w:lang w:val="en-US"/>
               </w:rPr>
             </w:pPr>
             <w:r>
               <w:rPr>
                 <w:sz w:val="24"/>
                 <w:szCs w:val="24"/>
+                <w:lang w:val="en-US"/>
               </w:rPr>
               <w:t xml:space="preserve"> </w:t>
             </w:r>
@@ -5477,24 +4958,16 @@
               <w:rPr>
                 <w:sz w:val="24"/>
                 <w:szCs w:val="24"/>
+                <w:lang w:val="en-US"/>
               </w:rPr>
             </w:pPr>
             <w:r>
               <w:rPr>
                 <w:sz w:val="24"/>
                 <w:szCs w:val="24"/>
-                <w:highlight w:val="yellow"/>
-                <w:lang w:val="el-GR"/>
-              </w:rPr>
-              <w:t>Διοικητής/</w:t>
-            </w:r>
-            <w:r>
-              <w:rPr>
-                <w:sz w:val="24"/>
-                <w:szCs w:val="24"/>
-                <w:highlight w:val="yellow"/>
-              </w:rPr>
-              <w:t>Κυβερνήτης</w:t>
+                <w:lang w:val="en-US"/>
+              </w:rPr>
+              <w:t>{{COMMANDER_ROLE_TYPE}}</w:t>
             </w:r>
           </w:p>
           <w:p>
@@ -5585,29 +5058,6 @@
     </w:p>
     <w:p>
       <w:pPr>
-        <w:tabs>
-          <w:tab w:val="left" w:pos="426"/>
-          <w:tab w:val="left" w:pos="851"/>
-          <w:tab w:val="left" w:pos="1276"/>
-          <w:tab w:val="left" w:pos="1701"/>
-          <w:tab w:val="left" w:pos="2127"/>
-          <w:tab w:val="left" w:pos="2552"/>
-          <w:tab w:val="left" w:pos="2977"/>
-          <w:tab w:val="left" w:pos="3402"/>
-          <w:tab w:val="left" w:pos="3828"/>
-          <w:tab w:val="left" w:pos="4253"/>
-          <w:tab w:val="left" w:pos="4678"/>
-          <w:tab w:val="left" w:pos="5103"/>
-          <w:tab w:val="left" w:pos="5529"/>
-          <w:tab w:val="left" w:pos="5954"/>
-          <w:tab w:val="left" w:pos="6379"/>
-          <w:tab w:val="left" w:pos="6804"/>
-          <w:tab w:val="left" w:pos="7230"/>
-          <w:tab w:val="left" w:pos="7655"/>
-          <w:tab w:val="left" w:pos="8080"/>
-          <w:tab w:val="left" w:pos="8505"/>
-        </w:tabs>
-        <w:spacing w:before="240"/>
         <w:rPr>
           <w:b/>
           <w:bCs/>
@@ -5624,7 +5074,7 @@
           <w:szCs w:val="24"/>
           <w:u w:val="single"/>
         </w:rPr>
-        <w:t xml:space="preserve"> </w:t>
+        <w:br w:type="page"/>
       </w:r>
     </w:p>
     <w:p>
@@ -5658,7 +5108,6 @@
           <w:sz w:val="24"/>
           <w:szCs w:val="24"/>
           <w:u w:val="single"/>
-          <w:lang w:val="en-US"/>
         </w:rPr>
       </w:pPr>
       <w:r>
@@ -5669,50 +5118,7 @@
           <w:szCs w:val="24"/>
           <w:u w:val="single"/>
         </w:rPr>
-        <w:t xml:space="preserve"> </w:t>
-      </w:r>
-    </w:p>
-    <w:p>
-      <w:pPr>
-        <w:tabs>
-          <w:tab w:val="left" w:pos="426"/>
-          <w:tab w:val="left" w:pos="851"/>
-          <w:tab w:val="left" w:pos="1276"/>
-          <w:tab w:val="left" w:pos="1701"/>
-          <w:tab w:val="left" w:pos="2127"/>
-          <w:tab w:val="left" w:pos="2552"/>
-          <w:tab w:val="left" w:pos="2977"/>
-          <w:tab w:val="left" w:pos="3402"/>
-          <w:tab w:val="left" w:pos="3828"/>
-          <w:tab w:val="left" w:pos="4253"/>
-          <w:tab w:val="left" w:pos="4678"/>
-          <w:tab w:val="left" w:pos="5103"/>
-          <w:tab w:val="left" w:pos="5529"/>
-          <w:tab w:val="left" w:pos="5954"/>
-          <w:tab w:val="left" w:pos="6379"/>
-          <w:tab w:val="left" w:pos="6804"/>
-          <w:tab w:val="left" w:pos="7230"/>
-          <w:tab w:val="left" w:pos="7655"/>
-          <w:tab w:val="left" w:pos="8080"/>
-          <w:tab w:val="left" w:pos="8505"/>
-        </w:tabs>
-        <w:spacing w:before="240"/>
-        <w:rPr>
-          <w:b/>
-          <w:bCs/>
-          <w:sz w:val="24"/>
-          <w:szCs w:val="24"/>
-          <w:u w:val="single"/>
-        </w:rPr>
-      </w:pPr>
-      <w:r>
-        <w:rPr>
-          <w:b/>
-          <w:bCs/>
-          <w:sz w:val="24"/>
-          <w:szCs w:val="24"/>
-          <w:u w:val="single"/>
-        </w:rPr>
+        <w:lastRenderedPageBreak/>
         <w:t>ΠΙΝΑΚΑΣ ΑΠΟΔΕΚΤΩΝ</w:t>
       </w:r>
     </w:p>

</xml_diff>

<commit_message>
made same placeholders for templates and made timing stamps to check speed of reports
</commit_message>
<xml_diff>
--- a/app/templates/docx/award_decision_template.docx
+++ b/app/templates/docx/award_decision_template.docx
@@ -4,7 +4,7 @@
   <w:body>
     <w:tbl>
       <w:tblPr>
-        <w:tblStyle w:val="TableGrid"/>
+        <w:tblStyle w:val="aa"/>
         <w:tblW w:w="0" w:type="auto"/>
         <w:tblBorders>
           <w:top w:val="none" w:sz="0" w:space="0" w:color="auto"/>
@@ -111,6 +111,7 @@
               </w:rPr>
               <w:t xml:space="preserve"> </w:t>
             </w:r>
+            <w:proofErr w:type="spellStart"/>
             <w:r>
               <w:rPr>
                 <w:sz w:val="24"/>
@@ -118,6 +119,7 @@
               </w:rPr>
               <w:t>Αποδεκτώ</w:t>
             </w:r>
+            <w:proofErr w:type="spellEnd"/>
             <w:r>
               <w:rPr>
                 <w:sz w:val="24"/>
@@ -378,13 +380,23 @@
                 <w:lang w:val="en-US"/>
               </w:rPr>
             </w:pPr>
+            <w:proofErr w:type="spellStart"/>
             <w:r>
               <w:rPr>
                 <w:sz w:val="24"/>
                 <w:szCs w:val="24"/>
                 <w:lang w:val="el-GR"/>
               </w:rPr>
-              <w:t xml:space="preserve">Τηλ: </w:t>
+              <w:t>Τηλ</w:t>
+            </w:r>
+            <w:proofErr w:type="spellEnd"/>
+            <w:r>
+              <w:rPr>
+                <w:sz w:val="24"/>
+                <w:szCs w:val="24"/>
+                <w:lang w:val="el-GR"/>
+              </w:rPr>
+              <w:t xml:space="preserve">: </w:t>
             </w:r>
             <w:r>
               <w:rPr>
@@ -785,25 +797,7 @@
           <w:sz w:val="24"/>
           <w:szCs w:val="24"/>
         </w:rPr>
-        <w:t xml:space="preserve">«Ανάθεσης για την </w:t>
-      </w:r>
-      <w:r>
-        <w:rPr>
-          <w:b/>
-          <w:bCs/>
-          <w:sz w:val="24"/>
-          <w:szCs w:val="24"/>
-        </w:rPr>
-        <w:t>{{PROC_TYPE}}</w:t>
-      </w:r>
-      <w:r>
-        <w:rPr>
-          <w:b/>
-          <w:bCs/>
-          <w:sz w:val="24"/>
-          <w:szCs w:val="24"/>
-        </w:rPr>
-        <w:t>»</w:t>
+        <w:t>«Ανάθεσης για την {{PROC_TYPE}}»</w:t>
       </w:r>
     </w:p>
     <w:p>
@@ -905,7 +899,23 @@
           <w:sz w:val="24"/>
           <w:szCs w:val="24"/>
         </w:rPr>
-        <w:t>Το Νομοθετικό Διάταγμα 721/1970 «Περί Οικονομικής Μερίμνης και Λογιστικού των   Ε.Δ», (ΦΕΚ 251Α/70).</w:t>
+        <w:t xml:space="preserve">Το Νομοθετικό Διάταγμα 721/1970 «Περί Οικονομικής </w:t>
+      </w:r>
+      <w:proofErr w:type="spellStart"/>
+      <w:r>
+        <w:rPr>
+          <w:sz w:val="24"/>
+          <w:szCs w:val="24"/>
+        </w:rPr>
+        <w:t>Μερίμνης</w:t>
+      </w:r>
+      <w:proofErr w:type="spellEnd"/>
+      <w:r>
+        <w:rPr>
+          <w:sz w:val="24"/>
+          <w:szCs w:val="24"/>
+        </w:rPr>
+        <w:t xml:space="preserve"> και Λογιστικού των   Ε.Δ», (ΦΕΚ 251Α/70).</w:t>
       </w:r>
     </w:p>
     <w:p>
@@ -1152,15 +1162,7 @@
           <w:lang w:val="el-GR"/>
         </w:rPr>
         <w:tab/>
-        <w:t xml:space="preserve">Την ΑΑΥ με αριθμό </w:t>
-      </w:r>
-      <w:r>
-        <w:rPr>
-          <w:sz w:val="24"/>
-          <w:szCs w:val="24"/>
-          <w:lang w:val="el-GR"/>
-        </w:rPr>
-        <w:t>{{</w:t>
+        <w:t>Την ΑΑΥ με αριθμό {{</w:t>
       </w:r>
       <w:r>
         <w:rPr>
@@ -1194,23 +1196,7 @@
           <w:szCs w:val="24"/>
           <w:lang w:val="el-GR"/>
         </w:rPr>
-        <w:t>}}</w:t>
-      </w:r>
-      <w:r>
-        <w:rPr>
-          <w:sz w:val="24"/>
-          <w:szCs w:val="24"/>
-          <w:lang w:val="el-GR"/>
-        </w:rPr>
-        <w:t xml:space="preserve"> και ΑΔΑΜ </w:t>
-      </w:r>
-      <w:r>
-        <w:rPr>
-          <w:sz w:val="24"/>
-          <w:szCs w:val="24"/>
-          <w:lang w:val="el-GR"/>
-        </w:rPr>
-        <w:t>{{</w:t>
+        <w:t>}} και ΑΔΑΜ {{</w:t>
       </w:r>
       <w:r>
         <w:rPr>
@@ -1262,15 +1248,7 @@
           <w:szCs w:val="24"/>
           <w:lang w:val="el-GR"/>
         </w:rPr>
-        <w:t>}}</w:t>
-      </w:r>
-      <w:r>
-        <w:rPr>
-          <w:sz w:val="24"/>
-          <w:szCs w:val="24"/>
-          <w:lang w:val="el-GR"/>
-        </w:rPr>
-        <w:t>.</w:t>
+        <w:t>}}.</w:t>
       </w:r>
     </w:p>
     <w:p>
@@ -1312,7 +1290,24 @@
           <w:lang w:val="el-GR"/>
         </w:rPr>
         <w:tab/>
-        <w:t>στ.</w:t>
+      </w:r>
+      <w:proofErr w:type="spellStart"/>
+      <w:r>
+        <w:rPr>
+          <w:sz w:val="24"/>
+          <w:szCs w:val="24"/>
+          <w:lang w:val="el-GR"/>
+        </w:rPr>
+        <w:t>στ</w:t>
+      </w:r>
+      <w:proofErr w:type="spellEnd"/>
+      <w:r>
+        <w:rPr>
+          <w:sz w:val="24"/>
+          <w:szCs w:val="24"/>
+          <w:lang w:val="el-GR"/>
+        </w:rPr>
+        <w:t>.</w:t>
       </w:r>
       <w:r>
         <w:rPr>
@@ -1367,23 +1362,7 @@
           <w:szCs w:val="24"/>
           <w:lang w:val="el-GR"/>
         </w:rPr>
-        <w:t xml:space="preserve"> </w:t>
-      </w:r>
-      <w:r>
-        <w:rPr>
-          <w:sz w:val="24"/>
-          <w:szCs w:val="24"/>
-          <w:lang w:val="el-GR"/>
-        </w:rPr>
-        <w:t>με ΑΦΜ</w:t>
-      </w:r>
-      <w:r>
-        <w:rPr>
-          <w:sz w:val="24"/>
-          <w:szCs w:val="24"/>
-          <w:lang w:val="el-GR"/>
-        </w:rPr>
-        <w:t>:</w:t>
+        <w:t xml:space="preserve"> με ΑΦΜ:</w:t>
       </w:r>
       <w:r>
         <w:rPr>
@@ -1497,16 +1476,7 @@
           <w:highlight w:val="yellow"/>
           <w:lang w:val="el-GR"/>
         </w:rPr>
-        <w:t xml:space="preserve">Την δέσμευση πίστωση με </w:t>
-      </w:r>
-      <w:r>
-        <w:rPr>
-          <w:sz w:val="24"/>
-          <w:szCs w:val="24"/>
-          <w:highlight w:val="yellow"/>
-          <w:lang w:val="el-GR"/>
-        </w:rPr>
-        <w:t>{{</w:t>
+        <w:t>Την δέσμευση πίστωση με {{</w:t>
       </w:r>
       <w:r>
         <w:rPr>
@@ -1524,8 +1494,9 @@
           <w:highlight w:val="yellow"/>
           <w:lang w:val="el-GR"/>
         </w:rPr>
-        <w:t>.identity_prosklisis}}</w:t>
-      </w:r>
+        <w:t>.</w:t>
+      </w:r>
+      <w:proofErr w:type="spellStart"/>
       <w:r>
         <w:rPr>
           <w:sz w:val="24"/>
@@ -1533,8 +1504,9 @@
           <w:highlight w:val="yellow"/>
           <w:lang w:val="el-GR"/>
         </w:rPr>
-        <w:t xml:space="preserve"> και ΑΔΑΜ: </w:t>
-      </w:r>
+        <w:t>identity_prosklisis</w:t>
+      </w:r>
+      <w:proofErr w:type="spellEnd"/>
       <w:r>
         <w:rPr>
           <w:sz w:val="24"/>
@@ -1542,17 +1514,19 @@
           <w:highlight w:val="yellow"/>
           <w:lang w:val="el-GR"/>
         </w:rPr>
-        <w:t xml:space="preserve">{{ </w:t>
-      </w:r>
+        <w:t>}} και ΑΔΑΜ: {{</w:t>
+      </w:r>
+      <w:proofErr w:type="spellStart"/>
       <w:r>
         <w:rPr>
           <w:sz w:val="24"/>
           <w:szCs w:val="24"/>
           <w:highlight w:val="yellow"/>
-          <w:lang w:val="en-US"/>
-        </w:rPr>
-        <w:t>procurement</w:t>
-      </w:r>
+          <w:lang w:val="el-GR"/>
+        </w:rPr>
+        <w:t>procurement.adam_prosklisis</w:t>
+      </w:r>
+      <w:proofErr w:type="spellEnd"/>
       <w:r>
         <w:rPr>
           <w:sz w:val="24"/>
@@ -1560,16 +1534,7 @@
           <w:highlight w:val="yellow"/>
           <w:lang w:val="el-GR"/>
         </w:rPr>
-        <w:t>.adam_prosklisis}}</w:t>
-      </w:r>
-      <w:r>
-        <w:rPr>
-          <w:sz w:val="24"/>
-          <w:szCs w:val="24"/>
-          <w:highlight w:val="yellow"/>
-          <w:lang w:val="el-GR"/>
-        </w:rPr>
-        <w:t>.</w:t>
+        <w:t>}}.</w:t>
       </w:r>
     </w:p>
     <w:p>
@@ -1703,21 +1668,7 @@
           <w:sz w:val="24"/>
           <w:szCs w:val="24"/>
         </w:rPr>
-        <w:t xml:space="preserve">ην </w:t>
-      </w:r>
-      <w:r>
-        <w:rPr>
-          <w:sz w:val="24"/>
-          <w:szCs w:val="24"/>
-        </w:rPr>
-        <w:t>{{PROC_TYPE}}</w:t>
-      </w:r>
-      <w:r>
-        <w:rPr>
-          <w:sz w:val="24"/>
-          <w:szCs w:val="24"/>
-        </w:rPr>
-        <w:t xml:space="preserve"> έναντι συνολικής αξίας</w:t>
+        <w:t>ην {{PROC_TYPE}} έναντι συνολικής αξίας</w:t>
       </w:r>
       <w:r>
         <w:rPr>
@@ -1872,6 +1823,7 @@
           <w:szCs w:val="24"/>
           <w:lang w:val="el-GR"/>
         </w:rPr>
+        <w:lastRenderedPageBreak/>
         <w:tab/>
       </w:r>
       <w:r>
@@ -1894,26 +1846,12 @@
           <w:sz w:val="24"/>
           <w:szCs w:val="24"/>
         </w:rPr>
-        <w:t xml:space="preserve">Αντικείμενο σύμβασης είναι η </w:t>
-      </w:r>
-      <w:r>
-        <w:rPr>
-          <w:sz w:val="24"/>
-          <w:szCs w:val="24"/>
-        </w:rPr>
-        <w:t>{{PROC_TYPE}}</w:t>
-      </w:r>
-      <w:r>
-        <w:rPr>
-          <w:sz w:val="24"/>
-          <w:szCs w:val="24"/>
-        </w:rPr>
-        <w:t xml:space="preserve"> ως ακολούθως:</w:t>
+        <w:t>Αντικείμενο σύμβασης είναι η {{PROC_TYPE}} ως ακολούθως:</w:t>
       </w:r>
     </w:p>
     <w:tbl>
       <w:tblPr>
-        <w:tblStyle w:val="TableGrid"/>
+        <w:tblStyle w:val="aa"/>
         <w:tblW w:w="0" w:type="auto"/>
         <w:jc w:val="center"/>
         <w:tblLook w:val="04A0" w:firstRow="1" w:lastRow="0" w:firstColumn="1" w:lastColumn="0" w:noHBand="0" w:noVBand="1"/>
@@ -1972,7 +1910,6 @@
                 <w:sz w:val="24"/>
                 <w:szCs w:val="24"/>
               </w:rPr>
-              <w:lastRenderedPageBreak/>
               <w:t>Α/Α</w:t>
             </w:r>
           </w:p>
@@ -2540,7 +2477,7 @@
     </w:p>
     <w:tbl>
       <w:tblPr>
-        <w:tblStyle w:val="TableGrid"/>
+        <w:tblStyle w:val="aa"/>
         <w:tblW w:w="0" w:type="auto"/>
         <w:jc w:val="center"/>
         <w:tblLook w:val="04A0" w:firstRow="1" w:lastRow="0" w:firstColumn="1" w:lastColumn="0" w:noHBand="0" w:noVBand="1"/>
@@ -3319,14 +3256,23 @@
                 <w:sz w:val="24"/>
                 <w:szCs w:val="24"/>
               </w:rPr>
-              <w:t>Κρατήσεις Υπερ Δημοσίου</w:t>
-            </w:r>
-            <w:r>
-              <w:rPr>
-                <w:sz w:val="24"/>
-                <w:szCs w:val="24"/>
-              </w:rPr>
-              <w:t>{{AN_PUBLIC_WITHHOLD_PERCENT}}</w:t>
+              <w:t xml:space="preserve">Κρατήσεις </w:t>
+            </w:r>
+            <w:proofErr w:type="spellStart"/>
+            <w:r>
+              <w:rPr>
+                <w:sz w:val="24"/>
+                <w:szCs w:val="24"/>
+              </w:rPr>
+              <w:t>Υπερ</w:t>
+            </w:r>
+            <w:proofErr w:type="spellEnd"/>
+            <w:r>
+              <w:rPr>
+                <w:sz w:val="24"/>
+                <w:szCs w:val="24"/>
+              </w:rPr>
+              <w:t xml:space="preserve"> Δημοσίου{{AN_PUBLIC_WITHHOLD_PERCENT}}</w:t>
             </w:r>
           </w:p>
         </w:tc>
@@ -4045,30 +3991,16 @@
         </w:rPr>
         <w:t>{{</w:t>
       </w:r>
-      <w:r>
-        <w:rPr>
-          <w:sz w:val="24"/>
-          <w:szCs w:val="24"/>
-          <w:lang w:val="en-US"/>
-        </w:rPr>
-        <w:t>current</w:t>
-      </w:r>
-      <w:r>
-        <w:rPr>
-          <w:sz w:val="24"/>
-          <w:szCs w:val="24"/>
-          <w:lang w:val="el-GR"/>
-        </w:rPr>
-        <w:t xml:space="preserve"> </w:t>
-      </w:r>
-      <w:r>
-        <w:rPr>
-          <w:sz w:val="24"/>
-          <w:szCs w:val="24"/>
-          <w:lang w:val="en-US"/>
-        </w:rPr>
-        <w:t>year</w:t>
-      </w:r>
+      <w:proofErr w:type="spellStart"/>
+      <w:r>
+        <w:rPr>
+          <w:sz w:val="24"/>
+          <w:szCs w:val="24"/>
+          <w:lang w:val="el-GR"/>
+        </w:rPr>
+        <w:t>current_year</w:t>
+      </w:r>
+      <w:proofErr w:type="spellEnd"/>
       <w:r>
         <w:rPr>
           <w:sz w:val="24"/>
@@ -4334,6 +4266,7 @@
           <w:szCs w:val="24"/>
           <w:lang w:val="el-GR"/>
         </w:rPr>
+        <w:lastRenderedPageBreak/>
         <w:tab/>
       </w:r>
       <w:r>
@@ -4375,7 +4308,7 @@
         <w:rPr>
           <w:sz w:val="24"/>
           <w:szCs w:val="24"/>
-          <w:lang w:val="en-US"/>
+          <w:lang w:val="el-GR"/>
         </w:rPr>
       </w:pPr>
       <w:r>
@@ -4414,14 +4347,14 @@
         <w:rPr>
           <w:sz w:val="24"/>
           <w:szCs w:val="24"/>
-          <w:lang w:val="en-US"/>
+          <w:lang w:val="el-GR"/>
         </w:rPr>
       </w:pPr>
       <w:r>
         <w:rPr>
           <w:sz w:val="24"/>
           <w:szCs w:val="24"/>
-          <w:lang w:val="en-US"/>
+          <w:lang w:val="el-GR"/>
         </w:rPr>
         <w:br w:type="page"/>
       </w:r>
@@ -4495,17 +4428,38 @@
           <w:szCs w:val="24"/>
           <w:highlight w:val="yellow"/>
         </w:rPr>
-        <w:t>Μη καταχωριστέα</w:t>
-      </w:r>
+        <w:t xml:space="preserve">Μη </w:t>
+      </w:r>
+      <w:proofErr w:type="spellStart"/>
       <w:r>
         <w:rPr>
           <w:sz w:val="24"/>
           <w:szCs w:val="24"/>
           <w:highlight w:val="yellow"/>
-          <w:lang w:val="el-GR"/>
-        </w:rPr>
-        <w:t>/καταχωριστέα</w:t>
-      </w:r>
+        </w:rPr>
+        <w:t>καταχωριστέα</w:t>
+      </w:r>
+      <w:proofErr w:type="spellEnd"/>
+      <w:r>
+        <w:rPr>
+          <w:sz w:val="24"/>
+          <w:szCs w:val="24"/>
+          <w:highlight w:val="yellow"/>
+          <w:lang w:val="el-GR"/>
+        </w:rPr>
+        <w:t>/</w:t>
+      </w:r>
+      <w:proofErr w:type="spellStart"/>
+      <w:r>
+        <w:rPr>
+          <w:sz w:val="24"/>
+          <w:szCs w:val="24"/>
+          <w:highlight w:val="yellow"/>
+          <w:lang w:val="el-GR"/>
+        </w:rPr>
+        <w:t>καταχωριστέα</w:t>
+      </w:r>
+      <w:proofErr w:type="spellEnd"/>
       <w:r>
         <w:rPr>
           <w:sz w:val="24"/>
@@ -4570,7 +4524,7 @@
     </w:p>
     <w:tbl>
       <w:tblPr>
-        <w:tblStyle w:val="a1"/>
+        <w:tblStyle w:val="10"/>
         <w:tblW w:w="8895" w:type="dxa"/>
         <w:tblInd w:w="0" w:type="dxa"/>
         <w:tblBorders>
@@ -5289,8 +5243,14 @@
         <w:t>{{RECIPIENTS_INFO}}</w:t>
       </w:r>
     </w:p>
+    <w:p/>
     <w:sectPr>
-      <w:headerReference w:type="default" r:id="rId6"/>
+      <w:headerReference w:type="even" r:id="rId4"/>
+      <w:headerReference w:type="default" r:id="rId5"/>
+      <w:footerReference w:type="even" r:id="rId6"/>
+      <w:footerReference w:type="default" r:id="rId7"/>
+      <w:headerReference w:type="first" r:id="rId8"/>
+      <w:footerReference w:type="first" r:id="rId9"/>
       <w:pgSz w:w="11909" w:h="16834"/>
       <w:pgMar w:top="1440" w:right="1440" w:bottom="1440" w:left="1440" w:header="720" w:footer="720" w:gutter="0"/>
       <w:pgNumType w:start="1"/>
@@ -5300,57 +5260,31 @@
 </w:document>
 </file>
 
-<file path=word/endnotes.xml><?xml version="1.0" encoding="utf-8"?>
-<w:endnotes xmlns:wpc="http://schemas.microsoft.com/office/word/2010/wordprocessingCanvas" xmlns:cx="http://schemas.microsoft.com/office/drawing/2014/chartex" xmlns:cx1="http://schemas.microsoft.com/office/drawing/2015/9/8/chartex" xmlns:cx2="http://schemas.microsoft.com/office/drawing/2015/10/21/chartex" xmlns:cx3="http://schemas.microsoft.com/office/drawing/2016/5/9/chartex" xmlns:cx4="http://schemas.microsoft.com/office/drawing/2016/5/10/chartex" xmlns:cx5="http://schemas.microsoft.com/office/drawing/2016/5/11/chartex" xmlns:cx6="http://schemas.microsoft.com/office/drawing/2016/5/12/chartex" xmlns:cx7="http://schemas.microsoft.com/office/drawing/2016/5/13/chartex" xmlns:cx8="http://schemas.microsoft.com/office/drawing/2016/5/14/chartex" xmlns:mc="http://schemas.openxmlformats.org/markup-compatibility/2006" xmlns:aink="http://schemas.microsoft.com/office/drawing/2016/ink" xmlns:am3d="http://schemas.microsoft.com/office/drawing/2017/model3d" xmlns:o="urn:schemas-microsoft-com:office:office" xmlns:oel="http://schemas.microsoft.com/office/2019/extlst" xmlns:r="http://schemas.openxmlformats.org/officeDocument/2006/relationships" xmlns:m="http://schemas.openxmlformats.org/officeDocument/2006/math" xmlns:v="urn:schemas-microsoft-com:vml" xmlns:wp14="http://schemas.microsoft.com/office/word/2010/wordprocessingDrawing" xmlns:wp="http://schemas.openxmlformats.org/drawingml/2006/wordprocessingDrawing" xmlns:w10="urn:schemas-microsoft-com:office:word" xmlns:w="http://schemas.openxmlformats.org/wordprocessingml/2006/main" xmlns:w14="http://schemas.microsoft.com/office/word/2010/wordml" xmlns:w15="http://schemas.microsoft.com/office/word/2012/wordml" xmlns:w16cex="http://schemas.microsoft.com/office/word/2018/wordml/cex" xmlns:w16cid="http://schemas.microsoft.com/office/word/2016/wordml/cid" xmlns:w16="http://schemas.microsoft.com/office/word/2018/wordml" xmlns:w16du="http://schemas.microsoft.com/office/word/2023/wordml/word16du" xmlns:w16sdtdh="http://schemas.microsoft.com/office/word/2020/wordml/sdtdatahash" xmlns:w16sdtfl="http://schemas.microsoft.com/office/word/2024/wordml/sdtformatlock" xmlns:w16se="http://schemas.microsoft.com/office/word/2015/wordml/symex" xmlns:wpg="http://schemas.microsoft.com/office/word/2010/wordprocessingGroup" xmlns:wpi="http://schemas.microsoft.com/office/word/2010/wordprocessingInk" xmlns:wne="http://schemas.microsoft.com/office/word/2006/wordml" xmlns:wps="http://schemas.microsoft.com/office/word/2010/wordprocessingShape" mc:Ignorable="w14 w15 w16se w16cid w16 w16cex w16sdtdh w16sdtfl w16du wp14">
-  <w:endnote w:type="separator" w:id="-1">
-    <w:p>
-      <w:pPr>
-        <w:spacing w:line="240" w:lineRule="auto"/>
-      </w:pPr>
-      <w:r>
-        <w:separator/>
-      </w:r>
-    </w:p>
-  </w:endnote>
-  <w:endnote w:type="continuationSeparator" w:id="0">
-    <w:p>
-      <w:pPr>
-        <w:spacing w:line="240" w:lineRule="auto"/>
-      </w:pPr>
-      <w:r>
-        <w:continuationSeparator/>
-      </w:r>
-    </w:p>
-  </w:endnote>
-</w:endnotes>
+<file path=word/footer1.xml><?xml version="1.0" encoding="utf-8"?>
+<w:ftr xmlns:wpc="http://schemas.microsoft.com/office/word/2010/wordprocessingCanvas" xmlns:cx="http://schemas.microsoft.com/office/drawing/2014/chartex" xmlns:cx1="http://schemas.microsoft.com/office/drawing/2015/9/8/chartex" xmlns:cx2="http://schemas.microsoft.com/office/drawing/2015/10/21/chartex" xmlns:cx3="http://schemas.microsoft.com/office/drawing/2016/5/9/chartex" xmlns:cx4="http://schemas.microsoft.com/office/drawing/2016/5/10/chartex" xmlns:cx5="http://schemas.microsoft.com/office/drawing/2016/5/11/chartex" xmlns:cx6="http://schemas.microsoft.com/office/drawing/2016/5/12/chartex" xmlns:cx7="http://schemas.microsoft.com/office/drawing/2016/5/13/chartex" xmlns:cx8="http://schemas.microsoft.com/office/drawing/2016/5/14/chartex" xmlns:mc="http://schemas.openxmlformats.org/markup-compatibility/2006" xmlns:aink="http://schemas.microsoft.com/office/drawing/2016/ink" xmlns:am3d="http://schemas.microsoft.com/office/drawing/2017/model3d" xmlns:o="urn:schemas-microsoft-com:office:office" xmlns:oel="http://schemas.microsoft.com/office/2019/extlst" xmlns:r="http://schemas.openxmlformats.org/officeDocument/2006/relationships" xmlns:m="http://schemas.openxmlformats.org/officeDocument/2006/math" xmlns:v="urn:schemas-microsoft-com:vml" xmlns:wp14="http://schemas.microsoft.com/office/word/2010/wordprocessingDrawing" xmlns:wp="http://schemas.openxmlformats.org/drawingml/2006/wordprocessingDrawing" xmlns:w10="urn:schemas-microsoft-com:office:word" xmlns:w="http://schemas.openxmlformats.org/wordprocessingml/2006/main" xmlns:w14="http://schemas.microsoft.com/office/word/2010/wordml" xmlns:w15="http://schemas.microsoft.com/office/word/2012/wordml" xmlns:w16cex="http://schemas.microsoft.com/office/word/2018/wordml/cex" xmlns:w16cid="http://schemas.microsoft.com/office/word/2016/wordml/cid" xmlns:w16="http://schemas.microsoft.com/office/word/2018/wordml" xmlns:w16du="http://schemas.microsoft.com/office/word/2023/wordml/word16du" xmlns:w16sdtdh="http://schemas.microsoft.com/office/word/2020/wordml/sdtdatahash" xmlns:w16sdtfl="http://schemas.microsoft.com/office/word/2024/wordml/sdtformatlock" xmlns:w16se="http://schemas.microsoft.com/office/word/2015/wordml/symex" xmlns:wpg="http://schemas.microsoft.com/office/word/2010/wordprocessingGroup" xmlns:wpi="http://schemas.microsoft.com/office/word/2010/wordprocessingInk" xmlns:wne="http://schemas.microsoft.com/office/word/2006/wordml" xmlns:wps="http://schemas.microsoft.com/office/word/2010/wordprocessingShape" mc:Ignorable="w14 w15 w16se w16cid w16 w16cex w16sdtdh w16sdtfl w16du wp14">
+  <w:p/>
+</w:ftr>
 </file>
 
-<file path=word/footnotes.xml><?xml version="1.0" encoding="utf-8"?>
-<w:footnotes xmlns:wpc="http://schemas.microsoft.com/office/word/2010/wordprocessingCanvas" xmlns:cx="http://schemas.microsoft.com/office/drawing/2014/chartex" xmlns:cx1="http://schemas.microsoft.com/office/drawing/2015/9/8/chartex" xmlns:cx2="http://schemas.microsoft.com/office/drawing/2015/10/21/chartex" xmlns:cx3="http://schemas.microsoft.com/office/drawing/2016/5/9/chartex" xmlns:cx4="http://schemas.microsoft.com/office/drawing/2016/5/10/chartex" xmlns:cx5="http://schemas.microsoft.com/office/drawing/2016/5/11/chartex" xmlns:cx6="http://schemas.microsoft.com/office/drawing/2016/5/12/chartex" xmlns:cx7="http://schemas.microsoft.com/office/drawing/2016/5/13/chartex" xmlns:cx8="http://schemas.microsoft.com/office/drawing/2016/5/14/chartex" xmlns:mc="http://schemas.openxmlformats.org/markup-compatibility/2006" xmlns:aink="http://schemas.microsoft.com/office/drawing/2016/ink" xmlns:am3d="http://schemas.microsoft.com/office/drawing/2017/model3d" xmlns:o="urn:schemas-microsoft-com:office:office" xmlns:oel="http://schemas.microsoft.com/office/2019/extlst" xmlns:r="http://schemas.openxmlformats.org/officeDocument/2006/relationships" xmlns:m="http://schemas.openxmlformats.org/officeDocument/2006/math" xmlns:v="urn:schemas-microsoft-com:vml" xmlns:wp14="http://schemas.microsoft.com/office/word/2010/wordprocessingDrawing" xmlns:wp="http://schemas.openxmlformats.org/drawingml/2006/wordprocessingDrawing" xmlns:w10="urn:schemas-microsoft-com:office:word" xmlns:w="http://schemas.openxmlformats.org/wordprocessingml/2006/main" xmlns:w14="http://schemas.microsoft.com/office/word/2010/wordml" xmlns:w15="http://schemas.microsoft.com/office/word/2012/wordml" xmlns:w16cex="http://schemas.microsoft.com/office/word/2018/wordml/cex" xmlns:w16cid="http://schemas.microsoft.com/office/word/2016/wordml/cid" xmlns:w16="http://schemas.microsoft.com/office/word/2018/wordml" xmlns:w16du="http://schemas.microsoft.com/office/word/2023/wordml/word16du" xmlns:w16sdtdh="http://schemas.microsoft.com/office/word/2020/wordml/sdtdatahash" xmlns:w16sdtfl="http://schemas.microsoft.com/office/word/2024/wordml/sdtformatlock" xmlns:w16se="http://schemas.microsoft.com/office/word/2015/wordml/symex" xmlns:wpg="http://schemas.microsoft.com/office/word/2010/wordprocessingGroup" xmlns:wpi="http://schemas.microsoft.com/office/word/2010/wordprocessingInk" xmlns:wne="http://schemas.microsoft.com/office/word/2006/wordml" xmlns:wps="http://schemas.microsoft.com/office/word/2010/wordprocessingShape" mc:Ignorable="w14 w15 w16se w16cid w16 w16cex w16sdtdh w16sdtfl w16du wp14">
-  <w:footnote w:type="separator" w:id="-1">
-    <w:p>
-      <w:pPr>
-        <w:spacing w:line="240" w:lineRule="auto"/>
-      </w:pPr>
-      <w:r>
-        <w:separator/>
-      </w:r>
-    </w:p>
-  </w:footnote>
-  <w:footnote w:type="continuationSeparator" w:id="0">
-    <w:p>
-      <w:pPr>
-        <w:spacing w:line="240" w:lineRule="auto"/>
-      </w:pPr>
-      <w:r>
-        <w:continuationSeparator/>
-      </w:r>
-    </w:p>
-  </w:footnote>
-</w:footnotes>
+<file path=word/footer2.xml><?xml version="1.0" encoding="utf-8"?>
+<w:ftr xmlns:wpc="http://schemas.microsoft.com/office/word/2010/wordprocessingCanvas" xmlns:cx="http://schemas.microsoft.com/office/drawing/2014/chartex" xmlns:cx1="http://schemas.microsoft.com/office/drawing/2015/9/8/chartex" xmlns:cx2="http://schemas.microsoft.com/office/drawing/2015/10/21/chartex" xmlns:cx3="http://schemas.microsoft.com/office/drawing/2016/5/9/chartex" xmlns:cx4="http://schemas.microsoft.com/office/drawing/2016/5/10/chartex" xmlns:cx5="http://schemas.microsoft.com/office/drawing/2016/5/11/chartex" xmlns:cx6="http://schemas.microsoft.com/office/drawing/2016/5/12/chartex" xmlns:cx7="http://schemas.microsoft.com/office/drawing/2016/5/13/chartex" xmlns:cx8="http://schemas.microsoft.com/office/drawing/2016/5/14/chartex" xmlns:mc="http://schemas.openxmlformats.org/markup-compatibility/2006" xmlns:aink="http://schemas.microsoft.com/office/drawing/2016/ink" xmlns:am3d="http://schemas.microsoft.com/office/drawing/2017/model3d" xmlns:o="urn:schemas-microsoft-com:office:office" xmlns:oel="http://schemas.microsoft.com/office/2019/extlst" xmlns:r="http://schemas.openxmlformats.org/officeDocument/2006/relationships" xmlns:m="http://schemas.openxmlformats.org/officeDocument/2006/math" xmlns:v="urn:schemas-microsoft-com:vml" xmlns:wp14="http://schemas.microsoft.com/office/word/2010/wordprocessingDrawing" xmlns:wp="http://schemas.openxmlformats.org/drawingml/2006/wordprocessingDrawing" xmlns:w10="urn:schemas-microsoft-com:office:word" xmlns:w="http://schemas.openxmlformats.org/wordprocessingml/2006/main" xmlns:w14="http://schemas.microsoft.com/office/word/2010/wordml" xmlns:w15="http://schemas.microsoft.com/office/word/2012/wordml" xmlns:w16cex="http://schemas.microsoft.com/office/word/2018/wordml/cex" xmlns:w16cid="http://schemas.microsoft.com/office/word/2016/wordml/cid" xmlns:w16="http://schemas.microsoft.com/office/word/2018/wordml" xmlns:w16du="http://schemas.microsoft.com/office/word/2023/wordml/word16du" xmlns:w16sdtdh="http://schemas.microsoft.com/office/word/2020/wordml/sdtdatahash" xmlns:w16sdtfl="http://schemas.microsoft.com/office/word/2024/wordml/sdtformatlock" xmlns:w16se="http://schemas.microsoft.com/office/word/2015/wordml/symex" xmlns:wpg="http://schemas.microsoft.com/office/word/2010/wordprocessingGroup" xmlns:wpi="http://schemas.microsoft.com/office/word/2010/wordprocessingInk" xmlns:wne="http://schemas.microsoft.com/office/word/2006/wordml" xmlns:wps="http://schemas.microsoft.com/office/word/2010/wordprocessingShape" mc:Ignorable="w14 w15 w16se w16cid w16 w16cex w16sdtdh w16sdtfl w16du wp14">
+  <w:p/>
+</w:ftr>
+</file>
+
+<file path=word/footer3.xml><?xml version="1.0" encoding="utf-8"?>
+<w:ftr xmlns:wpc="http://schemas.microsoft.com/office/word/2010/wordprocessingCanvas" xmlns:cx="http://schemas.microsoft.com/office/drawing/2014/chartex" xmlns:cx1="http://schemas.microsoft.com/office/drawing/2015/9/8/chartex" xmlns:cx2="http://schemas.microsoft.com/office/drawing/2015/10/21/chartex" xmlns:cx3="http://schemas.microsoft.com/office/drawing/2016/5/9/chartex" xmlns:cx4="http://schemas.microsoft.com/office/drawing/2016/5/10/chartex" xmlns:cx5="http://schemas.microsoft.com/office/drawing/2016/5/11/chartex" xmlns:cx6="http://schemas.microsoft.com/office/drawing/2016/5/12/chartex" xmlns:cx7="http://schemas.microsoft.com/office/drawing/2016/5/13/chartex" xmlns:cx8="http://schemas.microsoft.com/office/drawing/2016/5/14/chartex" xmlns:mc="http://schemas.openxmlformats.org/markup-compatibility/2006" xmlns:aink="http://schemas.microsoft.com/office/drawing/2016/ink" xmlns:am3d="http://schemas.microsoft.com/office/drawing/2017/model3d" xmlns:o="urn:schemas-microsoft-com:office:office" xmlns:oel="http://schemas.microsoft.com/office/2019/extlst" xmlns:r="http://schemas.openxmlformats.org/officeDocument/2006/relationships" xmlns:m="http://schemas.openxmlformats.org/officeDocument/2006/math" xmlns:v="urn:schemas-microsoft-com:vml" xmlns:wp14="http://schemas.microsoft.com/office/word/2010/wordprocessingDrawing" xmlns:wp="http://schemas.openxmlformats.org/drawingml/2006/wordprocessingDrawing" xmlns:w10="urn:schemas-microsoft-com:office:word" xmlns:w="http://schemas.openxmlformats.org/wordprocessingml/2006/main" xmlns:w14="http://schemas.microsoft.com/office/word/2010/wordml" xmlns:w15="http://schemas.microsoft.com/office/word/2012/wordml" xmlns:w16cex="http://schemas.microsoft.com/office/word/2018/wordml/cex" xmlns:w16cid="http://schemas.microsoft.com/office/word/2016/wordml/cid" xmlns:w16="http://schemas.microsoft.com/office/word/2018/wordml" xmlns:w16du="http://schemas.microsoft.com/office/word/2023/wordml/word16du" xmlns:w16sdtdh="http://schemas.microsoft.com/office/word/2020/wordml/sdtdatahash" xmlns:w16sdtfl="http://schemas.microsoft.com/office/word/2024/wordml/sdtformatlock" xmlns:w16se="http://schemas.microsoft.com/office/word/2015/wordml/symex" xmlns:wpg="http://schemas.microsoft.com/office/word/2010/wordprocessingGroup" xmlns:wpi="http://schemas.microsoft.com/office/word/2010/wordprocessingInk" xmlns:wne="http://schemas.microsoft.com/office/word/2006/wordml" xmlns:wps="http://schemas.microsoft.com/office/word/2010/wordprocessingShape" mc:Ignorable="w14 w15 w16se w16cid w16 w16cex w16sdtdh w16sdtfl w16du wp14">
+  <w:p/>
+</w:ftr>
 </file>
 
 <file path=word/header1.xml><?xml version="1.0" encoding="utf-8"?>
+<w:hdr xmlns:wpc="http://schemas.microsoft.com/office/word/2010/wordprocessingCanvas" xmlns:cx="http://schemas.microsoft.com/office/drawing/2014/chartex" xmlns:cx1="http://schemas.microsoft.com/office/drawing/2015/9/8/chartex" xmlns:cx2="http://schemas.microsoft.com/office/drawing/2015/10/21/chartex" xmlns:cx3="http://schemas.microsoft.com/office/drawing/2016/5/9/chartex" xmlns:cx4="http://schemas.microsoft.com/office/drawing/2016/5/10/chartex" xmlns:cx5="http://schemas.microsoft.com/office/drawing/2016/5/11/chartex" xmlns:cx6="http://schemas.microsoft.com/office/drawing/2016/5/12/chartex" xmlns:cx7="http://schemas.microsoft.com/office/drawing/2016/5/13/chartex" xmlns:cx8="http://schemas.microsoft.com/office/drawing/2016/5/14/chartex" xmlns:mc="http://schemas.openxmlformats.org/markup-compatibility/2006" xmlns:aink="http://schemas.microsoft.com/office/drawing/2016/ink" xmlns:am3d="http://schemas.microsoft.com/office/drawing/2017/model3d" xmlns:o="urn:schemas-microsoft-com:office:office" xmlns:oel="http://schemas.microsoft.com/office/2019/extlst" xmlns:r="http://schemas.openxmlformats.org/officeDocument/2006/relationships" xmlns:m="http://schemas.openxmlformats.org/officeDocument/2006/math" xmlns:v="urn:schemas-microsoft-com:vml" xmlns:wp14="http://schemas.microsoft.com/office/word/2010/wordprocessingDrawing" xmlns:wp="http://schemas.openxmlformats.org/drawingml/2006/wordprocessingDrawing" xmlns:w10="urn:schemas-microsoft-com:office:word" xmlns:w="http://schemas.openxmlformats.org/wordprocessingml/2006/main" xmlns:w14="http://schemas.microsoft.com/office/word/2010/wordml" xmlns:w15="http://schemas.microsoft.com/office/word/2012/wordml" xmlns:w16cex="http://schemas.microsoft.com/office/word/2018/wordml/cex" xmlns:w16cid="http://schemas.microsoft.com/office/word/2016/wordml/cid" xmlns:w16="http://schemas.microsoft.com/office/word/2018/wordml" xmlns:w16du="http://schemas.microsoft.com/office/word/2023/wordml/word16du" xmlns:w16sdtdh="http://schemas.microsoft.com/office/word/2020/wordml/sdtdatahash" xmlns:w16sdtfl="http://schemas.microsoft.com/office/word/2024/wordml/sdtformatlock" xmlns:w16se="http://schemas.microsoft.com/office/word/2015/wordml/symex" xmlns:wpg="http://schemas.microsoft.com/office/word/2010/wordprocessingGroup" xmlns:wpi="http://schemas.microsoft.com/office/word/2010/wordprocessingInk" xmlns:wne="http://schemas.microsoft.com/office/word/2006/wordml" xmlns:wps="http://schemas.microsoft.com/office/word/2010/wordprocessingShape" mc:Ignorable="w14 w15 w16se w16cid w16 w16cex w16sdtdh w16sdtfl w16du wp14">
+  <w:p/>
+</w:hdr>
+</file>
+
+<file path=word/header2.xml><?xml version="1.0" encoding="utf-8"?>
 <w:hdr xmlns:wpc="http://schemas.microsoft.com/office/word/2010/wordprocessingCanvas" xmlns:cx="http://schemas.microsoft.com/office/drawing/2014/chartex" xmlns:cx1="http://schemas.microsoft.com/office/drawing/2015/9/8/chartex" xmlns:cx2="http://schemas.microsoft.com/office/drawing/2015/10/21/chartex" xmlns:cx3="http://schemas.microsoft.com/office/drawing/2016/5/9/chartex" xmlns:cx4="http://schemas.microsoft.com/office/drawing/2016/5/10/chartex" xmlns:cx5="http://schemas.microsoft.com/office/drawing/2016/5/11/chartex" xmlns:cx6="http://schemas.microsoft.com/office/drawing/2016/5/12/chartex" xmlns:cx7="http://schemas.microsoft.com/office/drawing/2016/5/13/chartex" xmlns:cx8="http://schemas.microsoft.com/office/drawing/2016/5/14/chartex" xmlns:mc="http://schemas.openxmlformats.org/markup-compatibility/2006" xmlns:aink="http://schemas.microsoft.com/office/drawing/2016/ink" xmlns:am3d="http://schemas.microsoft.com/office/drawing/2017/model3d" xmlns:o="urn:schemas-microsoft-com:office:office" xmlns:oel="http://schemas.microsoft.com/office/2019/extlst" xmlns:r="http://schemas.openxmlformats.org/officeDocument/2006/relationships" xmlns:m="http://schemas.openxmlformats.org/officeDocument/2006/math" xmlns:v="urn:schemas-microsoft-com:vml" xmlns:wp14="http://schemas.microsoft.com/office/word/2010/wordprocessingDrawing" xmlns:wp="http://schemas.openxmlformats.org/drawingml/2006/wordprocessingDrawing" xmlns:w10="urn:schemas-microsoft-com:office:word" xmlns:w="http://schemas.openxmlformats.org/wordprocessingml/2006/main" xmlns:w14="http://schemas.microsoft.com/office/word/2010/wordml" xmlns:w15="http://schemas.microsoft.com/office/word/2012/wordml" xmlns:w16cex="http://schemas.microsoft.com/office/word/2018/wordml/cex" xmlns:w16cid="http://schemas.microsoft.com/office/word/2016/wordml/cid" xmlns:w16="http://schemas.microsoft.com/office/word/2018/wordml" xmlns:w16du="http://schemas.microsoft.com/office/word/2023/wordml/word16du" xmlns:w16sdtdh="http://schemas.microsoft.com/office/word/2020/wordml/sdtdatahash" xmlns:w16sdtfl="http://schemas.microsoft.com/office/word/2024/wordml/sdtformatlock" xmlns:w16se="http://schemas.microsoft.com/office/word/2015/wordml/symex" xmlns:wpg="http://schemas.microsoft.com/office/word/2010/wordprocessingGroup" xmlns:wpi="http://schemas.microsoft.com/office/word/2010/wordprocessingInk" xmlns:wne="http://schemas.microsoft.com/office/word/2006/wordml" xmlns:wps="http://schemas.microsoft.com/office/word/2010/wordprocessingShape" mc:Ignorable="w14 w15 w16se w16cid w16 w16cex w16sdtdh w16sdtfl w16du wp14">
   <w:p>
     <w:pPr>
@@ -5376,20 +5310,28 @@
 </w:hdr>
 </file>
 
+<file path=word/header3.xml><?xml version="1.0" encoding="utf-8"?>
+<w:hdr xmlns:wpc="http://schemas.microsoft.com/office/word/2010/wordprocessingCanvas" xmlns:cx="http://schemas.microsoft.com/office/drawing/2014/chartex" xmlns:cx1="http://schemas.microsoft.com/office/drawing/2015/9/8/chartex" xmlns:cx2="http://schemas.microsoft.com/office/drawing/2015/10/21/chartex" xmlns:cx3="http://schemas.microsoft.com/office/drawing/2016/5/9/chartex" xmlns:cx4="http://schemas.microsoft.com/office/drawing/2016/5/10/chartex" xmlns:cx5="http://schemas.microsoft.com/office/drawing/2016/5/11/chartex" xmlns:cx6="http://schemas.microsoft.com/office/drawing/2016/5/12/chartex" xmlns:cx7="http://schemas.microsoft.com/office/drawing/2016/5/13/chartex" xmlns:cx8="http://schemas.microsoft.com/office/drawing/2016/5/14/chartex" xmlns:mc="http://schemas.openxmlformats.org/markup-compatibility/2006" xmlns:aink="http://schemas.microsoft.com/office/drawing/2016/ink" xmlns:am3d="http://schemas.microsoft.com/office/drawing/2017/model3d" xmlns:o="urn:schemas-microsoft-com:office:office" xmlns:oel="http://schemas.microsoft.com/office/2019/extlst" xmlns:r="http://schemas.openxmlformats.org/officeDocument/2006/relationships" xmlns:m="http://schemas.openxmlformats.org/officeDocument/2006/math" xmlns:v="urn:schemas-microsoft-com:vml" xmlns:wp14="http://schemas.microsoft.com/office/word/2010/wordprocessingDrawing" xmlns:wp="http://schemas.openxmlformats.org/drawingml/2006/wordprocessingDrawing" xmlns:w10="urn:schemas-microsoft-com:office:word" xmlns:w="http://schemas.openxmlformats.org/wordprocessingml/2006/main" xmlns:w14="http://schemas.microsoft.com/office/word/2010/wordml" xmlns:w15="http://schemas.microsoft.com/office/word/2012/wordml" xmlns:w16cex="http://schemas.microsoft.com/office/word/2018/wordml/cex" xmlns:w16cid="http://schemas.microsoft.com/office/word/2016/wordml/cid" xmlns:w16="http://schemas.microsoft.com/office/word/2018/wordml" xmlns:w16du="http://schemas.microsoft.com/office/word/2023/wordml/word16du" xmlns:w16sdtdh="http://schemas.microsoft.com/office/word/2020/wordml/sdtdatahash" xmlns:w16sdtfl="http://schemas.microsoft.com/office/word/2024/wordml/sdtformatlock" xmlns:w16se="http://schemas.microsoft.com/office/word/2015/wordml/symex" xmlns:wpg="http://schemas.microsoft.com/office/word/2010/wordprocessingGroup" xmlns:wpi="http://schemas.microsoft.com/office/word/2010/wordprocessingInk" xmlns:wne="http://schemas.microsoft.com/office/word/2006/wordml" xmlns:wps="http://schemas.microsoft.com/office/word/2010/wordprocessingShape" mc:Ignorable="w14 w15 w16se w16cid w16 w16cex w16sdtdh w16sdtfl w16du wp14">
+  <w:p/>
+</w:hdr>
+</file>
+
 <file path=word/styles.xml><?xml version="1.0" encoding="utf-8"?>
 <w:styles xmlns:mc="http://schemas.openxmlformats.org/markup-compatibility/2006" xmlns:r="http://schemas.openxmlformats.org/officeDocument/2006/relationships" xmlns:w="http://schemas.openxmlformats.org/wordprocessingml/2006/main" xmlns:w14="http://schemas.microsoft.com/office/word/2010/wordml" xmlns:w15="http://schemas.microsoft.com/office/word/2012/wordml" xmlns:w16cex="http://schemas.microsoft.com/office/word/2018/wordml/cex" xmlns:w16cid="http://schemas.microsoft.com/office/word/2016/wordml/cid" xmlns:w16="http://schemas.microsoft.com/office/word/2018/wordml" xmlns:w16du="http://schemas.microsoft.com/office/word/2023/wordml/word16du" xmlns:w16sdtdh="http://schemas.microsoft.com/office/word/2020/wordml/sdtdatahash" xmlns:w16sdtfl="http://schemas.microsoft.com/office/word/2024/wordml/sdtformatlock" xmlns:w16se="http://schemas.microsoft.com/office/word/2015/wordml/symex" mc:Ignorable="w14 w15 w16se w16cid w16 w16cex w16sdtdh w16sdtfl w16du">
   <w:docDefaults>
     <w:rPrDefault>
       <w:rPr>
-        <w:rFonts w:ascii="Arial" w:eastAsia="Arial" w:hAnsi="Arial" w:cs="Arial"/>
+        <w:rFonts w:asciiTheme="minorHAnsi" w:eastAsiaTheme="minorHAnsi" w:hAnsiTheme="minorHAnsi" w:cstheme="minorBidi"/>
+        <w:kern w:val="2"/>
         <w:sz w:val="22"/>
         <w:szCs w:val="22"/>
-        <w:lang w:val="el" w:eastAsia="el-GR" w:bidi="ar-SA"/>
+        <w:lang w:val="el-GR" w:eastAsia="en-US" w:bidi="ar-SA"/>
+        <w14:ligatures w14:val="standardContextual"/>
       </w:rPr>
     </w:rPrDefault>
     <w:pPrDefault>
       <w:pPr>
-        <w:spacing w:line="276" w:lineRule="auto"/>
+        <w:spacing w:after="160" w:line="259" w:lineRule="auto"/>
       </w:pPr>
     </w:pPrDefault>
   </w:docDefaults>
@@ -5771,131 +5713,253 @@
     <w:lsdException w:name="Unresolved Mention" w:semiHidden="1" w:unhideWhenUsed="1"/>
     <w:lsdException w:name="Smart Link" w:semiHidden="1" w:unhideWhenUsed="1"/>
   </w:latentStyles>
-  <w:style w:type="paragraph" w:default="1" w:styleId="Normal">
+  <w:style w:type="paragraph" w:default="1" w:styleId="a">
     <w:name w:val="Normal"/>
     <w:qFormat/>
+    <w:rsid w:val="00002DAB"/>
+    <w:pPr>
+      <w:spacing w:after="0" w:line="276" w:lineRule="auto"/>
+    </w:pPr>
+    <w:rPr>
+      <w:rFonts w:ascii="Arial" w:eastAsia="Arial" w:hAnsi="Arial" w:cs="Arial"/>
+      <w:kern w:val="0"/>
+      <w:lang w:val="el" w:eastAsia="el-GR"/>
+      <w14:ligatures w14:val="none"/>
+    </w:rPr>
   </w:style>
-  <w:style w:type="paragraph" w:styleId="Heading1">
+  <w:style w:type="paragraph" w:styleId="1">
     <w:name w:val="heading 1"/>
-    <w:basedOn w:val="Normal"/>
-    <w:next w:val="Normal"/>
+    <w:basedOn w:val="a"/>
+    <w:next w:val="a"/>
+    <w:link w:val="1Char"/>
     <w:uiPriority w:val="9"/>
     <w:qFormat/>
+    <w:rsid w:val="00656914"/>
     <w:pPr>
       <w:keepNext/>
       <w:keepLines/>
-      <w:spacing w:before="400" w:after="120"/>
+      <w:spacing w:before="360" w:after="80" w:line="259" w:lineRule="auto"/>
       <w:outlineLvl w:val="0"/>
     </w:pPr>
     <w:rPr>
+      <w:rFonts w:asciiTheme="majorHAnsi" w:eastAsiaTheme="majorEastAsia" w:hAnsiTheme="majorHAnsi" w:cstheme="majorBidi"/>
+      <w:color w:val="0F4761" w:themeColor="accent1" w:themeShade="BF"/>
+      <w:kern w:val="2"/>
       <w:sz w:val="40"/>
       <w:szCs w:val="40"/>
+      <w:lang w:val="el-GR" w:eastAsia="en-US"/>
+      <w14:ligatures w14:val="standardContextual"/>
     </w:rPr>
   </w:style>
-  <w:style w:type="paragraph" w:styleId="Heading2">
+  <w:style w:type="paragraph" w:styleId="2">
     <w:name w:val="heading 2"/>
-    <w:basedOn w:val="Normal"/>
-    <w:next w:val="Normal"/>
+    <w:basedOn w:val="a"/>
+    <w:next w:val="a"/>
+    <w:link w:val="2Char"/>
     <w:uiPriority w:val="9"/>
     <w:semiHidden/>
     <w:unhideWhenUsed/>
     <w:qFormat/>
+    <w:rsid w:val="00656914"/>
     <w:pPr>
       <w:keepNext/>
       <w:keepLines/>
-      <w:spacing w:before="360" w:after="120"/>
+      <w:spacing w:before="160" w:after="80" w:line="259" w:lineRule="auto"/>
       <w:outlineLvl w:val="1"/>
     </w:pPr>
     <w:rPr>
+      <w:rFonts w:asciiTheme="majorHAnsi" w:eastAsiaTheme="majorEastAsia" w:hAnsiTheme="majorHAnsi" w:cstheme="majorBidi"/>
+      <w:color w:val="0F4761" w:themeColor="accent1" w:themeShade="BF"/>
+      <w:kern w:val="2"/>
       <w:sz w:val="32"/>
       <w:szCs w:val="32"/>
+      <w:lang w:val="el-GR" w:eastAsia="en-US"/>
+      <w14:ligatures w14:val="standardContextual"/>
     </w:rPr>
   </w:style>
-  <w:style w:type="paragraph" w:styleId="Heading3">
+  <w:style w:type="paragraph" w:styleId="3">
     <w:name w:val="heading 3"/>
-    <w:basedOn w:val="Normal"/>
-    <w:next w:val="Normal"/>
+    <w:basedOn w:val="a"/>
+    <w:next w:val="a"/>
+    <w:link w:val="3Char"/>
     <w:uiPriority w:val="9"/>
     <w:semiHidden/>
     <w:unhideWhenUsed/>
     <w:qFormat/>
+    <w:rsid w:val="00656914"/>
     <w:pPr>
       <w:keepNext/>
       <w:keepLines/>
-      <w:spacing w:before="320" w:after="80"/>
+      <w:spacing w:before="160" w:after="80" w:line="259" w:lineRule="auto"/>
       <w:outlineLvl w:val="2"/>
     </w:pPr>
     <w:rPr>
-      <w:color w:val="434343"/>
+      <w:rFonts w:asciiTheme="minorHAnsi" w:eastAsiaTheme="majorEastAsia" w:hAnsiTheme="minorHAnsi" w:cstheme="majorBidi"/>
+      <w:color w:val="0F4761" w:themeColor="accent1" w:themeShade="BF"/>
+      <w:kern w:val="2"/>
       <w:sz w:val="28"/>
       <w:szCs w:val="28"/>
+      <w:lang w:val="el-GR" w:eastAsia="en-US"/>
+      <w14:ligatures w14:val="standardContextual"/>
     </w:rPr>
   </w:style>
-  <w:style w:type="paragraph" w:styleId="Heading4">
+  <w:style w:type="paragraph" w:styleId="4">
     <w:name w:val="heading 4"/>
-    <w:basedOn w:val="Normal"/>
-    <w:next w:val="Normal"/>
+    <w:basedOn w:val="a"/>
+    <w:next w:val="a"/>
+    <w:link w:val="4Char"/>
     <w:uiPriority w:val="9"/>
     <w:semiHidden/>
     <w:unhideWhenUsed/>
     <w:qFormat/>
+    <w:rsid w:val="00656914"/>
     <w:pPr>
       <w:keepNext/>
       <w:keepLines/>
-      <w:spacing w:before="280" w:after="80"/>
+      <w:spacing w:before="80" w:after="40" w:line="259" w:lineRule="auto"/>
       <w:outlineLvl w:val="3"/>
     </w:pPr>
     <w:rPr>
-      <w:color w:val="666666"/>
-      <w:sz w:val="24"/>
-      <w:szCs w:val="24"/>
+      <w:rFonts w:asciiTheme="minorHAnsi" w:eastAsiaTheme="majorEastAsia" w:hAnsiTheme="minorHAnsi" w:cstheme="majorBidi"/>
+      <w:i/>
+      <w:iCs/>
+      <w:color w:val="0F4761" w:themeColor="accent1" w:themeShade="BF"/>
+      <w:kern w:val="2"/>
+      <w:lang w:val="el-GR" w:eastAsia="en-US"/>
+      <w14:ligatures w14:val="standardContextual"/>
     </w:rPr>
   </w:style>
-  <w:style w:type="paragraph" w:styleId="Heading5">
+  <w:style w:type="paragraph" w:styleId="5">
     <w:name w:val="heading 5"/>
-    <w:basedOn w:val="Normal"/>
-    <w:next w:val="Normal"/>
+    <w:basedOn w:val="a"/>
+    <w:next w:val="a"/>
+    <w:link w:val="5Char"/>
     <w:uiPriority w:val="9"/>
     <w:semiHidden/>
     <w:unhideWhenUsed/>
     <w:qFormat/>
+    <w:rsid w:val="00656914"/>
     <w:pPr>
       <w:keepNext/>
       <w:keepLines/>
-      <w:spacing w:before="240" w:after="80"/>
+      <w:spacing w:before="80" w:after="40" w:line="259" w:lineRule="auto"/>
       <w:outlineLvl w:val="4"/>
     </w:pPr>
     <w:rPr>
-      <w:color w:val="666666"/>
+      <w:rFonts w:asciiTheme="minorHAnsi" w:eastAsiaTheme="majorEastAsia" w:hAnsiTheme="minorHAnsi" w:cstheme="majorBidi"/>
+      <w:color w:val="0F4761" w:themeColor="accent1" w:themeShade="BF"/>
+      <w:kern w:val="2"/>
+      <w:lang w:val="el-GR" w:eastAsia="en-US"/>
+      <w14:ligatures w14:val="standardContextual"/>
     </w:rPr>
   </w:style>
-  <w:style w:type="paragraph" w:styleId="Heading6">
+  <w:style w:type="paragraph" w:styleId="6">
     <w:name w:val="heading 6"/>
-    <w:basedOn w:val="Normal"/>
-    <w:next w:val="Normal"/>
+    <w:basedOn w:val="a"/>
+    <w:next w:val="a"/>
+    <w:link w:val="6Char"/>
     <w:uiPriority w:val="9"/>
     <w:semiHidden/>
     <w:unhideWhenUsed/>
     <w:qFormat/>
+    <w:rsid w:val="00656914"/>
     <w:pPr>
       <w:keepNext/>
       <w:keepLines/>
-      <w:spacing w:before="240" w:after="80"/>
+      <w:spacing w:before="40" w:line="259" w:lineRule="auto"/>
       <w:outlineLvl w:val="5"/>
     </w:pPr>
     <w:rPr>
+      <w:rFonts w:asciiTheme="minorHAnsi" w:eastAsiaTheme="majorEastAsia" w:hAnsiTheme="minorHAnsi" w:cstheme="majorBidi"/>
       <w:i/>
       <w:iCs/>
-      <w:color w:val="666666"/>
+      <w:color w:val="595959" w:themeColor="text1" w:themeTint="A6"/>
+      <w:kern w:val="2"/>
+      <w:lang w:val="el-GR" w:eastAsia="en-US"/>
+      <w14:ligatures w14:val="standardContextual"/>
     </w:rPr>
   </w:style>
-  <w:style w:type="character" w:default="1" w:styleId="DefaultParagraphFont">
+  <w:style w:type="paragraph" w:styleId="7">
+    <w:name w:val="heading 7"/>
+    <w:basedOn w:val="a"/>
+    <w:next w:val="a"/>
+    <w:link w:val="7Char"/>
+    <w:uiPriority w:val="9"/>
+    <w:semiHidden/>
+    <w:unhideWhenUsed/>
+    <w:qFormat/>
+    <w:rsid w:val="00656914"/>
+    <w:pPr>
+      <w:keepNext/>
+      <w:keepLines/>
+      <w:spacing w:before="40" w:line="259" w:lineRule="auto"/>
+      <w:outlineLvl w:val="6"/>
+    </w:pPr>
+    <w:rPr>
+      <w:rFonts w:asciiTheme="minorHAnsi" w:eastAsiaTheme="majorEastAsia" w:hAnsiTheme="minorHAnsi" w:cstheme="majorBidi"/>
+      <w:color w:val="595959" w:themeColor="text1" w:themeTint="A6"/>
+      <w:kern w:val="2"/>
+      <w:lang w:val="el-GR" w:eastAsia="en-US"/>
+      <w14:ligatures w14:val="standardContextual"/>
+    </w:rPr>
+  </w:style>
+  <w:style w:type="paragraph" w:styleId="8">
+    <w:name w:val="heading 8"/>
+    <w:basedOn w:val="a"/>
+    <w:next w:val="a"/>
+    <w:link w:val="8Char"/>
+    <w:uiPriority w:val="9"/>
+    <w:semiHidden/>
+    <w:unhideWhenUsed/>
+    <w:qFormat/>
+    <w:rsid w:val="00656914"/>
+    <w:pPr>
+      <w:keepNext/>
+      <w:keepLines/>
+      <w:spacing w:line="259" w:lineRule="auto"/>
+      <w:outlineLvl w:val="7"/>
+    </w:pPr>
+    <w:rPr>
+      <w:rFonts w:asciiTheme="minorHAnsi" w:eastAsiaTheme="majorEastAsia" w:hAnsiTheme="minorHAnsi" w:cstheme="majorBidi"/>
+      <w:i/>
+      <w:iCs/>
+      <w:color w:val="272727" w:themeColor="text1" w:themeTint="D8"/>
+      <w:kern w:val="2"/>
+      <w:lang w:val="el-GR" w:eastAsia="en-US"/>
+      <w14:ligatures w14:val="standardContextual"/>
+    </w:rPr>
+  </w:style>
+  <w:style w:type="paragraph" w:styleId="9">
+    <w:name w:val="heading 9"/>
+    <w:basedOn w:val="a"/>
+    <w:next w:val="a"/>
+    <w:link w:val="9Char"/>
+    <w:uiPriority w:val="9"/>
+    <w:semiHidden/>
+    <w:unhideWhenUsed/>
+    <w:qFormat/>
+    <w:rsid w:val="00656914"/>
+    <w:pPr>
+      <w:keepNext/>
+      <w:keepLines/>
+      <w:spacing w:line="259" w:lineRule="auto"/>
+      <w:outlineLvl w:val="8"/>
+    </w:pPr>
+    <w:rPr>
+      <w:rFonts w:asciiTheme="minorHAnsi" w:eastAsiaTheme="majorEastAsia" w:hAnsiTheme="minorHAnsi" w:cstheme="majorBidi"/>
+      <w:color w:val="272727" w:themeColor="text1" w:themeTint="D8"/>
+      <w:kern w:val="2"/>
+      <w:lang w:val="el-GR" w:eastAsia="en-US"/>
+      <w14:ligatures w14:val="standardContextual"/>
+    </w:rPr>
+  </w:style>
+  <w:style w:type="character" w:default="1" w:styleId="a0">
     <w:name w:val="Default Paragraph Font"/>
     <w:uiPriority w:val="1"/>
     <w:semiHidden/>
     <w:unhideWhenUsed/>
   </w:style>
-  <w:style w:type="table" w:default="1" w:styleId="TableNormal">
+  <w:style w:type="table" w:default="1" w:styleId="a1">
     <w:name w:val="Normal Table"/>
     <w:uiPriority w:val="99"/>
     <w:semiHidden/>
@@ -5910,15 +5974,340 @@
       </w:tblCellMar>
     </w:tblPr>
   </w:style>
-  <w:style w:type="numbering" w:default="1" w:styleId="NoList">
+  <w:style w:type="numbering" w:default="1" w:styleId="a2">
     <w:name w:val="No List"/>
     <w:uiPriority w:val="99"/>
     <w:semiHidden/>
     <w:unhideWhenUsed/>
   </w:style>
-  <w:style w:type="table" w:customStyle="1" w:styleId="TableNormal0">
-    <w:name w:val="TableNormal"/>
+  <w:style w:type="character" w:customStyle="1" w:styleId="1Char">
+    <w:name w:val="Επικεφαλίδα 1 Char"/>
+    <w:basedOn w:val="a0"/>
+    <w:link w:val="1"/>
+    <w:uiPriority w:val="9"/>
+    <w:rsid w:val="00656914"/>
+    <w:rPr>
+      <w:rFonts w:asciiTheme="majorHAnsi" w:eastAsiaTheme="majorEastAsia" w:hAnsiTheme="majorHAnsi" w:cstheme="majorBidi"/>
+      <w:color w:val="0F4761" w:themeColor="accent1" w:themeShade="BF"/>
+      <w:sz w:val="40"/>
+      <w:szCs w:val="40"/>
+    </w:rPr>
+  </w:style>
+  <w:style w:type="character" w:customStyle="1" w:styleId="2Char">
+    <w:name w:val="Επικεφαλίδα 2 Char"/>
+    <w:basedOn w:val="a0"/>
+    <w:link w:val="2"/>
+    <w:uiPriority w:val="9"/>
+    <w:semiHidden/>
+    <w:rsid w:val="00656914"/>
+    <w:rPr>
+      <w:rFonts w:asciiTheme="majorHAnsi" w:eastAsiaTheme="majorEastAsia" w:hAnsiTheme="majorHAnsi" w:cstheme="majorBidi"/>
+      <w:color w:val="0F4761" w:themeColor="accent1" w:themeShade="BF"/>
+      <w:sz w:val="32"/>
+      <w:szCs w:val="32"/>
+    </w:rPr>
+  </w:style>
+  <w:style w:type="character" w:customStyle="1" w:styleId="3Char">
+    <w:name w:val="Επικεφαλίδα 3 Char"/>
+    <w:basedOn w:val="a0"/>
+    <w:link w:val="3"/>
+    <w:uiPriority w:val="9"/>
+    <w:semiHidden/>
+    <w:rsid w:val="00656914"/>
+    <w:rPr>
+      <w:rFonts w:eastAsiaTheme="majorEastAsia" w:cstheme="majorBidi"/>
+      <w:color w:val="0F4761" w:themeColor="accent1" w:themeShade="BF"/>
+      <w:sz w:val="28"/>
+      <w:szCs w:val="28"/>
+    </w:rPr>
+  </w:style>
+  <w:style w:type="character" w:customStyle="1" w:styleId="4Char">
+    <w:name w:val="Επικεφαλίδα 4 Char"/>
+    <w:basedOn w:val="a0"/>
+    <w:link w:val="4"/>
+    <w:uiPriority w:val="9"/>
+    <w:semiHidden/>
+    <w:rsid w:val="00656914"/>
+    <w:rPr>
+      <w:rFonts w:eastAsiaTheme="majorEastAsia" w:cstheme="majorBidi"/>
+      <w:i/>
+      <w:iCs/>
+      <w:color w:val="0F4761" w:themeColor="accent1" w:themeShade="BF"/>
+    </w:rPr>
+  </w:style>
+  <w:style w:type="character" w:customStyle="1" w:styleId="5Char">
+    <w:name w:val="Επικεφαλίδα 5 Char"/>
+    <w:basedOn w:val="a0"/>
+    <w:link w:val="5"/>
+    <w:uiPriority w:val="9"/>
+    <w:semiHidden/>
+    <w:rsid w:val="00656914"/>
+    <w:rPr>
+      <w:rFonts w:eastAsiaTheme="majorEastAsia" w:cstheme="majorBidi"/>
+      <w:color w:val="0F4761" w:themeColor="accent1" w:themeShade="BF"/>
+    </w:rPr>
+  </w:style>
+  <w:style w:type="character" w:customStyle="1" w:styleId="6Char">
+    <w:name w:val="Επικεφαλίδα 6 Char"/>
+    <w:basedOn w:val="a0"/>
+    <w:link w:val="6"/>
+    <w:uiPriority w:val="9"/>
+    <w:semiHidden/>
+    <w:rsid w:val="00656914"/>
+    <w:rPr>
+      <w:rFonts w:eastAsiaTheme="majorEastAsia" w:cstheme="majorBidi"/>
+      <w:i/>
+      <w:iCs/>
+      <w:color w:val="595959" w:themeColor="text1" w:themeTint="A6"/>
+    </w:rPr>
+  </w:style>
+  <w:style w:type="character" w:customStyle="1" w:styleId="7Char">
+    <w:name w:val="Επικεφαλίδα 7 Char"/>
+    <w:basedOn w:val="a0"/>
+    <w:link w:val="7"/>
+    <w:uiPriority w:val="9"/>
+    <w:semiHidden/>
+    <w:rsid w:val="00656914"/>
+    <w:rPr>
+      <w:rFonts w:eastAsiaTheme="majorEastAsia" w:cstheme="majorBidi"/>
+      <w:color w:val="595959" w:themeColor="text1" w:themeTint="A6"/>
+    </w:rPr>
+  </w:style>
+  <w:style w:type="character" w:customStyle="1" w:styleId="8Char">
+    <w:name w:val="Επικεφαλίδα 8 Char"/>
+    <w:basedOn w:val="a0"/>
+    <w:link w:val="8"/>
+    <w:uiPriority w:val="9"/>
+    <w:semiHidden/>
+    <w:rsid w:val="00656914"/>
+    <w:rPr>
+      <w:rFonts w:eastAsiaTheme="majorEastAsia" w:cstheme="majorBidi"/>
+      <w:i/>
+      <w:iCs/>
+      <w:color w:val="272727" w:themeColor="text1" w:themeTint="D8"/>
+    </w:rPr>
+  </w:style>
+  <w:style w:type="character" w:customStyle="1" w:styleId="9Char">
+    <w:name w:val="Επικεφαλίδα 9 Char"/>
+    <w:basedOn w:val="a0"/>
+    <w:link w:val="9"/>
+    <w:uiPriority w:val="9"/>
+    <w:semiHidden/>
+    <w:rsid w:val="00656914"/>
+    <w:rPr>
+      <w:rFonts w:eastAsiaTheme="majorEastAsia" w:cstheme="majorBidi"/>
+      <w:color w:val="272727" w:themeColor="text1" w:themeTint="D8"/>
+    </w:rPr>
+  </w:style>
+  <w:style w:type="paragraph" w:styleId="a3">
+    <w:name w:val="Title"/>
+    <w:basedOn w:val="a"/>
+    <w:next w:val="a"/>
+    <w:link w:val="Char"/>
+    <w:uiPriority w:val="10"/>
+    <w:qFormat/>
+    <w:rsid w:val="00656914"/>
+    <w:pPr>
+      <w:spacing w:after="80" w:line="240" w:lineRule="auto"/>
+      <w:contextualSpacing/>
+    </w:pPr>
+    <w:rPr>
+      <w:rFonts w:asciiTheme="majorHAnsi" w:eastAsiaTheme="majorEastAsia" w:hAnsiTheme="majorHAnsi" w:cstheme="majorBidi"/>
+      <w:spacing w:val="-10"/>
+      <w:kern w:val="28"/>
+      <w:sz w:val="56"/>
+      <w:szCs w:val="56"/>
+      <w:lang w:val="el-GR" w:eastAsia="en-US"/>
+      <w14:ligatures w14:val="standardContextual"/>
+    </w:rPr>
+  </w:style>
+  <w:style w:type="character" w:customStyle="1" w:styleId="Char">
+    <w:name w:val="Τίτλος Char"/>
+    <w:basedOn w:val="a0"/>
+    <w:link w:val="a3"/>
+    <w:uiPriority w:val="10"/>
+    <w:rsid w:val="00656914"/>
+    <w:rPr>
+      <w:rFonts w:asciiTheme="majorHAnsi" w:eastAsiaTheme="majorEastAsia" w:hAnsiTheme="majorHAnsi" w:cstheme="majorBidi"/>
+      <w:spacing w:val="-10"/>
+      <w:kern w:val="28"/>
+      <w:sz w:val="56"/>
+      <w:szCs w:val="56"/>
+    </w:rPr>
+  </w:style>
+  <w:style w:type="paragraph" w:styleId="a4">
+    <w:name w:val="Subtitle"/>
+    <w:basedOn w:val="a"/>
+    <w:next w:val="a"/>
+    <w:link w:val="Char0"/>
+    <w:uiPriority w:val="11"/>
+    <w:qFormat/>
+    <w:rsid w:val="00656914"/>
+    <w:pPr>
+      <w:numPr>
+        <w:ilvl w:val="1"/>
+      </w:numPr>
+      <w:spacing w:after="160" w:line="259" w:lineRule="auto"/>
+    </w:pPr>
+    <w:rPr>
+      <w:rFonts w:asciiTheme="minorHAnsi" w:eastAsiaTheme="majorEastAsia" w:hAnsiTheme="minorHAnsi" w:cstheme="majorBidi"/>
+      <w:color w:val="595959" w:themeColor="text1" w:themeTint="A6"/>
+      <w:spacing w:val="15"/>
+      <w:kern w:val="2"/>
+      <w:sz w:val="28"/>
+      <w:szCs w:val="28"/>
+      <w:lang w:val="el-GR" w:eastAsia="en-US"/>
+      <w14:ligatures w14:val="standardContextual"/>
+    </w:rPr>
+  </w:style>
+  <w:style w:type="character" w:customStyle="1" w:styleId="Char0">
+    <w:name w:val="Υπότιτλος Char"/>
+    <w:basedOn w:val="a0"/>
+    <w:link w:val="a4"/>
+    <w:uiPriority w:val="11"/>
+    <w:rsid w:val="00656914"/>
+    <w:rPr>
+      <w:rFonts w:eastAsiaTheme="majorEastAsia" w:cstheme="majorBidi"/>
+      <w:color w:val="595959" w:themeColor="text1" w:themeTint="A6"/>
+      <w:spacing w:val="15"/>
+      <w:sz w:val="28"/>
+      <w:szCs w:val="28"/>
+    </w:rPr>
+  </w:style>
+  <w:style w:type="paragraph" w:styleId="a5">
+    <w:name w:val="Quote"/>
+    <w:basedOn w:val="a"/>
+    <w:next w:val="a"/>
+    <w:link w:val="Char1"/>
+    <w:uiPriority w:val="29"/>
+    <w:qFormat/>
+    <w:rsid w:val="00656914"/>
+    <w:pPr>
+      <w:spacing w:before="160" w:after="160" w:line="259" w:lineRule="auto"/>
+      <w:jc w:val="center"/>
+    </w:pPr>
+    <w:rPr>
+      <w:rFonts w:asciiTheme="minorHAnsi" w:eastAsiaTheme="minorHAnsi" w:hAnsiTheme="minorHAnsi" w:cstheme="minorBidi"/>
+      <w:i/>
+      <w:iCs/>
+      <w:color w:val="404040" w:themeColor="text1" w:themeTint="BF"/>
+      <w:kern w:val="2"/>
+      <w:lang w:val="el-GR" w:eastAsia="en-US"/>
+      <w14:ligatures w14:val="standardContextual"/>
+    </w:rPr>
+  </w:style>
+  <w:style w:type="character" w:customStyle="1" w:styleId="Char1">
+    <w:name w:val="Απόσπασμα Char"/>
+    <w:basedOn w:val="a0"/>
+    <w:link w:val="a5"/>
+    <w:uiPriority w:val="29"/>
+    <w:rsid w:val="00656914"/>
+    <w:rPr>
+      <w:i/>
+      <w:iCs/>
+      <w:color w:val="404040" w:themeColor="text1" w:themeTint="BF"/>
+    </w:rPr>
+  </w:style>
+  <w:style w:type="paragraph" w:styleId="a6">
+    <w:name w:val="List Paragraph"/>
+    <w:basedOn w:val="a"/>
+    <w:uiPriority w:val="34"/>
+    <w:qFormat/>
+    <w:rsid w:val="00656914"/>
+    <w:pPr>
+      <w:spacing w:after="160" w:line="259" w:lineRule="auto"/>
+      <w:ind w:left="720"/>
+      <w:contextualSpacing/>
+    </w:pPr>
+    <w:rPr>
+      <w:rFonts w:asciiTheme="minorHAnsi" w:eastAsiaTheme="minorHAnsi" w:hAnsiTheme="minorHAnsi" w:cstheme="minorBidi"/>
+      <w:kern w:val="2"/>
+      <w:lang w:val="el-GR" w:eastAsia="en-US"/>
+      <w14:ligatures w14:val="standardContextual"/>
+    </w:rPr>
+  </w:style>
+  <w:style w:type="character" w:styleId="a7">
+    <w:name w:val="Intense Emphasis"/>
+    <w:basedOn w:val="a0"/>
+    <w:uiPriority w:val="21"/>
+    <w:qFormat/>
+    <w:rsid w:val="00656914"/>
+    <w:rPr>
+      <w:i/>
+      <w:iCs/>
+      <w:color w:val="0F4761" w:themeColor="accent1" w:themeShade="BF"/>
+    </w:rPr>
+  </w:style>
+  <w:style w:type="paragraph" w:styleId="a8">
+    <w:name w:val="Intense Quote"/>
+    <w:basedOn w:val="a"/>
+    <w:next w:val="a"/>
+    <w:link w:val="Char2"/>
+    <w:uiPriority w:val="30"/>
+    <w:qFormat/>
+    <w:rsid w:val="00656914"/>
+    <w:pPr>
+      <w:pBdr>
+        <w:top w:val="single" w:sz="4" w:space="10" w:color="0F4761" w:themeColor="accent1" w:themeShade="BF"/>
+        <w:bottom w:val="single" w:sz="4" w:space="10" w:color="0F4761" w:themeColor="accent1" w:themeShade="BF"/>
+      </w:pBdr>
+      <w:spacing w:before="360" w:after="360" w:line="259" w:lineRule="auto"/>
+      <w:ind w:left="864" w:right="864"/>
+      <w:jc w:val="center"/>
+    </w:pPr>
+    <w:rPr>
+      <w:rFonts w:asciiTheme="minorHAnsi" w:eastAsiaTheme="minorHAnsi" w:hAnsiTheme="minorHAnsi" w:cstheme="minorBidi"/>
+      <w:i/>
+      <w:iCs/>
+      <w:color w:val="0F4761" w:themeColor="accent1" w:themeShade="BF"/>
+      <w:kern w:val="2"/>
+      <w:lang w:val="el-GR" w:eastAsia="en-US"/>
+      <w14:ligatures w14:val="standardContextual"/>
+    </w:rPr>
+  </w:style>
+  <w:style w:type="character" w:customStyle="1" w:styleId="Char2">
+    <w:name w:val="Έντονο απόσπ. Char"/>
+    <w:basedOn w:val="a0"/>
+    <w:link w:val="a8"/>
+    <w:uiPriority w:val="30"/>
+    <w:rsid w:val="00656914"/>
+    <w:rPr>
+      <w:i/>
+      <w:iCs/>
+      <w:color w:val="0F4761" w:themeColor="accent1" w:themeShade="BF"/>
+    </w:rPr>
+  </w:style>
+  <w:style w:type="character" w:styleId="a9">
+    <w:name w:val="Intense Reference"/>
+    <w:basedOn w:val="a0"/>
+    <w:uiPriority w:val="32"/>
+    <w:qFormat/>
+    <w:rsid w:val="00656914"/>
+    <w:rPr>
+      <w:b/>
+      <w:bCs/>
+      <w:smallCaps/>
+      <w:color w:val="0F4761" w:themeColor="accent1" w:themeShade="BF"/>
+      <w:spacing w:val="5"/>
+    </w:rPr>
+  </w:style>
+  <w:style w:type="table" w:customStyle="1" w:styleId="10">
+    <w:name w:val="1"/>
+    <w:basedOn w:val="a1"/>
+    <w:rsid w:val="00002DAB"/>
+    <w:pPr>
+      <w:spacing w:after="0" w:line="276" w:lineRule="auto"/>
+    </w:pPr>
+    <w:rPr>
+      <w:rFonts w:ascii="Arial" w:eastAsia="Arial" w:hAnsi="Arial" w:cs="Arial"/>
+      <w:kern w:val="0"/>
+      <w:lang w:val="el" w:eastAsia="el-GR"/>
+      <w14:ligatures w14:val="none"/>
+    </w:rPr>
     <w:tblPr>
+      <w:tblStyleRowBandSize w:val="1"/>
+      <w:tblStyleColBandSize w:val="1"/>
+      <w:tblInd w:w="0" w:type="nil"/>
       <w:tblCellMar>
         <w:top w:w="100" w:type="dxa"/>
         <w:left w:w="100" w:type="dxa"/>
@@ -5927,79 +6316,20 @@
       </w:tblCellMar>
     </w:tblPr>
   </w:style>
-  <w:style w:type="paragraph" w:styleId="Title">
-    <w:name w:val="Title"/>
-    <w:basedOn w:val="Normal"/>
-    <w:next w:val="Normal"/>
-    <w:uiPriority w:val="10"/>
-    <w:qFormat/>
+  <w:style w:type="table" w:styleId="aa">
+    <w:name w:val="Table Grid"/>
+    <w:basedOn w:val="a1"/>
+    <w:uiPriority w:val="39"/>
+    <w:rsid w:val="00002DAB"/>
     <w:pPr>
-      <w:keepNext/>
-      <w:keepLines/>
-      <w:spacing w:after="60"/>
+      <w:spacing w:after="0" w:line="240" w:lineRule="auto"/>
     </w:pPr>
     <w:rPr>
-      <w:sz w:val="52"/>
-      <w:szCs w:val="52"/>
+      <w:rFonts w:ascii="Arial" w:eastAsia="Arial" w:hAnsi="Arial" w:cs="Arial"/>
+      <w:kern w:val="0"/>
+      <w:lang w:val="el" w:eastAsia="el-GR"/>
+      <w14:ligatures w14:val="none"/>
     </w:rPr>
-  </w:style>
-  <w:style w:type="paragraph" w:styleId="Subtitle">
-    <w:name w:val="Subtitle"/>
-    <w:basedOn w:val="Normal"/>
-    <w:next w:val="Normal"/>
-    <w:uiPriority w:val="11"/>
-    <w:qFormat/>
-    <w:pPr>
-      <w:keepNext/>
-      <w:keepLines/>
-      <w:spacing w:after="320"/>
-    </w:pPr>
-    <w:rPr>
-      <w:color w:val="666666"/>
-      <w:sz w:val="30"/>
-      <w:szCs w:val="30"/>
-    </w:rPr>
-  </w:style>
-  <w:style w:type="table" w:customStyle="1" w:styleId="a">
-    <w:basedOn w:val="TableNormal0"/>
-    <w:tblPr>
-      <w:tblStyleRowBandSize w:val="1"/>
-      <w:tblStyleColBandSize w:val="1"/>
-    </w:tblPr>
-  </w:style>
-  <w:style w:type="table" w:customStyle="1" w:styleId="a0">
-    <w:basedOn w:val="TableNormal0"/>
-    <w:tblPr>
-      <w:tblStyleRowBandSize w:val="1"/>
-      <w:tblStyleColBandSize w:val="1"/>
-    </w:tblPr>
-  </w:style>
-  <w:style w:type="table" w:customStyle="1" w:styleId="a1">
-    <w:basedOn w:val="TableNormal0"/>
-    <w:tblPr>
-      <w:tblStyleRowBandSize w:val="1"/>
-      <w:tblStyleColBandSize w:val="1"/>
-    </w:tblPr>
-  </w:style>
-  <w:style w:type="paragraph" w:styleId="ListParagraph">
-    <w:name w:val="List Paragraph"/>
-    <w:basedOn w:val="Normal"/>
-    <w:uiPriority w:val="34"/>
-    <w:qFormat/>
-    <w:rsid w:val="0009720C"/>
-    <w:pPr>
-      <w:ind w:left="720"/>
-      <w:contextualSpacing/>
-    </w:pPr>
-  </w:style>
-  <w:style w:type="table" w:styleId="TableGrid">
-    <w:name w:val="Table Grid"/>
-    <w:basedOn w:val="TableNormal"/>
-    <w:uiPriority w:val="39"/>
-    <w:rsid w:val="008E110D"/>
-    <w:pPr>
-      <w:spacing w:line="240" w:lineRule="auto"/>
-    </w:pPr>
     <w:tblPr>
       <w:tblBorders>
         <w:top w:val="single" w:sz="4" w:space="0" w:color="auto"/>
@@ -6025,44 +6355,44 @@
         <a:sysClr val="window" lastClr="FFFFFF"/>
       </a:lt1>
       <a:dk2>
-        <a:srgbClr val="1F497D"/>
+        <a:srgbClr val="0E2841"/>
       </a:dk2>
       <a:lt2>
-        <a:srgbClr val="EEECE1"/>
+        <a:srgbClr val="E8E8E8"/>
       </a:lt2>
       <a:accent1>
-        <a:srgbClr val="4F81BD"/>
+        <a:srgbClr val="156082"/>
       </a:accent1>
       <a:accent2>
-        <a:srgbClr val="C0504D"/>
+        <a:srgbClr val="E97132"/>
       </a:accent2>
       <a:accent3>
-        <a:srgbClr val="9BBB59"/>
+        <a:srgbClr val="196B24"/>
       </a:accent3>
       <a:accent4>
-        <a:srgbClr val="8064A2"/>
+        <a:srgbClr val="0F9ED5"/>
       </a:accent4>
       <a:accent5>
-        <a:srgbClr val="4BACC6"/>
+        <a:srgbClr val="A02B93"/>
       </a:accent5>
       <a:accent6>
-        <a:srgbClr val="F79646"/>
+        <a:srgbClr val="4EA72E"/>
       </a:accent6>
       <a:hlink>
-        <a:srgbClr val="0000FF"/>
+        <a:srgbClr val="467886"/>
       </a:hlink>
       <a:folHlink>
-        <a:srgbClr val="800080"/>
+        <a:srgbClr val="96607D"/>
       </a:folHlink>
     </a:clrScheme>
     <a:fontScheme name="Office">
       <a:majorFont>
-        <a:latin typeface="Calibri"/>
+        <a:latin typeface="Aptos Display" panose="02110004020202020204"/>
         <a:ea typeface=""/>
         <a:cs typeface=""/>
-        <a:font script="Jpan" typeface="ＭＳ ゴシック"/>
+        <a:font script="Jpan" typeface="游ゴシック Light"/>
         <a:font script="Hang" typeface="맑은 고딕"/>
-        <a:font script="Hans" typeface="宋体"/>
+        <a:font script="Hans" typeface="等线 Light"/>
         <a:font script="Hant" typeface="新細明體"/>
         <a:font script="Arab" typeface="Times New Roman"/>
         <a:font script="Hebr" typeface="Times New Roman"/>
@@ -6090,14 +6420,31 @@
         <a:font script="Viet" typeface="Times New Roman"/>
         <a:font script="Uigh" typeface="Microsoft Uighur"/>
         <a:font script="Geor" typeface="Sylfaen"/>
+        <a:font script="Armn" typeface="Arial"/>
+        <a:font script="Bugi" typeface="Leelawadee UI"/>
+        <a:font script="Bopo" typeface="Microsoft JhengHei"/>
+        <a:font script="Java" typeface="Javanese Text"/>
+        <a:font script="Lisu" typeface="Segoe UI"/>
+        <a:font script="Mymr" typeface="Myanmar Text"/>
+        <a:font script="Nkoo" typeface="Ebrima"/>
+        <a:font script="Olck" typeface="Nirmala UI"/>
+        <a:font script="Osma" typeface="Ebrima"/>
+        <a:font script="Phag" typeface="Phagspa"/>
+        <a:font script="Syrn" typeface="Estrangelo Edessa"/>
+        <a:font script="Syrj" typeface="Estrangelo Edessa"/>
+        <a:font script="Syre" typeface="Estrangelo Edessa"/>
+        <a:font script="Sora" typeface="Nirmala UI"/>
+        <a:font script="Tale" typeface="Microsoft Tai Le"/>
+        <a:font script="Talu" typeface="Microsoft New Tai Lue"/>
+        <a:font script="Tfng" typeface="Ebrima"/>
       </a:majorFont>
       <a:minorFont>
-        <a:latin typeface="Cambria"/>
+        <a:latin typeface="Aptos" panose="02110004020202020204"/>
         <a:ea typeface=""/>
         <a:cs typeface=""/>
-        <a:font script="Jpan" typeface="ＭＳ 明朝"/>
+        <a:font script="Jpan" typeface="游ゴシック"/>
         <a:font script="Hang" typeface="맑은 고딕"/>
-        <a:font script="Hans" typeface="宋体"/>
+        <a:font script="Hans" typeface="等线"/>
         <a:font script="Hant" typeface="新細明體"/>
         <a:font script="Arab" typeface="Arial"/>
         <a:font script="Hebr" typeface="Arial"/>
@@ -6125,6 +6472,23 @@
         <a:font script="Viet" typeface="Arial"/>
         <a:font script="Uigh" typeface="Microsoft Uighur"/>
         <a:font script="Geor" typeface="Sylfaen"/>
+        <a:font script="Armn" typeface="Arial"/>
+        <a:font script="Bugi" typeface="Leelawadee UI"/>
+        <a:font script="Bopo" typeface="Microsoft JhengHei"/>
+        <a:font script="Java" typeface="Javanese Text"/>
+        <a:font script="Lisu" typeface="Segoe UI"/>
+        <a:font script="Mymr" typeface="Myanmar Text"/>
+        <a:font script="Nkoo" typeface="Ebrima"/>
+        <a:font script="Olck" typeface="Nirmala UI"/>
+        <a:font script="Osma" typeface="Ebrima"/>
+        <a:font script="Phag" typeface="Phagspa"/>
+        <a:font script="Syrn" typeface="Estrangelo Edessa"/>
+        <a:font script="Syrj" typeface="Estrangelo Edessa"/>
+        <a:font script="Syre" typeface="Estrangelo Edessa"/>
+        <a:font script="Sora" typeface="Nirmala UI"/>
+        <a:font script="Tale" typeface="Microsoft Tai Le"/>
+        <a:font script="Talu" typeface="Microsoft New Tai Lue"/>
+        <a:font script="Tfng" typeface="Ebrima"/>
       </a:minorFont>
     </a:fontScheme>
     <a:fmtScheme name="Office">
@@ -6136,200 +6500,141 @@
           <a:gsLst>
             <a:gs pos="0">
               <a:schemeClr val="phClr">
-                <a:tint val="50000"/>
-                <a:satMod val="300000"/>
+                <a:lumMod val="110000"/>
+                <a:satMod val="105000"/>
+                <a:tint val="67000"/>
               </a:schemeClr>
             </a:gs>
-            <a:gs pos="35000">
+            <a:gs pos="50000">
               <a:schemeClr val="phClr">
-                <a:tint val="37000"/>
-                <a:satMod val="300000"/>
+                <a:lumMod val="105000"/>
+                <a:satMod val="103000"/>
+                <a:tint val="73000"/>
               </a:schemeClr>
             </a:gs>
             <a:gs pos="100000">
               <a:schemeClr val="phClr">
-                <a:tint val="15000"/>
-                <a:satMod val="350000"/>
+                <a:lumMod val="105000"/>
+                <a:satMod val="109000"/>
+                <a:tint val="81000"/>
               </a:schemeClr>
             </a:gs>
           </a:gsLst>
-          <a:lin ang="16200000" scaled="1"/>
+          <a:lin ang="5400000" scaled="0"/>
         </a:gradFill>
         <a:gradFill rotWithShape="1">
           <a:gsLst>
             <a:gs pos="0">
               <a:schemeClr val="phClr">
-                <a:tint val="100000"/>
+                <a:satMod val="103000"/>
+                <a:lumMod val="102000"/>
+                <a:tint val="94000"/>
+              </a:schemeClr>
+            </a:gs>
+            <a:gs pos="50000">
+              <a:schemeClr val="phClr">
+                <a:satMod val="110000"/>
+                <a:lumMod val="100000"/>
                 <a:shade val="100000"/>
-                <a:satMod val="130000"/>
               </a:schemeClr>
             </a:gs>
             <a:gs pos="100000">
               <a:schemeClr val="phClr">
-                <a:tint val="50000"/>
-                <a:shade val="100000"/>
-                <a:satMod val="350000"/>
+                <a:lumMod val="99000"/>
+                <a:satMod val="120000"/>
+                <a:shade val="78000"/>
               </a:schemeClr>
             </a:gs>
           </a:gsLst>
-          <a:lin ang="16200000" scaled="0"/>
+          <a:lin ang="5400000" scaled="0"/>
         </a:gradFill>
       </a:fillStyleLst>
       <a:lnStyleLst>
-        <a:ln w="9525" cap="flat" cmpd="sng" algn="ctr">
-          <a:solidFill>
-            <a:schemeClr val="phClr">
-              <a:shade val="95000"/>
-              <a:satMod val="105000"/>
-            </a:schemeClr>
-          </a:solidFill>
-          <a:prstDash val="solid"/>
-        </a:ln>
-        <a:ln w="25400" cap="flat" cmpd="sng" algn="ctr">
+        <a:ln w="6350" cap="flat" cmpd="sng" algn="ctr">
           <a:solidFill>
             <a:schemeClr val="phClr"/>
           </a:solidFill>
           <a:prstDash val="solid"/>
+          <a:miter lim="800000"/>
         </a:ln>
-        <a:ln w="38100" cap="flat" cmpd="sng" algn="ctr">
+        <a:ln w="12700" cap="flat" cmpd="sng" algn="ctr">
           <a:solidFill>
             <a:schemeClr val="phClr"/>
           </a:solidFill>
           <a:prstDash val="solid"/>
+          <a:miter lim="800000"/>
+        </a:ln>
+        <a:ln w="19050" cap="flat" cmpd="sng" algn="ctr">
+          <a:solidFill>
+            <a:schemeClr val="phClr"/>
+          </a:solidFill>
+          <a:prstDash val="solid"/>
+          <a:miter lim="800000"/>
         </a:ln>
       </a:lnStyleLst>
       <a:effectStyleLst>
         <a:effectStyle>
+          <a:effectLst/>
+        </a:effectStyle>
+        <a:effectStyle>
+          <a:effectLst/>
+        </a:effectStyle>
+        <a:effectStyle>
           <a:effectLst>
-            <a:outerShdw blurRad="40000" dist="20000" dir="5400000" rotWithShape="0">
+            <a:outerShdw blurRad="57150" dist="19050" dir="5400000" algn="ctr" rotWithShape="0">
               <a:srgbClr val="000000">
-                <a:alpha val="38000"/>
+                <a:alpha val="63000"/>
               </a:srgbClr>
             </a:outerShdw>
           </a:effectLst>
-        </a:effectStyle>
-        <a:effectStyle>
-          <a:effectLst>
-            <a:outerShdw blurRad="40000" dist="23000" dir="5400000" rotWithShape="0">
-              <a:srgbClr val="000000">
-                <a:alpha val="35000"/>
-              </a:srgbClr>
-            </a:outerShdw>
-          </a:effectLst>
-        </a:effectStyle>
-        <a:effectStyle>
-          <a:effectLst>
-            <a:outerShdw blurRad="40000" dist="23000" dir="5400000" rotWithShape="0">
-              <a:srgbClr val="000000">
-                <a:alpha val="35000"/>
-              </a:srgbClr>
-            </a:outerShdw>
-          </a:effectLst>
-          <a:scene3d>
-            <a:camera prst="orthographicFront">
-              <a:rot lat="0" lon="0" rev="0"/>
-            </a:camera>
-            <a:lightRig rig="threePt" dir="t">
-              <a:rot lat="0" lon="0" rev="1200000"/>
-            </a:lightRig>
-          </a:scene3d>
-          <a:sp3d>
-            <a:bevelT w="63500" h="25400"/>
-          </a:sp3d>
         </a:effectStyle>
       </a:effectStyleLst>
       <a:bgFillStyleLst>
         <a:solidFill>
           <a:schemeClr val="phClr"/>
         </a:solidFill>
+        <a:solidFill>
+          <a:schemeClr val="phClr">
+            <a:tint val="95000"/>
+            <a:satMod val="170000"/>
+          </a:schemeClr>
+        </a:solidFill>
         <a:gradFill rotWithShape="1">
           <a:gsLst>
             <a:gs pos="0">
               <a:schemeClr val="phClr">
-                <a:tint val="40000"/>
-                <a:satMod val="350000"/>
+                <a:tint val="93000"/>
+                <a:satMod val="150000"/>
+                <a:shade val="98000"/>
+                <a:lumMod val="102000"/>
               </a:schemeClr>
             </a:gs>
-            <a:gs pos="40000">
+            <a:gs pos="50000">
               <a:schemeClr val="phClr">
-                <a:tint val="45000"/>
-                <a:shade val="99000"/>
-                <a:satMod val="350000"/>
+                <a:tint val="98000"/>
+                <a:satMod val="130000"/>
+                <a:shade val="90000"/>
+                <a:lumMod val="103000"/>
               </a:schemeClr>
             </a:gs>
             <a:gs pos="100000">
               <a:schemeClr val="phClr">
-                <a:shade val="20000"/>
-                <a:satMod val="255000"/>
+                <a:shade val="63000"/>
+                <a:satMod val="120000"/>
               </a:schemeClr>
             </a:gs>
           </a:gsLst>
-          <a:path path="circle">
-            <a:fillToRect l="50000" t="-80000" r="50000" b="180000"/>
-          </a:path>
-        </a:gradFill>
-        <a:gradFill rotWithShape="1">
-          <a:gsLst>
-            <a:gs pos="0">
-              <a:schemeClr val="phClr">
-                <a:tint val="80000"/>
-                <a:satMod val="300000"/>
-              </a:schemeClr>
-            </a:gs>
-            <a:gs pos="100000">
-              <a:schemeClr val="phClr">
-                <a:shade val="30000"/>
-                <a:satMod val="200000"/>
-              </a:schemeClr>
-            </a:gs>
-          </a:gsLst>
-          <a:path path="circle">
-            <a:fillToRect l="50000" t="50000" r="50000" b="50000"/>
-          </a:path>
+          <a:lin ang="5400000" scaled="0"/>
         </a:gradFill>
       </a:bgFillStyleLst>
     </a:fmtScheme>
   </a:themeElements>
-  <a:objectDefaults>
-    <a:spDef>
-      <a:spPr/>
-      <a:bodyPr/>
-      <a:lstStyle/>
-      <a:style>
-        <a:lnRef idx="1">
-          <a:schemeClr val="accent1"/>
-        </a:lnRef>
-        <a:fillRef idx="3">
-          <a:schemeClr val="accent1"/>
-        </a:fillRef>
-        <a:effectRef idx="2">
-          <a:schemeClr val="accent1"/>
-        </a:effectRef>
-        <a:fontRef idx="minor">
-          <a:schemeClr val="lt1"/>
-        </a:fontRef>
-      </a:style>
-    </a:spDef>
-    <a:lnDef>
-      <a:spPr/>
-      <a:bodyPr/>
-      <a:lstStyle/>
-      <a:style>
-        <a:lnRef idx="2">
-          <a:schemeClr val="accent1"/>
-        </a:lnRef>
-        <a:fillRef idx="0">
-          <a:schemeClr val="accent1"/>
-        </a:fillRef>
-        <a:effectRef idx="1">
-          <a:schemeClr val="accent1"/>
-        </a:effectRef>
-        <a:fontRef idx="minor">
-          <a:schemeClr val="tx1"/>
-        </a:fontRef>
-      </a:style>
-    </a:lnDef>
-  </a:objectDefaults>
+  <a:objectDefaults/>
   <a:extraClrSchemeLst/>
+  <a:extLst>
+    <a:ext uri="{05A4C25C-085E-4340-85A3-A5531E510DB2}">
+      <thm15:themeFamily xmlns:thm15="http://schemas.microsoft.com/office/thememl/2012/main" name="Office Theme" id="{62F939B6-93AF-4DB8-9C6B-D6C7DFDC589F}" vid="{4A3C46E8-61CC-4603-A589-7422A47A8E4A}"/>
+    </a:ext>
+  </a:extLst>
 </a:theme>
 </file>
</xml_diff>